<commit_message>
Update defense speech: add comparative analysis, formal problem statement, quality criteria, 7 FAQ answers
</commit_message>
<xml_diff>
--- a/docs/текст для защиты.docx
+++ b/docs/текст для защиты.docx
@@ -4,7 +4,7 @@
   <w:body>
     <w:p>
       <w:pPr>
-        <w:spacing w:after="400"/>
+        <w:spacing w:after="120"/>
         <w:jc w:val="center"/>
       </w:pPr>
       <w:r>
@@ -34,8 +34,8 @@
     </w:p>
     <w:p>
       <w:pPr>
-        <w:spacing w:before="240" w:after="120"/>
-        <w:jc w:val="center"/>
+        <w:spacing w:before="280" w:after="160"/>
+        <w:ind w:firstLine="0"/>
       </w:pPr>
       <w:r>
         <w:rPr>
@@ -51,6 +51,7 @@
       <w:pPr>
         <w:spacing w:before="0" w:after="120"/>
         <w:ind w:firstLine="709"/>
+        <w:jc w:val="both"/>
       </w:pPr>
       <w:r>
         <w:rPr>
@@ -64,8 +65,8 @@
     </w:p>
     <w:p>
       <w:pPr>
-        <w:spacing w:before="240" w:after="120"/>
-        <w:jc w:val="center"/>
+        <w:spacing w:before="280" w:after="160"/>
+        <w:ind w:firstLine="0"/>
       </w:pPr>
       <w:r>
         <w:rPr>
@@ -74,13 +75,14 @@
           <w:b/>
           <w:sz w:val="28"/>
         </w:rPr>
-        <w:t>Слайд 2 — Цель и задачи (40–50 секунд)</w:t>
+        <w:t>Слайд 2 — Цель и задачи (50–60 секунд)</w:t>
       </w:r>
     </w:p>
     <w:p>
       <w:pPr>
         <w:spacing w:before="0" w:after="120"/>
         <w:ind w:firstLine="709"/>
+        <w:jc w:val="both"/>
       </w:pPr>
       <w:r>
         <w:rPr>
@@ -89,13 +91,14 @@
           <w:b w:val="0"/>
           <w:sz w:val="28"/>
         </w:rPr>
-        <w:t>Цель работы — создать веб-приложение, которое позволяет анализировать и визуализировать научные публикации по их метаданным из открытых источников.</w:t>
+        <w:t>Объект исследования — система метаданных научных публикаций и журналов в открытых библиографических каталогах. Предмет — методы интерактивной визуализации этих метаданных: географической карты аффилиаций и графа связей.</w:t>
       </w:r>
     </w:p>
     <w:p>
       <w:pPr>
         <w:spacing w:before="0" w:after="120"/>
         <w:ind w:firstLine="709"/>
+        <w:jc w:val="both"/>
       </w:pPr>
       <w:r>
         <w:rPr>
@@ -104,13 +107,29 @@
           <w:b w:val="0"/>
           <w:sz w:val="28"/>
         </w:rPr>
-        <w:t>Для достижения этой цели были решены следующие задачи: загрузка метаданных десяти тысяч публикаций из API OpenAlex, проектирование базы данных PostgreSQL из семи таблиц, геокодирование организаций авторов, реализация интерактивной карты и графа связей с пятью режимами отображения, а также разработка серверного API и браузерного интерфейса.</w:t>
+        <w:t>Формально задача ставится так. Дано: открытый API OpenAlex с метаданными более 250 миллионов работ — названия, авторы, организации, темы, ключевые слова. Требуется: разработать веб-приложение, в котором исследователь видит географию публикаций на карте, структурные связи в графе, может фильтровать данные и находить похожие статьи. Критерий: покрытие геокодирования не менее 75%, граф без зависания браузера, фильтры без пустых результатов.</w:t>
       </w:r>
     </w:p>
     <w:p>
       <w:pPr>
-        <w:spacing w:before="240" w:after="120"/>
-        <w:jc w:val="center"/>
+        <w:spacing w:before="0" w:after="120"/>
+        <w:ind w:firstLine="709"/>
+        <w:jc w:val="both"/>
+      </w:pPr>
+      <w:r>
+        <w:rPr>
+          <w:rFonts w:ascii="Times New Roman" w:hAnsi="Times New Roman" w:cs="Times New Roman"/>
+          <w:rFonts w:ascii="Times New Roman" w:hAnsi="Times New Roman"/>
+          <w:b w:val="0"/>
+          <w:sz w:val="28"/>
+        </w:rPr>
+        <w:t>Для достижения этой цели решены шесть задач: загрузка метаданных, проектирование базы данных, геокодирование организаций, реализация карты и графа, разработка API и интерфейса.</w:t>
+      </w:r>
+    </w:p>
+    <w:p>
+      <w:pPr>
+        <w:spacing w:before="280" w:after="160"/>
+        <w:ind w:firstLine="0"/>
       </w:pPr>
       <w:r>
         <w:rPr>
@@ -126,6 +145,7 @@
       <w:pPr>
         <w:spacing w:before="0" w:after="120"/>
         <w:ind w:firstLine="709"/>
+        <w:jc w:val="both"/>
       </w:pPr>
       <w:r>
         <w:rPr>
@@ -141,6 +161,7 @@
       <w:pPr>
         <w:spacing w:before="0" w:after="120"/>
         <w:ind w:firstLine="709"/>
+        <w:jc w:val="both"/>
       </w:pPr>
       <w:r>
         <w:rPr>
@@ -154,8 +175,8 @@
     </w:p>
     <w:p>
       <w:pPr>
-        <w:spacing w:before="240" w:after="120"/>
-        <w:jc w:val="center"/>
+        <w:spacing w:before="280" w:after="160"/>
+        <w:ind w:firstLine="0"/>
       </w:pPr>
       <w:r>
         <w:rPr>
@@ -164,13 +185,14 @@
           <w:b/>
           <w:sz w:val="28"/>
         </w:rPr>
-        <w:t>Слайд 4 — Архитектура (50–60 секунд)</w:t>
+        <w:t>Слайд 4 — Обзор существующих решений (50–60 секунд)</w:t>
       </w:r>
     </w:p>
     <w:p>
       <w:pPr>
         <w:spacing w:before="0" w:after="120"/>
         <w:ind w:firstLine="709"/>
+        <w:jc w:val="both"/>
       </w:pPr>
       <w:r>
         <w:rPr>
@@ -179,13 +201,14 @@
           <w:b w:val="0"/>
           <w:sz w:val="28"/>
         </w:rPr>
-        <w:t>Система состоит из четырёх последовательных блоков. Сначала скрипт import.py загружает данные из OpenAlex и сохраняет их в JSON-файл. Затем скрипт загрузки переносит данные в PostgreSQL. Сервер на Python предоставляет REST API для браузера. Браузер отображает карту, граф и фильтры.</w:t>
+        <w:t>Перед разработкой был проведён анализ шести существующих инструментов: VOSviewer, CiteSpace, Connected Papers, Bibliometrix, Gephi и Lens.org.</w:t>
       </w:r>
     </w:p>
     <w:p>
       <w:pPr>
         <w:spacing w:before="0" w:after="120"/>
         <w:ind w:firstLine="709"/>
+        <w:jc w:val="both"/>
       </w:pPr>
       <w:r>
         <w:rPr>
@@ -194,13 +217,14 @@
           <w:b w:val="0"/>
           <w:sz w:val="28"/>
         </w:rPr>
-        <w:t>Отдельно стоит геокодирование: координаты учреждений запрашиваются из OpenAlex API батчами по 100 штук, а для организаций без идентификатора — через геокодер Photon на основе OpenStreetMap.</w:t>
+        <w:t>VOSviewer и CiteSpace — мощные инструменты, но требуют установки и не имеют алгоритма похожих статей. Connected Papers строит граф похожих публикаций, но работает только с одной статьёй за раз и не имеет карты. Bibliometrix интегрируется с OpenAlex, но требует знания языка R. Lens.org имеет карту по странам, но не строит граф связей между отдельными статьями.</w:t>
       </w:r>
     </w:p>
     <w:p>
       <w:pPr>
         <w:spacing w:before="0" w:after="120"/>
         <w:ind w:firstLine="709"/>
+        <w:jc w:val="both"/>
       </w:pPr>
       <w:r>
         <w:rPr>
@@ -209,13 +233,13 @@
           <w:b w:val="0"/>
           <w:sz w:val="28"/>
         </w:rPr>
-        <w:t>Важная техническая деталь: чтобы браузер не зависал при работе с десятью тысячами записей, карта и граф рендерятся через requestAnimationFrame, ответы сервера сжимаются gzip, а 200-мегабайтный JSON читается потоково через библиотеку ijson.</w:t>
+        <w:t>Таким образом, ни один из существующих инструментов не сочетает одновременно все четыре возможности: карту с точными координатами, граф связей, фасетную фильтрацию и поиск похожих статей. Это и определило необходимость разработки собственной системы.</w:t>
       </w:r>
     </w:p>
     <w:p>
       <w:pPr>
-        <w:spacing w:before="240" w:after="120"/>
-        <w:jc w:val="center"/>
+        <w:spacing w:before="280" w:after="160"/>
+        <w:ind w:firstLine="0"/>
       </w:pPr>
       <w:r>
         <w:rPr>
@@ -224,13 +248,77 @@
           <w:b/>
           <w:sz w:val="28"/>
         </w:rPr>
-        <w:t>Слайд 5 — База данных (40–50 секунд)</w:t>
+        <w:t>Слайд 5 — Архитектура (50–60 секунд)</w:t>
       </w:r>
     </w:p>
     <w:p>
       <w:pPr>
         <w:spacing w:before="0" w:after="120"/>
         <w:ind w:firstLine="709"/>
+        <w:jc w:val="both"/>
+      </w:pPr>
+      <w:r>
+        <w:rPr>
+          <w:rFonts w:ascii="Times New Roman" w:hAnsi="Times New Roman" w:cs="Times New Roman"/>
+          <w:rFonts w:ascii="Times New Roman" w:hAnsi="Times New Roman"/>
+          <w:b w:val="0"/>
+          <w:sz w:val="28"/>
+        </w:rPr>
+        <w:t>Система состоит из пяти модулей. Скрипт import.py загружает данные из OpenAlex и сохраняет в JSON. Скрипт загрузки переносит данные в PostgreSQL. Два скрипта геокодирования обогащают базу координатами. Сервер на Python предоставляет REST API. Браузер отображает карту, граф и фильтры.</w:t>
+      </w:r>
+    </w:p>
+    <w:p>
+      <w:pPr>
+        <w:spacing w:before="0" w:after="120"/>
+        <w:ind w:firstLine="709"/>
+        <w:jc w:val="both"/>
+      </w:pPr>
+      <w:r>
+        <w:rPr>
+          <w:rFonts w:ascii="Times New Roman" w:hAnsi="Times New Roman" w:cs="Times New Roman"/>
+          <w:rFonts w:ascii="Times New Roman" w:hAnsi="Times New Roman"/>
+          <w:b w:val="0"/>
+          <w:sz w:val="28"/>
+        </w:rPr>
+        <w:t>Каждый технологический выбор обоснован. PostgreSQL — потому что между сущностями чёткие реляционные связи, нужны JOIN-запросы. Plotly — встроенная поддержка мировых проекций и интерактивности. SVG без библиотек — потому что нужна колоночная, а не хаотичная раскладка графа. OpenAlex — единственный бесплатный источник с аффилиациями, тематиками и пакетным API организаций.</w:t>
+      </w:r>
+    </w:p>
+    <w:p>
+      <w:pPr>
+        <w:spacing w:before="0" w:after="120"/>
+        <w:ind w:firstLine="709"/>
+        <w:jc w:val="both"/>
+      </w:pPr>
+      <w:r>
+        <w:rPr>
+          <w:rFonts w:ascii="Times New Roman" w:hAnsi="Times New Roman" w:cs="Times New Roman"/>
+          <w:rFonts w:ascii="Times New Roman" w:hAnsi="Times New Roman"/>
+          <w:b w:val="0"/>
+          <w:sz w:val="28"/>
+        </w:rPr>
+        <w:t>Для производительности: карта и граф рендерятся через requestAnimationFrame, ответы сжимаются gzip, JSON читается потоково через ijson.</w:t>
+      </w:r>
+    </w:p>
+    <w:p>
+      <w:pPr>
+        <w:spacing w:before="280" w:after="160"/>
+        <w:ind w:firstLine="0"/>
+      </w:pPr>
+      <w:r>
+        <w:rPr>
+          <w:rFonts w:ascii="Times New Roman" w:hAnsi="Times New Roman" w:cs="Times New Roman"/>
+          <w:rFonts w:ascii="Times New Roman" w:hAnsi="Times New Roman"/>
+          <w:b/>
+          <w:sz w:val="28"/>
+        </w:rPr>
+        <w:t>Слайд 6 — База данных (40–50 секунд)</w:t>
+      </w:r>
+    </w:p>
+    <w:p>
+      <w:pPr>
+        <w:spacing w:before="0" w:after="120"/>
+        <w:ind w:firstLine="709"/>
+        <w:jc w:val="both"/>
       </w:pPr>
       <w:r>
         <w:rPr>
@@ -246,6 +334,7 @@
       <w:pPr>
         <w:spacing w:before="0" w:after="120"/>
         <w:ind w:firstLine="709"/>
+        <w:jc w:val="both"/>
       </w:pPr>
       <w:r>
         <w:rPr>
@@ -254,13 +343,29 @@
           <w:b w:val="0"/>
           <w:sz w:val="28"/>
         </w:rPr>
-        <w:t>Настройки подключения вынесены в отдельный файл pg_config.py. Параметр client_encoding: utf8 там обязателен — без него на Windows PostgreSQL возвращает сообщения об ошибках в кодировке cp1251, что приводит к сбоям в Python.</w:t>
+        <w:t>Настройки подключения вынесены в файл pg_config.py. Параметр client_encoding: utf8 обязателен — без него на Windows PostgreSQL возвращает ошибки в кодировке cp1251. При загрузке использовались savepoint-ы для обработки конфликтов DOI. Все 9 994 публикации загружены без ошибок.</w:t>
+      </w:r>
+    </w:p>
+    <w:p>
+      <w:pPr>
+        <w:spacing w:before="280" w:after="160"/>
+        <w:ind w:firstLine="0"/>
+      </w:pPr>
+      <w:r>
+        <w:rPr>
+          <w:rFonts w:ascii="Times New Roman" w:hAnsi="Times New Roman" w:cs="Times New Roman"/>
+          <w:rFonts w:ascii="Times New Roman" w:hAnsi="Times New Roman"/>
+          <w:b/>
+          <w:sz w:val="28"/>
+        </w:rPr>
+        <w:t>Слайд 7 — Геокодирование (50–60 секунд)</w:t>
       </w:r>
     </w:p>
     <w:p>
       <w:pPr>
         <w:spacing w:before="0" w:after="120"/>
         <w:ind w:firstLine="709"/>
+        <w:jc w:val="both"/>
       </w:pPr>
       <w:r>
         <w:rPr>
@@ -269,13 +374,29 @@
           <w:b w:val="0"/>
           <w:sz w:val="28"/>
         </w:rPr>
-        <w:t>При загрузке данных использовались savepoint-ы для обработки конфликтов: иногда два объекта OpenAlex ссылались на один и тот же DOI. В итоге все 9 994 публикации были загружены без ошибок.</w:t>
+        <w:t>Геокодирование прошло в два этапа. На первом — для организаций с идентификатором OpenAlex координаты запрашивались батчами по 100 — покрытие 78%.</w:t>
       </w:r>
     </w:p>
     <w:p>
       <w:pPr>
-        <w:spacing w:before="240" w:after="120"/>
-        <w:jc w:val="center"/>
+        <w:spacing w:before="0" w:after="120"/>
+        <w:ind w:firstLine="709"/>
+        <w:jc w:val="both"/>
+      </w:pPr>
+      <w:r>
+        <w:rPr>
+          <w:rFonts w:ascii="Times New Roman" w:hAnsi="Times New Roman" w:cs="Times New Roman"/>
+          <w:rFonts w:ascii="Times New Roman" w:hAnsi="Times New Roman"/>
+          <w:b w:val="0"/>
+          <w:sz w:val="28"/>
+        </w:rPr>
+        <w:t>Оставшиеся 22% — аффилиации без идентификатора. Для них использован геокодер Photon от Komoot со стратегией сокращения строки: полное название → три части через запятую → две части. Photon возвращает координаты в порядке longitude, latitude — при сохранении они переставляются. Итого: 80,8% публикаций получили географическую привязку.</w:t>
+      </w:r>
+    </w:p>
+    <w:p>
+      <w:pPr>
+        <w:spacing w:before="280" w:after="160"/>
+        <w:ind w:firstLine="0"/>
       </w:pPr>
       <w:r>
         <w:rPr>
@@ -284,13 +405,14 @@
           <w:b/>
           <w:sz w:val="28"/>
         </w:rPr>
-        <w:t>Слайд 6 — Геокодирование (50–60 секунд)</w:t>
+        <w:t>Слайд 8 — Граф связей (50–60 секунд)</w:t>
       </w:r>
     </w:p>
     <w:p>
       <w:pPr>
         <w:spacing w:before="0" w:after="120"/>
         <w:ind w:firstLine="709"/>
+        <w:jc w:val="both"/>
       </w:pPr>
       <w:r>
         <w:rPr>
@@ -299,13 +421,14 @@
           <w:b w:val="0"/>
           <w:sz w:val="28"/>
         </w:rPr>
-        <w:t>Геокодирование прошло в два этапа. На первом этапе для организаций с идентификатором OpenAlex координаты запрашивались через API учреждений батчами по 100 — это дало покрытие 78%.</w:t>
+        <w:t>Граф рисуется в браузере в SVG без внешних библиотек. Данные для него уже загружены — дополнительных запросов к серверу не требуется.</w:t>
       </w:r>
     </w:p>
     <w:p>
       <w:pPr>
         <w:spacing w:before="0" w:after="120"/>
         <w:ind w:firstLine="709"/>
+        <w:jc w:val="both"/>
       </w:pPr>
       <w:r>
         <w:rPr>
@@ -314,13 +437,14 @@
           <w:b w:val="0"/>
           <w:sz w:val="28"/>
         </w:rPr>
-        <w:t>Оставшиеся 22% — аффилиации, записанные только строкой названия без ссылки. Для них написан скрипт, который запрашивает геокодер Photon от Komoot. Скрипт применяет стратегию сокращения строки: сначала пробует полное название, потом последние три части через запятую, потом две — пока не получит результат. При этом важная деталь: Photon возвращает координаты в формате GeoJSON — порядок longitude, latitude, а не наоборот, поэтому при сохранении они переставляются.</w:t>
+        <w:t>Используется колоночная раскладка: каждый тип сущности занимает свою вертикальную колонку. Рёбра — кривые Безье. Физической симуляции нет — граф предсказуем при любом числе узлов.</w:t>
       </w:r>
     </w:p>
     <w:p>
       <w:pPr>
         <w:spacing w:before="0" w:after="120"/>
         <w:ind w:firstLine="709"/>
+        <w:jc w:val="both"/>
       </w:pPr>
       <w:r>
         <w:rPr>
@@ -329,13 +453,13 @@
           <w:b w:val="0"/>
           <w:sz w:val="28"/>
         </w:rPr>
-        <w:t>Обрабатываются в первую очередь те организации, которые разблокируют наибольшее число публикаций без координат. Итого: 80,8% публикаций получили географическую привязку.</w:t>
+        <w:t>Доступно пять режимов: полный граф, годы и журналы, авторы, аффилиации, и режим похожих статей.</w:t>
       </w:r>
     </w:p>
     <w:p>
       <w:pPr>
-        <w:spacing w:before="240" w:after="120"/>
-        <w:jc w:val="center"/>
+        <w:spacing w:before="280" w:after="160"/>
+        <w:ind w:firstLine="0"/>
       </w:pPr>
       <w:r>
         <w:rPr>
@@ -344,13 +468,14 @@
           <w:b/>
           <w:sz w:val="28"/>
         </w:rPr>
-        <w:t>Слайд 7 — Граф связей (50–60 секунд)</w:t>
+        <w:t>Слайд 9 — Поиск похожих статей (50–60 секунд)</w:t>
       </w:r>
     </w:p>
     <w:p>
       <w:pPr>
         <w:spacing w:before="0" w:after="120"/>
         <w:ind w:firstLine="709"/>
+        <w:jc w:val="both"/>
       </w:pPr>
       <w:r>
         <w:rPr>
@@ -359,13 +484,14 @@
           <w:b w:val="0"/>
           <w:sz w:val="28"/>
         </w:rPr>
-        <w:t>Граф рисуется в браузере в SVG без внешних библиотек. Данные для него уже загружены — дополнительных запросов к серверу не требуется. Из каждой статьи извлекаются год, журнал, авторы и аффилиации, из них строятся узлы и рёбра.</w:t>
+        <w:t>При клике на статью система считает балл сходства для каждой публикации набора. Алгоритм учитывает пять признаков: общие авторы с весом 4, темы с весом 3, ключевые слова и аффилиации с весом 2, и плюс 2 за одинаковый журнал.</w:t>
       </w:r>
     </w:p>
     <w:p>
       <w:pPr>
         <w:spacing w:before="0" w:after="120"/>
         <w:ind w:firstLine="709"/>
+        <w:jc w:val="both"/>
       </w:pPr>
       <w:r>
         <w:rPr>
@@ -374,13 +500,14 @@
           <w:b w:val="0"/>
           <w:sz w:val="28"/>
         </w:rPr>
-        <w:t>Для размещения узлов используется колоночная раскладка: каждый тип сущности занимает свою вертикальную колонку, узлы внутри распределяются равномерно. Рёбра — кривые Безье. Физической симуляции нет, что делает граф предсказуемым при любом числе узлов.</w:t>
+        <w:t>Авторы получили наибольший вес, потому что один исследователь работает в одной предметной области. Перед сравнением все строки приводятся к нижнему регистру.</w:t>
       </w:r>
     </w:p>
     <w:p>
       <w:pPr>
         <w:spacing w:before="0" w:after="120"/>
         <w:ind w:firstLine="709"/>
+        <w:jc w:val="both"/>
       </w:pPr>
       <w:r>
         <w:rPr>
@@ -389,13 +516,13 @@
           <w:b w:val="0"/>
           <w:sz w:val="28"/>
         </w:rPr>
-        <w:t>Доступно пять режимов отображения: полный граф со всеми типами связей, только годы и журналы, только авторы, только аффилиации, и режим похожих статей.</w:t>
+        <w:t>Результат виден в правой панели как ранжированный список и в режиме графа «Похожие статьи» в виде рёбер.</w:t>
       </w:r>
     </w:p>
     <w:p>
       <w:pPr>
-        <w:spacing w:before="240" w:after="120"/>
-        <w:jc w:val="center"/>
+        <w:spacing w:before="280" w:after="160"/>
+        <w:ind w:firstLine="0"/>
       </w:pPr>
       <w:r>
         <w:rPr>
@@ -404,13 +531,14 @@
           <w:b/>
           <w:sz w:val="28"/>
         </w:rPr>
-        <w:t>Слайд 8 — Поиск похожих статей (50–60 секунд)</w:t>
+        <w:t>Слайд 10 — Интерфейс (40–50 секунд)</w:t>
       </w:r>
     </w:p>
     <w:p>
       <w:pPr>
         <w:spacing w:before="0" w:after="120"/>
         <w:ind w:firstLine="709"/>
+        <w:jc w:val="both"/>
       </w:pPr>
       <w:r>
         <w:rPr>
@@ -419,13 +547,14 @@
           <w:b w:val="0"/>
           <w:sz w:val="28"/>
         </w:rPr>
-        <w:t>При клике на статью система перебирает все остальные публикации и считает балл сходства. Алгоритм учитывает пять признаков: общие авторы с весом 4, общие темы с весом 3, общие ключевые слова и аффилиации с весом 2, и плюс 2 за одинаковый журнал.</w:t>
+        <w:t>Интерфейс — одностраничное приложение с тремя колонками. Слева — фильтры и список статей. По центру — карта или граф. Справа — детали статьи и список похожих.</w:t>
       </w:r>
     </w:p>
     <w:p>
       <w:pPr>
         <w:spacing w:before="0" w:after="120"/>
         <w:ind w:firstLine="709"/>
+        <w:jc w:val="both"/>
       </w:pPr>
       <w:r>
         <w:rPr>
@@ -434,13 +563,14 @@
           <w:b w:val="0"/>
           <w:sz w:val="28"/>
         </w:rPr>
-        <w:t>Авторы получили наибольший вес, потому что один человек обычно работает в одной предметной области и его статьи содержательно связаны. Темы из OpenAlex — более широкие классификаторы, поэтому их вес выше, чем у ключевых слов.</w:t>
+        <w:t>Фасетная фильтрация: при выборе значения в одном фильтре остальные показывают только допустимые варианты — пустые результаты исключены.</w:t>
       </w:r>
     </w:p>
     <w:p>
       <w:pPr>
         <w:spacing w:before="0" w:after="120"/>
         <w:ind w:firstLine="709"/>
+        <w:jc w:val="both"/>
       </w:pPr>
       <w:r>
         <w:rPr>
@@ -449,13 +579,29 @@
           <w:b w:val="0"/>
           <w:sz w:val="28"/>
         </w:rPr>
-        <w:t>Перед сравнением все строки приводятся к нижнему регистру — иначе «MIT» и «mit» считались бы разными значениями и совпадения терялись.</w:t>
+        <w:t>Интерфейс поддерживает светлую и тёмную тему через CSS-переменные. Переключение сохраняется в localStorage.</w:t>
+      </w:r>
+    </w:p>
+    <w:p>
+      <w:pPr>
+        <w:spacing w:before="280" w:after="160"/>
+        <w:ind w:firstLine="0"/>
+      </w:pPr>
+      <w:r>
+        <w:rPr>
+          <w:rFonts w:ascii="Times New Roman" w:hAnsi="Times New Roman" w:cs="Times New Roman"/>
+          <w:rFonts w:ascii="Times New Roman" w:hAnsi="Times New Roman"/>
+          <w:b/>
+          <w:sz w:val="28"/>
+        </w:rPr>
+        <w:t>Слайд 11 — Результаты (40–50 секунд)</w:t>
       </w:r>
     </w:p>
     <w:p>
       <w:pPr>
         <w:spacing w:before="0" w:after="120"/>
         <w:ind w:firstLine="709"/>
+        <w:jc w:val="both"/>
       </w:pPr>
       <w:r>
         <w:rPr>
@@ -464,28 +610,14 @@
           <w:b w:val="0"/>
           <w:sz w:val="28"/>
         </w:rPr>
-        <w:t>Результат виден в двух местах: в правой панели как ранжированный список с объяснением, и в режиме графа «Похожие статьи» в виде рёбер с подписями.</w:t>
-      </w:r>
-    </w:p>
-    <w:p>
-      <w:pPr>
-        <w:spacing w:before="240" w:after="120"/>
-        <w:jc w:val="center"/>
-      </w:pPr>
-      <w:r>
-        <w:rPr>
-          <w:rFonts w:ascii="Times New Roman" w:hAnsi="Times New Roman" w:cs="Times New Roman"/>
-          <w:rFonts w:ascii="Times New Roman" w:hAnsi="Times New Roman"/>
-          <w:b/>
-          <w:sz w:val="28"/>
-        </w:rPr>
-        <w:t>Слайд 9 — Интерфейс (40–50 секунд)</w:t>
+        <w:t>Все поставленные критерии качества выполнены. Покрытие геокодирования — 80,8% при пороге 75%. Граф работает без зависания при 70 статьях. Фасетные фильтры исключают пустые результаты. Алгоритм использует пять признаков вместо минимальных трёх.</w:t>
       </w:r>
     </w:p>
     <w:p>
       <w:pPr>
         <w:spacing w:before="0" w:after="120"/>
         <w:ind w:firstLine="709"/>
+        <w:jc w:val="both"/>
       </w:pPr>
       <w:r>
         <w:rPr>
@@ -494,13 +626,14 @@
           <w:b w:val="0"/>
           <w:sz w:val="28"/>
         </w:rPr>
-        <w:t>Интерфейс — одностраничное приложение с тремя колонками. Слева — фильтры и список статей. По центру — карта или граф. Справа — детали выбранной статьи и список похожих.</w:t>
+        <w:t>Загружено 9 994 публикации, создана база из 7 таблиц, реализован граф с пятью режимами и алгоритм поиска похожих статей.</w:t>
       </w:r>
     </w:p>
     <w:p>
       <w:pPr>
         <w:spacing w:before="0" w:after="120"/>
         <w:ind w:firstLine="709"/>
+        <w:jc w:val="both"/>
       </w:pPr>
       <w:r>
         <w:rPr>
@@ -509,133 +642,14 @@
           <w:b w:val="0"/>
           <w:sz w:val="28"/>
         </w:rPr>
-        <w:t>Фильтры работают в связке: при выборе значения в одном фильтре остальные показывают только те варианты, которые ещё возможны с учётом текущего выбора. Это фасетная фильтрация — она исключает ситуацию, когда комбинация фильтров не даёт ни одного результата.</w:t>
+        <w:t>В отличие от рассмотренных аналогов, система сочетает карту, граф, фильтрацию и поиск похожих в единой браузерной среде без установки стороннего ПО.</w:t>
       </w:r>
     </w:p>
     <w:p>
       <w:pPr>
         <w:spacing w:before="0" w:after="120"/>
         <w:ind w:firstLine="709"/>
-      </w:pPr>
-      <w:r>
-        <w:rPr>
-          <w:rFonts w:ascii="Times New Roman" w:hAnsi="Times New Roman" w:cs="Times New Roman"/>
-          <w:rFonts w:ascii="Times New Roman" w:hAnsi="Times New Roman"/>
-          <w:b w:val="0"/>
-          <w:sz w:val="28"/>
-        </w:rPr>
-        <w:t>Интерфейс поддерживает светлую и тёмную тему. Переключение сохраняется в localStorage, все цвета заданы через CSS-переменные — тема меняется мгновенно.</w:t>
-      </w:r>
-    </w:p>
-    <w:p>
-      <w:pPr>
-        <w:spacing w:before="240" w:after="120"/>
-        <w:jc w:val="center"/>
-      </w:pPr>
-      <w:r>
-        <w:rPr>
-          <w:rFonts w:ascii="Times New Roman" w:hAnsi="Times New Roman" w:cs="Times New Roman"/>
-          <w:rFonts w:ascii="Times New Roman" w:hAnsi="Times New Roman"/>
-          <w:b/>
-          <w:sz w:val="28"/>
-        </w:rPr>
-        <w:t>Слайд 10 — Проблемы и решения (40–50 секунд)</w:t>
-      </w:r>
-    </w:p>
-    <w:p>
-      <w:pPr>
-        <w:spacing w:before="0" w:after="120"/>
-        <w:ind w:firstLine="709"/>
-      </w:pPr>
-      <w:r>
-        <w:rPr>
-          <w:rFonts w:ascii="Times New Roman" w:hAnsi="Times New Roman" w:cs="Times New Roman"/>
-          <w:rFonts w:ascii="Times New Roman" w:hAnsi="Times New Roman"/>
-          <w:b w:val="0"/>
-          <w:sz w:val="28"/>
-        </w:rPr>
-        <w:t>В ходе разработки возникло несколько технических трудностей. Файл с данными весил 201 мегабайт — GitHub не принял его, пришлось убрать из истории и заменить дампом базы. Этот же файл вызвал MemoryError при загрузке — решением стало потоковое чтение через ijson.</w:t>
-      </w:r>
-    </w:p>
-    <w:p>
-      <w:pPr>
-        <w:spacing w:before="0" w:after="120"/>
-        <w:ind w:firstLine="709"/>
-      </w:pPr>
-      <w:r>
-        <w:rPr>
-          <w:rFonts w:ascii="Times New Roman" w:hAnsi="Times New Roman" w:cs="Times New Roman"/>
-          <w:rFonts w:ascii="Times New Roman" w:hAnsi="Times New Roman"/>
-          <w:b w:val="0"/>
-          <w:sz w:val="28"/>
-        </w:rPr>
-        <w:t>Браузер обрывал соединение из-за большого JSON-ответа — добавлено gzip-сжатие. Функция подсчёта всех связей зависала на десяти тысячах статей — убрали из постоянного расчёта.</w:t>
-      </w:r>
-    </w:p>
-    <w:p>
-      <w:pPr>
-        <w:spacing w:before="0" w:after="120"/>
-        <w:ind w:firstLine="709"/>
-      </w:pPr>
-      <w:r>
-        <w:rPr>
-          <w:rFonts w:ascii="Times New Roman" w:hAnsi="Times New Roman" w:cs="Times New Roman"/>
-          <w:rFonts w:ascii="Times New Roman" w:hAnsi="Times New Roman"/>
-          <w:b w:val="0"/>
-          <w:sz w:val="28"/>
-        </w:rPr>
-        <w:t>Геокодер Nominatim заблокировал IP после нескольких прогонов — перешли на Photon. На Windows возникала ошибка кодировки — добавили явное указание UTF-8 в настройках подключения.</w:t>
-      </w:r>
-    </w:p>
-    <w:p>
-      <w:pPr>
-        <w:spacing w:before="240" w:after="120"/>
-        <w:jc w:val="center"/>
-      </w:pPr>
-      <w:r>
-        <w:rPr>
-          <w:rFonts w:ascii="Times New Roman" w:hAnsi="Times New Roman" w:cs="Times New Roman"/>
-          <w:rFonts w:ascii="Times New Roman" w:hAnsi="Times New Roman"/>
-          <w:b/>
-          <w:sz w:val="28"/>
-        </w:rPr>
-        <w:t>Слайд 11 — Результаты (30–40 секунд)</w:t>
-      </w:r>
-    </w:p>
-    <w:p>
-      <w:pPr>
-        <w:spacing w:before="0" w:after="120"/>
-        <w:ind w:firstLine="709"/>
-      </w:pPr>
-      <w:r>
-        <w:rPr>
-          <w:rFonts w:ascii="Times New Roman" w:hAnsi="Times New Roman" w:cs="Times New Roman"/>
-          <w:rFonts w:ascii="Times New Roman" w:hAnsi="Times New Roman"/>
-          <w:b w:val="0"/>
-          <w:sz w:val="28"/>
-        </w:rPr>
-        <w:t>Подводя итог: загружено 9 994 публикации, создана база из 7 таблиц, 80,8% публикаций получили координаты, реализован граф с пятью режимами и алгоритм поиска похожих статей по пяти признакам.</w:t>
-      </w:r>
-    </w:p>
-    <w:p>
-      <w:pPr>
-        <w:spacing w:before="0" w:after="120"/>
-        <w:ind w:firstLine="709"/>
-      </w:pPr>
-      <w:r>
-        <w:rPr>
-          <w:rFonts w:ascii="Times New Roman" w:hAnsi="Times New Roman" w:cs="Times New Roman"/>
-          <w:rFonts w:ascii="Times New Roman" w:hAnsi="Times New Roman"/>
-          <w:b w:val="0"/>
-          <w:sz w:val="28"/>
-        </w:rPr>
-        <w:t>Система переводит плоский список статей в два визуальных представления — карту с географией исследований и граф с авторскими и тематическими связями. Это позволяет увидеть научный ландшафт там, где раньше было просто большое количество записей.</w:t>
-      </w:r>
-    </w:p>
-    <w:p>
-      <w:pPr>
-        <w:spacing w:before="0" w:after="120"/>
-        <w:ind w:firstLine="709"/>
+        <w:jc w:val="both"/>
       </w:pPr>
       <w:r>
         <w:rPr>
@@ -649,7 +663,8 @@
     </w:p>
     <w:p>
       <w:pPr>
-        <w:spacing w:before="240" w:after="120"/>
+        <w:spacing w:before="280" w:after="160"/>
+        <w:ind w:firstLine="0"/>
         <w:jc w:val="center"/>
       </w:pPr>
       <w:r>
@@ -664,7 +679,7 @@
     </w:p>
     <w:p>
       <w:pPr>
-        <w:spacing w:before="120" w:after="40"/>
+        <w:spacing w:before="160" w:after="40"/>
         <w:ind w:firstLine="0"/>
       </w:pPr>
       <w:r>
@@ -679,8 +694,9 @@
     </w:p>
     <w:p>
       <w:pPr>
-        <w:spacing w:before="0" w:after="120"/>
+        <w:spacing w:before="0" w:after="160"/>
         <w:ind w:firstLine="709"/>
+        <w:jc w:val="both"/>
       </w:pPr>
       <w:r>
         <w:rPr>
@@ -689,12 +705,12 @@
           <w:b w:val="0"/>
           <w:sz w:val="28"/>
         </w:rPr>
-        <w:t>Между сущностями чёткие реляционные связи: один журнал — много статей, одна статья — много авторов. PostgreSQL хорошо работает с такими структурами и поддерживает сложные JOIN-запросы, которые нужны для фильтрации.</w:t>
+        <w:t>Между сущностями чёткие реляционные связи: один журнал — много статей, одна статья — много авторов. PostgreSQL поддерживает сложные JOIN-запросы для фильтрации. SQLite ограничен по параллельным запросам. MongoDB не даёт преимуществ при структурированных реляционных данных.</w:t>
       </w:r>
     </w:p>
     <w:p>
       <w:pPr>
-        <w:spacing w:before="120" w:after="40"/>
+        <w:spacing w:before="160" w:after="40"/>
         <w:ind w:firstLine="0"/>
       </w:pPr>
       <w:r>
@@ -709,8 +725,9 @@
     </w:p>
     <w:p>
       <w:pPr>
-        <w:spacing w:before="0" w:after="120"/>
+        <w:spacing w:before="0" w:after="160"/>
         <w:ind w:firstLine="709"/>
+        <w:jc w:val="both"/>
       </w:pPr>
       <w:r>
         <w:rPr>
@@ -719,12 +736,43 @@
           <w:b w:val="0"/>
           <w:sz w:val="28"/>
         </w:rPr>
-        <w:t>Колоночная раскладка реализована вручную именно потому, что стандартные физические симуляции (force-directed layout) при 70+ узлах дают хаотичное расположение. Колонки предсказуемы и читаемы при любом числе узлов.</w:t>
+        <w:t>Стандартные физические симуляции (force-directed layout) при 70+ узлах дают хаотичное расположение. Колоночная раскладка предсказуема и читаема при любом числе узлов.</w:t>
       </w:r>
     </w:p>
     <w:p>
       <w:pPr>
-        <w:spacing w:before="120" w:after="40"/>
+        <w:spacing w:before="160" w:after="40"/>
+        <w:ind w:firstLine="0"/>
+      </w:pPr>
+      <w:r>
+        <w:rPr>
+          <w:rFonts w:ascii="Times New Roman" w:hAnsi="Times New Roman" w:cs="Times New Roman"/>
+          <w:rFonts w:ascii="Times New Roman" w:hAnsi="Times New Roman"/>
+          <w:b/>
+          <w:sz w:val="28"/>
+        </w:rPr>
+        <w:t>— Чем ваша система отличается от Connected Papers?</w:t>
+      </w:r>
+    </w:p>
+    <w:p>
+      <w:pPr>
+        <w:spacing w:before="0" w:after="160"/>
+        <w:ind w:firstLine="709"/>
+        <w:jc w:val="both"/>
+      </w:pPr>
+      <w:r>
+        <w:rPr>
+          <w:rFonts w:ascii="Times New Roman" w:hAnsi="Times New Roman" w:cs="Times New Roman"/>
+          <w:rFonts w:ascii="Times New Roman" w:hAnsi="Times New Roman"/>
+          <w:b w:val="0"/>
+          <w:sz w:val="28"/>
+        </w:rPr>
+        <w:t>Connected Papers строит граф вокруг одной статьи на основе цитирований и ограничен 5 графами в месяц бесплатно. Разработанная система работает с набором из 10 000 статей, имеет географическую карту, фасетные фильтры и вычисляет сходство по пяти структурным признакам. Полностью бесплатна.</w:t>
+      </w:r>
+    </w:p>
+    <w:p>
+      <w:pPr>
+        <w:spacing w:before="160" w:after="40"/>
         <w:ind w:firstLine="0"/>
       </w:pPr>
       <w:r>
@@ -739,8 +787,9 @@
     </w:p>
     <w:p>
       <w:pPr>
-        <w:spacing w:before="0" w:after="120"/>
+        <w:spacing w:before="0" w:after="160"/>
         <w:ind w:firstLine="709"/>
+        <w:jc w:val="both"/>
       </w:pPr>
       <w:r>
         <w:rPr>
@@ -749,12 +798,12 @@
           <w:b w:val="0"/>
           <w:sz w:val="28"/>
         </w:rPr>
-        <w:t>Часть аффилиаций записана в OpenAlex как произвольные строки без географической привязки — например, просто «Department of Physics». Геокодер возвращает координаты только если строка содержит что-то похожее на название места. 19,2% публикаций не удалось геокодировать по этой причине.</w:t>
+        <w:t>Часть аффилиаций записана как произвольные строки без географической привязки — например, «Department of Physics». Геокодер возвращает результат только если строка содержит название места. 19,2% публикаций не удалось геокодировать по этой причине.</w:t>
       </w:r>
     </w:p>
     <w:p>
       <w:pPr>
-        <w:spacing w:before="120" w:after="40"/>
+        <w:spacing w:before="160" w:after="40"/>
         <w:ind w:firstLine="0"/>
       </w:pPr>
       <w:r>
@@ -769,8 +818,9 @@
     </w:p>
     <w:p>
       <w:pPr>
-        <w:spacing w:before="0" w:after="120"/>
+        <w:spacing w:before="0" w:after="160"/>
         <w:ind w:firstLine="709"/>
+        <w:jc w:val="both"/>
       </w:pPr>
       <w:r>
         <w:rPr>
@@ -779,7 +829,69 @@
           <w:b w:val="0"/>
           <w:sz w:val="28"/>
         </w:rPr>
-        <w:t>Граф ограничен 70 статьями одновременно — для читаемости. Фильтры позволяют сузить выборку. Карта и список работают с полным набором через пагинацию и requestAnimationFrame.</w:t>
+        <w:t>Граф ограничен 70 статьями — для читаемости. Фильтры сужают выборку. Карта работает с полным набором через requestAnimationFrame. При необходимости масштабирования свыше 10 000 публикаций потребуется серверный рендеринг графа.</w:t>
+      </w:r>
+    </w:p>
+    <w:p>
+      <w:pPr>
+        <w:spacing w:before="160" w:after="40"/>
+        <w:ind w:firstLine="0"/>
+      </w:pPr>
+      <w:r>
+        <w:rPr>
+          <w:rFonts w:ascii="Times New Roman" w:hAnsi="Times New Roman" w:cs="Times New Roman"/>
+          <w:rFonts w:ascii="Times New Roman" w:hAnsi="Times New Roman"/>
+          <w:b/>
+          <w:sz w:val="28"/>
+        </w:rPr>
+        <w:t>— Почему выбран OpenAlex, а не Semantic Scholar или Crossref?</w:t>
+      </w:r>
+    </w:p>
+    <w:p>
+      <w:pPr>
+        <w:spacing w:before="0" w:after="160"/>
+        <w:ind w:firstLine="709"/>
+        <w:jc w:val="both"/>
+      </w:pPr>
+      <w:r>
+        <w:rPr>
+          <w:rFonts w:ascii="Times New Roman" w:hAnsi="Times New Roman" w:cs="Times New Roman"/>
+          <w:rFonts w:ascii="Times New Roman" w:hAnsi="Times New Roman"/>
+          <w:b w:val="0"/>
+          <w:sz w:val="28"/>
+        </w:rPr>
+        <w:t>OpenAlex предоставляет бесплатный доступ без регистрации, полные метаданные с аффилиациями и идентификаторами организаций, cursor pagination и эндпоинт /institutions для пакетного запроса координат — ключевой для геокодирования.</w:t>
+      </w:r>
+    </w:p>
+    <w:p>
+      <w:pPr>
+        <w:spacing w:before="160" w:after="40"/>
+        <w:ind w:firstLine="0"/>
+      </w:pPr>
+      <w:r>
+        <w:rPr>
+          <w:rFonts w:ascii="Times New Roman" w:hAnsi="Times New Roman" w:cs="Times New Roman"/>
+          <w:rFonts w:ascii="Times New Roman" w:hAnsi="Times New Roman"/>
+          <w:b/>
+          <w:sz w:val="28"/>
+        </w:rPr>
+        <w:t>— Как вы оцениваете качество алгоритма поиска похожих статей?</w:t>
+      </w:r>
+    </w:p>
+    <w:p>
+      <w:pPr>
+        <w:spacing w:before="0" w:after="160"/>
+        <w:ind w:firstLine="709"/>
+        <w:jc w:val="both"/>
+      </w:pPr>
+      <w:r>
+        <w:rPr>
+          <w:rFonts w:ascii="Times New Roman" w:hAnsi="Times New Roman" w:cs="Times New Roman"/>
+          <w:rFonts w:ascii="Times New Roman" w:hAnsi="Times New Roman"/>
+          <w:b w:val="0"/>
+          <w:sz w:val="28"/>
+        </w:rPr>
+        <w:t>Алгоритм основан на структурных признаках метаданных, не на семантическом анализе текста. Это обеспечивает высокую скорость вычисления в браузере без внешних запросов, но ограничивает точность для статей из разных областей с общими авторами. Веса подобраны эмпирически на основе информативности каждого признака.</w:t>
       </w:r>
     </w:p>
     <w:sectPr>

</xml_diff>

<commit_message>
Add glossary to defense speech text
https://claude.ai/code/session_01JXZNXE9oVEv7rsUiTvXR5D
</commit_message>
<xml_diff>
--- a/docs/текст для защиты.docx
+++ b/docs/текст для защиты.docx
@@ -31,6 +31,753 @@
         </w:rPr>
         <w:t>Визуализация науки на основе метаданных публикаций и журналов</w:t>
       </w:r>
+    </w:p>
+    <w:p>
+      <w:pPr>
+        <w:spacing w:before="280" w:after="160"/>
+        <w:ind w:firstLine="0"/>
+        <w:jc w:val="center"/>
+      </w:pPr>
+      <w:r>
+        <w:rPr>
+          <w:rFonts w:ascii="Times New Roman" w:hAnsi="Times New Roman" w:cs="Times New Roman"/>
+          <w:rFonts w:ascii="Times New Roman" w:hAnsi="Times New Roman"/>
+          <w:b/>
+          <w:sz w:val="32"/>
+        </w:rPr>
+        <w:t>Глоссарий</w:t>
+      </w:r>
+    </w:p>
+    <w:tbl>
+      <w:tblPr>
+        <w:tblStyle w:val="TableGrid"/>
+        <w:tblW w:type="auto" w:w="0"/>
+        <w:tblLook w:firstColumn="1" w:firstRow="1" w:lastColumn="0" w:lastRow="0" w:noHBand="0" w:noVBand="1" w:val="04A0"/>
+      </w:tblPr>
+      <w:tblGrid>
+        <w:gridCol w:w="4320"/>
+        <w:gridCol w:w="4320"/>
+      </w:tblGrid>
+      <w:tr>
+        <w:tc>
+          <w:tcPr>
+            <w:tcW w:type="dxa" w:w="4320"/>
+          </w:tcPr>
+          <w:p>
+            <w:r>
+              <w:rPr>
+                <w:rFonts w:ascii="Times New Roman" w:hAnsi="Times New Roman" w:cs="Times New Roman"/>
+                <w:rFonts w:ascii="Times New Roman" w:hAnsi="Times New Roman"/>
+                <w:b/>
+                <w:sz w:val="24"/>
+              </w:rPr>
+              <w:t>Термин</w:t>
+            </w:r>
+          </w:p>
+        </w:tc>
+        <w:tc>
+          <w:tcPr>
+            <w:tcW w:type="dxa" w:w="4320"/>
+          </w:tcPr>
+          <w:p>
+            <w:r>
+              <w:rPr>
+                <w:rFonts w:ascii="Times New Roman" w:hAnsi="Times New Roman" w:cs="Times New Roman"/>
+                <w:rFonts w:ascii="Times New Roman" w:hAnsi="Times New Roman"/>
+                <w:b/>
+                <w:sz w:val="24"/>
+              </w:rPr>
+              <w:t>Определение</w:t>
+            </w:r>
+          </w:p>
+        </w:tc>
+      </w:tr>
+      <w:tr>
+        <w:tc>
+          <w:tcPr>
+            <w:tcW w:type="dxa" w:w="4320"/>
+          </w:tcPr>
+          <w:p>
+            <w:r>
+              <w:rPr>
+                <w:rFonts w:ascii="Times New Roman" w:hAnsi="Times New Roman" w:cs="Times New Roman"/>
+                <w:rFonts w:ascii="Times New Roman" w:hAnsi="Times New Roman"/>
+                <w:b/>
+                <w:sz w:val="24"/>
+              </w:rPr>
+              <w:t>Метаданные публикации</w:t>
+            </w:r>
+          </w:p>
+        </w:tc>
+        <w:tc>
+          <w:tcPr>
+            <w:tcW w:type="dxa" w:w="4320"/>
+          </w:tcPr>
+          <w:p>
+            <w:r>
+              <w:rPr>
+                <w:rFonts w:ascii="Times New Roman" w:hAnsi="Times New Roman" w:cs="Times New Roman"/>
+                <w:rFonts w:ascii="Times New Roman" w:hAnsi="Times New Roman"/>
+                <w:b w:val="0"/>
+                <w:sz w:val="24"/>
+              </w:rPr>
+              <w:t>Структурированное описание статьи: название, авторы, год, журнал, DOI, тематики, ключевые слова — без полного текста</w:t>
+            </w:r>
+          </w:p>
+        </w:tc>
+      </w:tr>
+      <w:tr>
+        <w:tc>
+          <w:tcPr>
+            <w:tcW w:type="dxa" w:w="4320"/>
+          </w:tcPr>
+          <w:p>
+            <w:r>
+              <w:rPr>
+                <w:rFonts w:ascii="Times New Roman" w:hAnsi="Times New Roman" w:cs="Times New Roman"/>
+                <w:rFonts w:ascii="Times New Roman" w:hAnsi="Times New Roman"/>
+                <w:b/>
+                <w:sz w:val="24"/>
+              </w:rPr>
+              <w:t>OpenAlex</w:t>
+            </w:r>
+          </w:p>
+        </w:tc>
+        <w:tc>
+          <w:tcPr>
+            <w:tcW w:type="dxa" w:w="4320"/>
+          </w:tcPr>
+          <w:p>
+            <w:r>
+              <w:rPr>
+                <w:rFonts w:ascii="Times New Roman" w:hAnsi="Times New Roman" w:cs="Times New Roman"/>
+                <w:rFonts w:ascii="Times New Roman" w:hAnsi="Times New Roman"/>
+                <w:b w:val="0"/>
+                <w:sz w:val="24"/>
+              </w:rPr>
+              <w:t>Открытый бесплатный каталог научных публикаций; содержит более 250 млн работ</w:t>
+            </w:r>
+          </w:p>
+        </w:tc>
+      </w:tr>
+      <w:tr>
+        <w:tc>
+          <w:tcPr>
+            <w:tcW w:type="dxa" w:w="4320"/>
+          </w:tcPr>
+          <w:p>
+            <w:r>
+              <w:rPr>
+                <w:rFonts w:ascii="Times New Roman" w:hAnsi="Times New Roman" w:cs="Times New Roman"/>
+                <w:rFonts w:ascii="Times New Roman" w:hAnsi="Times New Roman"/>
+                <w:b/>
+                <w:sz w:val="24"/>
+              </w:rPr>
+              <w:t>API</w:t>
+            </w:r>
+          </w:p>
+        </w:tc>
+        <w:tc>
+          <w:tcPr>
+            <w:tcW w:type="dxa" w:w="4320"/>
+          </w:tcPr>
+          <w:p>
+            <w:r>
+              <w:rPr>
+                <w:rFonts w:ascii="Times New Roman" w:hAnsi="Times New Roman" w:cs="Times New Roman"/>
+                <w:rFonts w:ascii="Times New Roman" w:hAnsi="Times New Roman"/>
+                <w:b w:val="0"/>
+                <w:sz w:val="24"/>
+              </w:rPr>
+              <w:t>Интерфейс программного взаимодействия — набор HTTP-запросов для получения данных из внешнего сервиса</w:t>
+            </w:r>
+          </w:p>
+        </w:tc>
+      </w:tr>
+      <w:tr>
+        <w:tc>
+          <w:tcPr>
+            <w:tcW w:type="dxa" w:w="4320"/>
+          </w:tcPr>
+          <w:p>
+            <w:r>
+              <w:rPr>
+                <w:rFonts w:ascii="Times New Roman" w:hAnsi="Times New Roman" w:cs="Times New Roman"/>
+                <w:rFonts w:ascii="Times New Roman" w:hAnsi="Times New Roman"/>
+                <w:b/>
+                <w:sz w:val="24"/>
+              </w:rPr>
+              <w:t>DOI</w:t>
+            </w:r>
+          </w:p>
+        </w:tc>
+        <w:tc>
+          <w:tcPr>
+            <w:tcW w:type="dxa" w:w="4320"/>
+          </w:tcPr>
+          <w:p>
+            <w:r>
+              <w:rPr>
+                <w:rFonts w:ascii="Times New Roman" w:hAnsi="Times New Roman" w:cs="Times New Roman"/>
+                <w:rFonts w:ascii="Times New Roman" w:hAnsi="Times New Roman"/>
+                <w:b w:val="0"/>
+                <w:sz w:val="24"/>
+              </w:rPr>
+              <w:t>Уникальный цифровой идентификатор научной публикации в формате 10.XXXX/...</w:t>
+            </w:r>
+          </w:p>
+        </w:tc>
+      </w:tr>
+      <w:tr>
+        <w:tc>
+          <w:tcPr>
+            <w:tcW w:type="dxa" w:w="4320"/>
+          </w:tcPr>
+          <w:p>
+            <w:r>
+              <w:rPr>
+                <w:rFonts w:ascii="Times New Roman" w:hAnsi="Times New Roman" w:cs="Times New Roman"/>
+                <w:rFonts w:ascii="Times New Roman" w:hAnsi="Times New Roman"/>
+                <w:b/>
+                <w:sz w:val="24"/>
+              </w:rPr>
+              <w:t>Аффилиация</w:t>
+            </w:r>
+          </w:p>
+        </w:tc>
+        <w:tc>
+          <w:tcPr>
+            <w:tcW w:type="dxa" w:w="4320"/>
+          </w:tcPr>
+          <w:p>
+            <w:r>
+              <w:rPr>
+                <w:rFonts w:ascii="Times New Roman" w:hAnsi="Times New Roman" w:cs="Times New Roman"/>
+                <w:rFonts w:ascii="Times New Roman" w:hAnsi="Times New Roman"/>
+                <w:b w:val="0"/>
+                <w:sz w:val="24"/>
+              </w:rPr>
+              <w:t>Организация, с которой связан автор на момент публикации (университет, институт, компания)</w:t>
+            </w:r>
+          </w:p>
+        </w:tc>
+      </w:tr>
+      <w:tr>
+        <w:tc>
+          <w:tcPr>
+            <w:tcW w:type="dxa" w:w="4320"/>
+          </w:tcPr>
+          <w:p>
+            <w:r>
+              <w:rPr>
+                <w:rFonts w:ascii="Times New Roman" w:hAnsi="Times New Roman" w:cs="Times New Roman"/>
+                <w:rFonts w:ascii="Times New Roman" w:hAnsi="Times New Roman"/>
+                <w:b/>
+                <w:sz w:val="24"/>
+              </w:rPr>
+              <w:t>Геокодирование</w:t>
+            </w:r>
+          </w:p>
+        </w:tc>
+        <w:tc>
+          <w:tcPr>
+            <w:tcW w:type="dxa" w:w="4320"/>
+          </w:tcPr>
+          <w:p>
+            <w:r>
+              <w:rPr>
+                <w:rFonts w:ascii="Times New Roman" w:hAnsi="Times New Roman" w:cs="Times New Roman"/>
+                <w:rFonts w:ascii="Times New Roman" w:hAnsi="Times New Roman"/>
+                <w:b w:val="0"/>
+                <w:sz w:val="24"/>
+              </w:rPr>
+              <w:t>Определение географических координат (широта, долгота) по названию места или идентификатору организации</w:t>
+            </w:r>
+          </w:p>
+        </w:tc>
+      </w:tr>
+      <w:tr>
+        <w:tc>
+          <w:tcPr>
+            <w:tcW w:type="dxa" w:w="4320"/>
+          </w:tcPr>
+          <w:p>
+            <w:r>
+              <w:rPr>
+                <w:rFonts w:ascii="Times New Roman" w:hAnsi="Times New Roman" w:cs="Times New Roman"/>
+                <w:rFonts w:ascii="Times New Roman" w:hAnsi="Times New Roman"/>
+                <w:b/>
+                <w:sz w:val="24"/>
+              </w:rPr>
+              <w:t>Граф</w:t>
+            </w:r>
+          </w:p>
+        </w:tc>
+        <w:tc>
+          <w:tcPr>
+            <w:tcW w:type="dxa" w:w="4320"/>
+          </w:tcPr>
+          <w:p>
+            <w:r>
+              <w:rPr>
+                <w:rFonts w:ascii="Times New Roman" w:hAnsi="Times New Roman" w:cs="Times New Roman"/>
+                <w:rFonts w:ascii="Times New Roman" w:hAnsi="Times New Roman"/>
+                <w:b w:val="0"/>
+                <w:sz w:val="24"/>
+              </w:rPr>
+              <w:t>Структура из узлов и рёбер (связей) между ними; используется для визуализации отношений между объектами</w:t>
+            </w:r>
+          </w:p>
+        </w:tc>
+      </w:tr>
+      <w:tr>
+        <w:tc>
+          <w:tcPr>
+            <w:tcW w:type="dxa" w:w="4320"/>
+          </w:tcPr>
+          <w:p>
+            <w:r>
+              <w:rPr>
+                <w:rFonts w:ascii="Times New Roman" w:hAnsi="Times New Roman" w:cs="Times New Roman"/>
+                <w:rFonts w:ascii="Times New Roman" w:hAnsi="Times New Roman"/>
+                <w:b/>
+                <w:sz w:val="24"/>
+              </w:rPr>
+              <w:t>REST API</w:t>
+            </w:r>
+          </w:p>
+        </w:tc>
+        <w:tc>
+          <w:tcPr>
+            <w:tcW w:type="dxa" w:w="4320"/>
+          </w:tcPr>
+          <w:p>
+            <w:r>
+              <w:rPr>
+                <w:rFonts w:ascii="Times New Roman" w:hAnsi="Times New Roman" w:cs="Times New Roman"/>
+                <w:rFonts w:ascii="Times New Roman" w:hAnsi="Times New Roman"/>
+                <w:b w:val="0"/>
+                <w:sz w:val="24"/>
+              </w:rPr>
+              <w:t>Стиль веб-сервисов, где каждый ресурс доступен по URL через стандартные HTTP-методы</w:t>
+            </w:r>
+          </w:p>
+        </w:tc>
+      </w:tr>
+      <w:tr>
+        <w:tc>
+          <w:tcPr>
+            <w:tcW w:type="dxa" w:w="4320"/>
+          </w:tcPr>
+          <w:p>
+            <w:r>
+              <w:rPr>
+                <w:rFonts w:ascii="Times New Roman" w:hAnsi="Times New Roman" w:cs="Times New Roman"/>
+                <w:rFonts w:ascii="Times New Roman" w:hAnsi="Times New Roman"/>
+                <w:b/>
+                <w:sz w:val="24"/>
+              </w:rPr>
+              <w:t>PostgreSQL</w:t>
+            </w:r>
+          </w:p>
+        </w:tc>
+        <w:tc>
+          <w:tcPr>
+            <w:tcW w:type="dxa" w:w="4320"/>
+          </w:tcPr>
+          <w:p>
+            <w:r>
+              <w:rPr>
+                <w:rFonts w:ascii="Times New Roman" w:hAnsi="Times New Roman" w:cs="Times New Roman"/>
+                <w:rFonts w:ascii="Times New Roman" w:hAnsi="Times New Roman"/>
+                <w:b w:val="0"/>
+                <w:sz w:val="24"/>
+              </w:rPr>
+              <w:t>Реляционная система управления базами данных с открытым исходным кодом</w:t>
+            </w:r>
+          </w:p>
+        </w:tc>
+      </w:tr>
+      <w:tr>
+        <w:tc>
+          <w:tcPr>
+            <w:tcW w:type="dxa" w:w="4320"/>
+          </w:tcPr>
+          <w:p>
+            <w:r>
+              <w:rPr>
+                <w:rFonts w:ascii="Times New Roman" w:hAnsi="Times New Roman" w:cs="Times New Roman"/>
+                <w:rFonts w:ascii="Times New Roman" w:hAnsi="Times New Roman"/>
+                <w:b/>
+                <w:sz w:val="24"/>
+              </w:rPr>
+              <w:t>gzip</w:t>
+            </w:r>
+          </w:p>
+        </w:tc>
+        <w:tc>
+          <w:tcPr>
+            <w:tcW w:type="dxa" w:w="4320"/>
+          </w:tcPr>
+          <w:p>
+            <w:r>
+              <w:rPr>
+                <w:rFonts w:ascii="Times New Roman" w:hAnsi="Times New Roman" w:cs="Times New Roman"/>
+                <w:rFonts w:ascii="Times New Roman" w:hAnsi="Times New Roman"/>
+                <w:b w:val="0"/>
+                <w:sz w:val="24"/>
+              </w:rPr>
+              <w:t>Алгоритм сжатия данных; уменьшает объём HTTP-ответов сервера в 5–10 раз</w:t>
+            </w:r>
+          </w:p>
+        </w:tc>
+      </w:tr>
+      <w:tr>
+        <w:tc>
+          <w:tcPr>
+            <w:tcW w:type="dxa" w:w="4320"/>
+          </w:tcPr>
+          <w:p>
+            <w:r>
+              <w:rPr>
+                <w:rFonts w:ascii="Times New Roman" w:hAnsi="Times New Roman" w:cs="Times New Roman"/>
+                <w:rFonts w:ascii="Times New Roman" w:hAnsi="Times New Roman"/>
+                <w:b/>
+                <w:sz w:val="24"/>
+              </w:rPr>
+              <w:t>Фасетная фильтрация</w:t>
+            </w:r>
+          </w:p>
+        </w:tc>
+        <w:tc>
+          <w:tcPr>
+            <w:tcW w:type="dxa" w:w="4320"/>
+          </w:tcPr>
+          <w:p>
+            <w:r>
+              <w:rPr>
+                <w:rFonts w:ascii="Times New Roman" w:hAnsi="Times New Roman" w:cs="Times New Roman"/>
+                <w:rFonts w:ascii="Times New Roman" w:hAnsi="Times New Roman"/>
+                <w:b w:val="0"/>
+                <w:sz w:val="24"/>
+              </w:rPr>
+              <w:t>Метод фильтрации, при котором выбор в одном фильтре автоматически ограничивает варианты в других</w:t>
+            </w:r>
+          </w:p>
+        </w:tc>
+      </w:tr>
+      <w:tr>
+        <w:tc>
+          <w:tcPr>
+            <w:tcW w:type="dxa" w:w="4320"/>
+          </w:tcPr>
+          <w:p>
+            <w:r>
+              <w:rPr>
+                <w:rFonts w:ascii="Times New Roman" w:hAnsi="Times New Roman" w:cs="Times New Roman"/>
+                <w:rFonts w:ascii="Times New Roman" w:hAnsi="Times New Roman"/>
+                <w:b/>
+                <w:sz w:val="24"/>
+              </w:rPr>
+              <w:t>SVG</w:t>
+            </w:r>
+          </w:p>
+        </w:tc>
+        <w:tc>
+          <w:tcPr>
+            <w:tcW w:type="dxa" w:w="4320"/>
+          </w:tcPr>
+          <w:p>
+            <w:r>
+              <w:rPr>
+                <w:rFonts w:ascii="Times New Roman" w:hAnsi="Times New Roman" w:cs="Times New Roman"/>
+                <w:rFonts w:ascii="Times New Roman" w:hAnsi="Times New Roman"/>
+                <w:b w:val="0"/>
+                <w:sz w:val="24"/>
+              </w:rPr>
+              <w:t>XML-формат для векторной графики в браузере; используется для рисования графа</w:t>
+            </w:r>
+          </w:p>
+        </w:tc>
+      </w:tr>
+      <w:tr>
+        <w:tc>
+          <w:tcPr>
+            <w:tcW w:type="dxa" w:w="4320"/>
+          </w:tcPr>
+          <w:p>
+            <w:r>
+              <w:rPr>
+                <w:rFonts w:ascii="Times New Roman" w:hAnsi="Times New Roman" w:cs="Times New Roman"/>
+                <w:rFonts w:ascii="Times New Roman" w:hAnsi="Times New Roman"/>
+                <w:b/>
+                <w:sz w:val="24"/>
+              </w:rPr>
+              <w:t>Cursor pagination</w:t>
+            </w:r>
+          </w:p>
+        </w:tc>
+        <w:tc>
+          <w:tcPr>
+            <w:tcW w:type="dxa" w:w="4320"/>
+          </w:tcPr>
+          <w:p>
+            <w:r>
+              <w:rPr>
+                <w:rFonts w:ascii="Times New Roman" w:hAnsi="Times New Roman" w:cs="Times New Roman"/>
+                <w:rFonts w:ascii="Times New Roman" w:hAnsi="Times New Roman"/>
+                <w:b w:val="0"/>
+                <w:sz w:val="24"/>
+              </w:rPr>
+              <w:t>Постраничный обход данных через токены-курсоры, исключающий пропуски при большой выборке</w:t>
+            </w:r>
+          </w:p>
+        </w:tc>
+      </w:tr>
+      <w:tr>
+        <w:tc>
+          <w:tcPr>
+            <w:tcW w:type="dxa" w:w="4320"/>
+          </w:tcPr>
+          <w:p>
+            <w:r>
+              <w:rPr>
+                <w:rFonts w:ascii="Times New Roman" w:hAnsi="Times New Roman" w:cs="Times New Roman"/>
+                <w:rFonts w:ascii="Times New Roman" w:hAnsi="Times New Roman"/>
+                <w:b/>
+                <w:sz w:val="24"/>
+              </w:rPr>
+              <w:t>Библиометрия</w:t>
+            </w:r>
+          </w:p>
+        </w:tc>
+        <w:tc>
+          <w:tcPr>
+            <w:tcW w:type="dxa" w:w="4320"/>
+          </w:tcPr>
+          <w:p>
+            <w:r>
+              <w:rPr>
+                <w:rFonts w:ascii="Times New Roman" w:hAnsi="Times New Roman" w:cs="Times New Roman"/>
+                <w:rFonts w:ascii="Times New Roman" w:hAnsi="Times New Roman"/>
+                <w:b w:val="0"/>
+                <w:sz w:val="24"/>
+              </w:rPr>
+              <w:t>Количественный анализ научных публикаций: цитирования, коавторские связи, тематические кластеры</w:t>
+            </w:r>
+          </w:p>
+        </w:tc>
+      </w:tr>
+      <w:tr>
+        <w:tc>
+          <w:tcPr>
+            <w:tcW w:type="dxa" w:w="4320"/>
+          </w:tcPr>
+          <w:p>
+            <w:r>
+              <w:rPr>
+                <w:rFonts w:ascii="Times New Roman" w:hAnsi="Times New Roman" w:cs="Times New Roman"/>
+                <w:rFonts w:ascii="Times New Roman" w:hAnsi="Times New Roman"/>
+                <w:b/>
+                <w:sz w:val="24"/>
+              </w:rPr>
+              <w:t>Балл сходства</w:t>
+            </w:r>
+          </w:p>
+        </w:tc>
+        <w:tc>
+          <w:tcPr>
+            <w:tcW w:type="dxa" w:w="4320"/>
+          </w:tcPr>
+          <w:p>
+            <w:r>
+              <w:rPr>
+                <w:rFonts w:ascii="Times New Roman" w:hAnsi="Times New Roman" w:cs="Times New Roman"/>
+                <w:rFonts w:ascii="Times New Roman" w:hAnsi="Times New Roman"/>
+                <w:b w:val="0"/>
+                <w:sz w:val="24"/>
+              </w:rPr>
+              <w:t>Числовая мера близости двух публикаций по взвешенной сумме совпадающих признаков</w:t>
+            </w:r>
+          </w:p>
+        </w:tc>
+      </w:tr>
+      <w:tr>
+        <w:tc>
+          <w:tcPr>
+            <w:tcW w:type="dxa" w:w="4320"/>
+          </w:tcPr>
+          <w:p>
+            <w:r>
+              <w:rPr>
+                <w:rFonts w:ascii="Times New Roman" w:hAnsi="Times New Roman" w:cs="Times New Roman"/>
+                <w:rFonts w:ascii="Times New Roman" w:hAnsi="Times New Roman"/>
+                <w:b/>
+                <w:sz w:val="24"/>
+              </w:rPr>
+              <w:t>requestAnimationFrame</w:t>
+            </w:r>
+          </w:p>
+        </w:tc>
+        <w:tc>
+          <w:tcPr>
+            <w:tcW w:type="dxa" w:w="4320"/>
+          </w:tcPr>
+          <w:p>
+            <w:r>
+              <w:rPr>
+                <w:rFonts w:ascii="Times New Roman" w:hAnsi="Times New Roman" w:cs="Times New Roman"/>
+                <w:rFonts w:ascii="Times New Roman" w:hAnsi="Times New Roman"/>
+                <w:b w:val="0"/>
+                <w:sz w:val="24"/>
+              </w:rPr>
+              <w:t>Браузерный API для выполнения тяжёлых операций между кадрами, не блокируя интерфейс</w:t>
+            </w:r>
+          </w:p>
+        </w:tc>
+      </w:tr>
+      <w:tr>
+        <w:tc>
+          <w:tcPr>
+            <w:tcW w:type="dxa" w:w="4320"/>
+          </w:tcPr>
+          <w:p>
+            <w:r>
+              <w:rPr>
+                <w:rFonts w:ascii="Times New Roman" w:hAnsi="Times New Roman" w:cs="Times New Roman"/>
+                <w:rFonts w:ascii="Times New Roman" w:hAnsi="Times New Roman"/>
+                <w:b/>
+                <w:sz w:val="24"/>
+              </w:rPr>
+              <w:t>ijson</w:t>
+            </w:r>
+          </w:p>
+        </w:tc>
+        <w:tc>
+          <w:tcPr>
+            <w:tcW w:type="dxa" w:w="4320"/>
+          </w:tcPr>
+          <w:p>
+            <w:r>
+              <w:rPr>
+                <w:rFonts w:ascii="Times New Roman" w:hAnsi="Times New Roman" w:cs="Times New Roman"/>
+                <w:rFonts w:ascii="Times New Roman" w:hAnsi="Times New Roman"/>
+                <w:b w:val="0"/>
+                <w:sz w:val="24"/>
+              </w:rPr>
+              <w:t>Python-библиотека для потокового чтения JSON-файлов без загрузки всего файла в память</w:t>
+            </w:r>
+          </w:p>
+        </w:tc>
+      </w:tr>
+      <w:tr>
+        <w:tc>
+          <w:tcPr>
+            <w:tcW w:type="dxa" w:w="4320"/>
+          </w:tcPr>
+          <w:p>
+            <w:r>
+              <w:rPr>
+                <w:rFonts w:ascii="Times New Roman" w:hAnsi="Times New Roman" w:cs="Times New Roman"/>
+                <w:rFonts w:ascii="Times New Roman" w:hAnsi="Times New Roman"/>
+                <w:b/>
+                <w:sz w:val="24"/>
+              </w:rPr>
+              <w:t>Savepoint</w:t>
+            </w:r>
+          </w:p>
+        </w:tc>
+        <w:tc>
+          <w:tcPr>
+            <w:tcW w:type="dxa" w:w="4320"/>
+          </w:tcPr>
+          <w:p>
+            <w:r>
+              <w:rPr>
+                <w:rFonts w:ascii="Times New Roman" w:hAnsi="Times New Roman" w:cs="Times New Roman"/>
+                <w:rFonts w:ascii="Times New Roman" w:hAnsi="Times New Roman"/>
+                <w:b w:val="0"/>
+                <w:sz w:val="24"/>
+              </w:rPr>
+              <w:t>Механизм PostgreSQL для частичного отката транзакции при ошибке без потери остальных данных</w:t>
+            </w:r>
+          </w:p>
+        </w:tc>
+      </w:tr>
+      <w:tr>
+        <w:tc>
+          <w:tcPr>
+            <w:tcW w:type="dxa" w:w="4320"/>
+          </w:tcPr>
+          <w:p>
+            <w:r>
+              <w:rPr>
+                <w:rFonts w:ascii="Times New Roman" w:hAnsi="Times New Roman" w:cs="Times New Roman"/>
+                <w:rFonts w:ascii="Times New Roman" w:hAnsi="Times New Roman"/>
+                <w:b/>
+                <w:sz w:val="24"/>
+              </w:rPr>
+              <w:t>Force-directed layout</w:t>
+            </w:r>
+          </w:p>
+        </w:tc>
+        <w:tc>
+          <w:tcPr>
+            <w:tcW w:type="dxa" w:w="4320"/>
+          </w:tcPr>
+          <w:p>
+            <w:r>
+              <w:rPr>
+                <w:rFonts w:ascii="Times New Roman" w:hAnsi="Times New Roman" w:cs="Times New Roman"/>
+                <w:rFonts w:ascii="Times New Roman" w:hAnsi="Times New Roman"/>
+                <w:b w:val="0"/>
+                <w:sz w:val="24"/>
+              </w:rPr>
+              <w:t>Алгоритм физической симуляции для размещения узлов графа; даёт хаотичный результат при 70+ узлах</w:t>
+            </w:r>
+          </w:p>
+        </w:tc>
+      </w:tr>
+      <w:tr>
+        <w:tc>
+          <w:tcPr>
+            <w:tcW w:type="dxa" w:w="4320"/>
+          </w:tcPr>
+          <w:p>
+            <w:r>
+              <w:rPr>
+                <w:rFonts w:ascii="Times New Roman" w:hAnsi="Times New Roman" w:cs="Times New Roman"/>
+                <w:rFonts w:ascii="Times New Roman" w:hAnsi="Times New Roman"/>
+                <w:b/>
+                <w:sz w:val="24"/>
+              </w:rPr>
+              <w:t>Колоночная раскладка</w:t>
+            </w:r>
+          </w:p>
+        </w:tc>
+        <w:tc>
+          <w:tcPr>
+            <w:tcW w:type="dxa" w:w="4320"/>
+          </w:tcPr>
+          <w:p>
+            <w:r>
+              <w:rPr>
+                <w:rFonts w:ascii="Times New Roman" w:hAnsi="Times New Roman" w:cs="Times New Roman"/>
+                <w:rFonts w:ascii="Times New Roman" w:hAnsi="Times New Roman"/>
+                <w:b w:val="0"/>
+                <w:sz w:val="24"/>
+              </w:rPr>
+              <w:t>Способ размещения узлов графа: каждый тип узла занимает фиксированную вертикальную колонку</w:t>
+            </w:r>
+          </w:p>
+        </w:tc>
+      </w:tr>
+    </w:tbl>
+    <w:p>
+      <w:pPr>
+        <w:spacing w:before="0" w:after="240"/>
+      </w:pPr>
+      <w:r/>
     </w:p>
     <w:p>
       <w:pPr>

</xml_diff>

<commit_message>
docs: save defense speech as docx (14 slides, Times New Roman 14pt)
</commit_message>
<xml_diff>
--- a/docs/текст для защиты.docx
+++ b/docs/текст для защиты.docx
@@ -4,12 +4,11 @@
   <w:body>
     <w:p>
       <w:pPr>
-        <w:spacing w:after="120"/>
+        <w:spacing w:after="240"/>
         <w:jc w:val="center"/>
       </w:pPr>
       <w:r>
         <w:rPr>
-          <w:rFonts w:ascii="Times New Roman" w:hAnsi="Times New Roman" w:cs="Times New Roman"/>
           <w:rFonts w:ascii="Times New Roman" w:hAnsi="Times New Roman"/>
           <w:b/>
           <w:sz w:val="36"/>
@@ -19,28 +18,10 @@
     </w:p>
     <w:p>
       <w:pPr>
-        <w:spacing w:after="600"/>
-        <w:jc w:val="center"/>
+        <w:spacing w:before="240" w:after="120"/>
       </w:pPr>
       <w:r>
         <w:rPr>
-          <w:rFonts w:ascii="Times New Roman" w:hAnsi="Times New Roman" w:cs="Times New Roman"/>
-          <w:rFonts w:ascii="Times New Roman" w:hAnsi="Times New Roman"/>
-          <w:b w:val="0"/>
-          <w:sz w:val="28"/>
-        </w:rPr>
-        <w:t>Визуализация науки на основе метаданных публикаций и журналов</w:t>
-      </w:r>
-    </w:p>
-    <w:p>
-      <w:pPr>
-        <w:spacing w:before="280" w:after="160"/>
-        <w:ind w:firstLine="0"/>
-        <w:jc w:val="center"/>
-      </w:pPr>
-      <w:r>
-        <w:rPr>
-          <w:rFonts w:ascii="Times New Roman" w:hAnsi="Times New Roman" w:cs="Times New Roman"/>
           <w:rFonts w:ascii="Times New Roman" w:hAnsi="Times New Roman"/>
           <w:b/>
           <w:sz w:val="32"/>
@@ -55,21 +36,20 @@
         <w:tblLook w:firstColumn="1" w:firstRow="1" w:lastColumn="0" w:lastRow="0" w:noHBand="0" w:noVBand="1" w:val="04A0"/>
       </w:tblPr>
       <w:tblGrid>
-        <w:gridCol w:w="4320"/>
-        <w:gridCol w:w="4320"/>
+        <w:gridCol w:w="4844"/>
+        <w:gridCol w:w="4844"/>
       </w:tblGrid>
       <w:tr>
         <w:tc>
           <w:tcPr>
-            <w:tcW w:type="dxa" w:w="4320"/>
+            <w:tcW w:type="dxa" w:w="4844"/>
           </w:tcPr>
           <w:p>
             <w:r>
               <w:rPr>
-                <w:rFonts w:ascii="Times New Roman" w:hAnsi="Times New Roman" w:cs="Times New Roman"/>
                 <w:rFonts w:ascii="Times New Roman" w:hAnsi="Times New Roman"/>
                 <w:b/>
-                <w:sz w:val="24"/>
+                <w:sz w:val="22"/>
               </w:rPr>
               <w:t>Термин</w:t>
             </w:r>
@@ -77,15 +57,14 @@
         </w:tc>
         <w:tc>
           <w:tcPr>
-            <w:tcW w:type="dxa" w:w="4320"/>
+            <w:tcW w:type="dxa" w:w="4844"/>
           </w:tcPr>
           <w:p>
             <w:r>
               <w:rPr>
-                <w:rFonts w:ascii="Times New Roman" w:hAnsi="Times New Roman" w:cs="Times New Roman"/>
                 <w:rFonts w:ascii="Times New Roman" w:hAnsi="Times New Roman"/>
                 <w:b/>
-                <w:sz w:val="24"/>
+                <w:sz w:val="22"/>
               </w:rPr>
               <w:t>Определение</w:t>
             </w:r>
@@ -95,15 +74,13 @@
       <w:tr>
         <w:tc>
           <w:tcPr>
-            <w:tcW w:type="dxa" w:w="4320"/>
+            <w:tcW w:type="dxa" w:w="4844"/>
           </w:tcPr>
           <w:p>
             <w:r>
               <w:rPr>
-                <w:rFonts w:ascii="Times New Roman" w:hAnsi="Times New Roman" w:cs="Times New Roman"/>
                 <w:rFonts w:ascii="Times New Roman" w:hAnsi="Times New Roman"/>
-                <w:b/>
-                <w:sz w:val="24"/>
+                <w:sz w:val="22"/>
               </w:rPr>
               <w:t>Метаданные публикации</w:t>
             </w:r>
@@ -111,15 +88,13 @@
         </w:tc>
         <w:tc>
           <w:tcPr>
-            <w:tcW w:type="dxa" w:w="4320"/>
+            <w:tcW w:type="dxa" w:w="4844"/>
           </w:tcPr>
           <w:p>
             <w:r>
               <w:rPr>
-                <w:rFonts w:ascii="Times New Roman" w:hAnsi="Times New Roman" w:cs="Times New Roman"/>
                 <w:rFonts w:ascii="Times New Roman" w:hAnsi="Times New Roman"/>
-                <w:b w:val="0"/>
-                <w:sz w:val="24"/>
+                <w:sz w:val="22"/>
               </w:rPr>
               <w:t>Структурированное описание статьи: название, авторы, год, журнал, DOI, тематики, ключевые слова — без полного текста</w:t>
             </w:r>
@@ -129,15 +104,13 @@
       <w:tr>
         <w:tc>
           <w:tcPr>
-            <w:tcW w:type="dxa" w:w="4320"/>
+            <w:tcW w:type="dxa" w:w="4844"/>
           </w:tcPr>
           <w:p>
             <w:r>
               <w:rPr>
-                <w:rFonts w:ascii="Times New Roman" w:hAnsi="Times New Roman" w:cs="Times New Roman"/>
                 <w:rFonts w:ascii="Times New Roman" w:hAnsi="Times New Roman"/>
-                <w:b/>
-                <w:sz w:val="24"/>
+                <w:sz w:val="22"/>
               </w:rPr>
               <w:t>OpenAlex</w:t>
             </w:r>
@@ -145,15 +118,13 @@
         </w:tc>
         <w:tc>
           <w:tcPr>
-            <w:tcW w:type="dxa" w:w="4320"/>
+            <w:tcW w:type="dxa" w:w="4844"/>
           </w:tcPr>
           <w:p>
             <w:r>
               <w:rPr>
-                <w:rFonts w:ascii="Times New Roman" w:hAnsi="Times New Roman" w:cs="Times New Roman"/>
                 <w:rFonts w:ascii="Times New Roman" w:hAnsi="Times New Roman"/>
-                <w:b w:val="0"/>
-                <w:sz w:val="24"/>
+                <w:sz w:val="22"/>
               </w:rPr>
               <w:t>Открытый бесплатный каталог научных публикаций; содержит более 250 млн работ</w:t>
             </w:r>
@@ -163,15 +134,13 @@
       <w:tr>
         <w:tc>
           <w:tcPr>
-            <w:tcW w:type="dxa" w:w="4320"/>
+            <w:tcW w:type="dxa" w:w="4844"/>
           </w:tcPr>
           <w:p>
             <w:r>
               <w:rPr>
-                <w:rFonts w:ascii="Times New Roman" w:hAnsi="Times New Roman" w:cs="Times New Roman"/>
                 <w:rFonts w:ascii="Times New Roman" w:hAnsi="Times New Roman"/>
-                <w:b/>
-                <w:sz w:val="24"/>
+                <w:sz w:val="22"/>
               </w:rPr>
               <w:t>API</w:t>
             </w:r>
@@ -179,15 +148,13 @@
         </w:tc>
         <w:tc>
           <w:tcPr>
-            <w:tcW w:type="dxa" w:w="4320"/>
+            <w:tcW w:type="dxa" w:w="4844"/>
           </w:tcPr>
           <w:p>
             <w:r>
               <w:rPr>
-                <w:rFonts w:ascii="Times New Roman" w:hAnsi="Times New Roman" w:cs="Times New Roman"/>
                 <w:rFonts w:ascii="Times New Roman" w:hAnsi="Times New Roman"/>
-                <w:b w:val="0"/>
-                <w:sz w:val="24"/>
+                <w:sz w:val="22"/>
               </w:rPr>
               <w:t>Интерфейс программного взаимодействия — набор HTTP-запросов для получения данных из внешнего сервиса</w:t>
             </w:r>
@@ -197,15 +164,13 @@
       <w:tr>
         <w:tc>
           <w:tcPr>
-            <w:tcW w:type="dxa" w:w="4320"/>
+            <w:tcW w:type="dxa" w:w="4844"/>
           </w:tcPr>
           <w:p>
             <w:r>
               <w:rPr>
-                <w:rFonts w:ascii="Times New Roman" w:hAnsi="Times New Roman" w:cs="Times New Roman"/>
                 <w:rFonts w:ascii="Times New Roman" w:hAnsi="Times New Roman"/>
-                <w:b/>
-                <w:sz w:val="24"/>
+                <w:sz w:val="22"/>
               </w:rPr>
               <w:t>DOI</w:t>
             </w:r>
@@ -213,15 +178,13 @@
         </w:tc>
         <w:tc>
           <w:tcPr>
-            <w:tcW w:type="dxa" w:w="4320"/>
+            <w:tcW w:type="dxa" w:w="4844"/>
           </w:tcPr>
           <w:p>
             <w:r>
               <w:rPr>
-                <w:rFonts w:ascii="Times New Roman" w:hAnsi="Times New Roman" w:cs="Times New Roman"/>
                 <w:rFonts w:ascii="Times New Roman" w:hAnsi="Times New Roman"/>
-                <w:b w:val="0"/>
-                <w:sz w:val="24"/>
+                <w:sz w:val="22"/>
               </w:rPr>
               <w:t>Уникальный цифровой идентификатор научной публикации в формате 10.XXXX/...</w:t>
             </w:r>
@@ -231,15 +194,13 @@
       <w:tr>
         <w:tc>
           <w:tcPr>
-            <w:tcW w:type="dxa" w:w="4320"/>
+            <w:tcW w:type="dxa" w:w="4844"/>
           </w:tcPr>
           <w:p>
             <w:r>
               <w:rPr>
-                <w:rFonts w:ascii="Times New Roman" w:hAnsi="Times New Roman" w:cs="Times New Roman"/>
                 <w:rFonts w:ascii="Times New Roman" w:hAnsi="Times New Roman"/>
-                <w:b/>
-                <w:sz w:val="24"/>
+                <w:sz w:val="22"/>
               </w:rPr>
               <w:t>Аффилиация</w:t>
             </w:r>
@@ -247,15 +208,13 @@
         </w:tc>
         <w:tc>
           <w:tcPr>
-            <w:tcW w:type="dxa" w:w="4320"/>
+            <w:tcW w:type="dxa" w:w="4844"/>
           </w:tcPr>
           <w:p>
             <w:r>
               <w:rPr>
-                <w:rFonts w:ascii="Times New Roman" w:hAnsi="Times New Roman" w:cs="Times New Roman"/>
                 <w:rFonts w:ascii="Times New Roman" w:hAnsi="Times New Roman"/>
-                <w:b w:val="0"/>
-                <w:sz w:val="24"/>
+                <w:sz w:val="22"/>
               </w:rPr>
               <w:t>Организация, с которой связан автор на момент публикации (университет, институт, компания)</w:t>
             </w:r>
@@ -265,15 +224,13 @@
       <w:tr>
         <w:tc>
           <w:tcPr>
-            <w:tcW w:type="dxa" w:w="4320"/>
+            <w:tcW w:type="dxa" w:w="4844"/>
           </w:tcPr>
           <w:p>
             <w:r>
               <w:rPr>
-                <w:rFonts w:ascii="Times New Roman" w:hAnsi="Times New Roman" w:cs="Times New Roman"/>
                 <w:rFonts w:ascii="Times New Roman" w:hAnsi="Times New Roman"/>
-                <w:b/>
-                <w:sz w:val="24"/>
+                <w:sz w:val="22"/>
               </w:rPr>
               <w:t>Геокодирование</w:t>
             </w:r>
@@ -281,15 +238,13 @@
         </w:tc>
         <w:tc>
           <w:tcPr>
-            <w:tcW w:type="dxa" w:w="4320"/>
+            <w:tcW w:type="dxa" w:w="4844"/>
           </w:tcPr>
           <w:p>
             <w:r>
               <w:rPr>
-                <w:rFonts w:ascii="Times New Roman" w:hAnsi="Times New Roman" w:cs="Times New Roman"/>
                 <w:rFonts w:ascii="Times New Roman" w:hAnsi="Times New Roman"/>
-                <w:b w:val="0"/>
-                <w:sz w:val="24"/>
+                <w:sz w:val="22"/>
               </w:rPr>
               <w:t>Определение географических координат (широта, долгота) по названию места или идентификатору организации</w:t>
             </w:r>
@@ -299,15 +254,13 @@
       <w:tr>
         <w:tc>
           <w:tcPr>
-            <w:tcW w:type="dxa" w:w="4320"/>
+            <w:tcW w:type="dxa" w:w="4844"/>
           </w:tcPr>
           <w:p>
             <w:r>
               <w:rPr>
-                <w:rFonts w:ascii="Times New Roman" w:hAnsi="Times New Roman" w:cs="Times New Roman"/>
                 <w:rFonts w:ascii="Times New Roman" w:hAnsi="Times New Roman"/>
-                <w:b/>
-                <w:sz w:val="24"/>
+                <w:sz w:val="22"/>
               </w:rPr>
               <w:t>Граф</w:t>
             </w:r>
@@ -315,15 +268,13 @@
         </w:tc>
         <w:tc>
           <w:tcPr>
-            <w:tcW w:type="dxa" w:w="4320"/>
+            <w:tcW w:type="dxa" w:w="4844"/>
           </w:tcPr>
           <w:p>
             <w:r>
               <w:rPr>
-                <w:rFonts w:ascii="Times New Roman" w:hAnsi="Times New Roman" w:cs="Times New Roman"/>
                 <w:rFonts w:ascii="Times New Roman" w:hAnsi="Times New Roman"/>
-                <w:b w:val="0"/>
-                <w:sz w:val="24"/>
+                <w:sz w:val="22"/>
               </w:rPr>
               <w:t>Структура из узлов и рёбер (связей) между ними; используется для визуализации отношений между объектами</w:t>
             </w:r>
@@ -333,15 +284,13 @@
       <w:tr>
         <w:tc>
           <w:tcPr>
-            <w:tcW w:type="dxa" w:w="4320"/>
+            <w:tcW w:type="dxa" w:w="4844"/>
           </w:tcPr>
           <w:p>
             <w:r>
               <w:rPr>
-                <w:rFonts w:ascii="Times New Roman" w:hAnsi="Times New Roman" w:cs="Times New Roman"/>
                 <w:rFonts w:ascii="Times New Roman" w:hAnsi="Times New Roman"/>
-                <w:b/>
-                <w:sz w:val="24"/>
+                <w:sz w:val="22"/>
               </w:rPr>
               <w:t>REST API</w:t>
             </w:r>
@@ -349,17 +298,15 @@
         </w:tc>
         <w:tc>
           <w:tcPr>
-            <w:tcW w:type="dxa" w:w="4320"/>
+            <w:tcW w:type="dxa" w:w="4844"/>
           </w:tcPr>
           <w:p>
             <w:r>
               <w:rPr>
-                <w:rFonts w:ascii="Times New Roman" w:hAnsi="Times New Roman" w:cs="Times New Roman"/>
                 <w:rFonts w:ascii="Times New Roman" w:hAnsi="Times New Roman"/>
-                <w:b w:val="0"/>
-                <w:sz w:val="24"/>
+                <w:sz w:val="22"/>
               </w:rPr>
-              <w:t>Стиль веб-сервисов, где каждый ресурс доступен по URL через стандартные HTTP-методы</w:t>
+              <w:t>Стиль веб-сервисов, где каждый ресурс доступен по URL через стандартные HTTP-методы (GET, POST)</w:t>
             </w:r>
           </w:p>
         </w:tc>
@@ -367,15 +314,13 @@
       <w:tr>
         <w:tc>
           <w:tcPr>
-            <w:tcW w:type="dxa" w:w="4320"/>
+            <w:tcW w:type="dxa" w:w="4844"/>
           </w:tcPr>
           <w:p>
             <w:r>
               <w:rPr>
-                <w:rFonts w:ascii="Times New Roman" w:hAnsi="Times New Roman" w:cs="Times New Roman"/>
                 <w:rFonts w:ascii="Times New Roman" w:hAnsi="Times New Roman"/>
-                <w:b/>
-                <w:sz w:val="24"/>
+                <w:sz w:val="22"/>
               </w:rPr>
               <w:t>PostgreSQL</w:t>
             </w:r>
@@ -383,15 +328,13 @@
         </w:tc>
         <w:tc>
           <w:tcPr>
-            <w:tcW w:type="dxa" w:w="4320"/>
+            <w:tcW w:type="dxa" w:w="4844"/>
           </w:tcPr>
           <w:p>
             <w:r>
               <w:rPr>
-                <w:rFonts w:ascii="Times New Roman" w:hAnsi="Times New Roman" w:cs="Times New Roman"/>
                 <w:rFonts w:ascii="Times New Roman" w:hAnsi="Times New Roman"/>
-                <w:b w:val="0"/>
-                <w:sz w:val="24"/>
+                <w:sz w:val="22"/>
               </w:rPr>
               <w:t>Реляционная система управления базами данных с открытым исходным кодом</w:t>
             </w:r>
@@ -401,15 +344,13 @@
       <w:tr>
         <w:tc>
           <w:tcPr>
-            <w:tcW w:type="dxa" w:w="4320"/>
+            <w:tcW w:type="dxa" w:w="4844"/>
           </w:tcPr>
           <w:p>
             <w:r>
               <w:rPr>
-                <w:rFonts w:ascii="Times New Roman" w:hAnsi="Times New Roman" w:cs="Times New Roman"/>
                 <w:rFonts w:ascii="Times New Roman" w:hAnsi="Times New Roman"/>
-                <w:b/>
-                <w:sz w:val="24"/>
+                <w:sz w:val="22"/>
               </w:rPr>
               <w:t>gzip</w:t>
             </w:r>
@@ -417,15 +358,13 @@
         </w:tc>
         <w:tc>
           <w:tcPr>
-            <w:tcW w:type="dxa" w:w="4320"/>
+            <w:tcW w:type="dxa" w:w="4844"/>
           </w:tcPr>
           <w:p>
             <w:r>
               <w:rPr>
-                <w:rFonts w:ascii="Times New Roman" w:hAnsi="Times New Roman" w:cs="Times New Roman"/>
                 <w:rFonts w:ascii="Times New Roman" w:hAnsi="Times New Roman"/>
-                <w:b w:val="0"/>
-                <w:sz w:val="24"/>
+                <w:sz w:val="22"/>
               </w:rPr>
               <w:t>Алгоритм сжатия данных; уменьшает объём HTTP-ответов сервера в 5–10 раз</w:t>
             </w:r>
@@ -435,15 +374,13 @@
       <w:tr>
         <w:tc>
           <w:tcPr>
-            <w:tcW w:type="dxa" w:w="4320"/>
+            <w:tcW w:type="dxa" w:w="4844"/>
           </w:tcPr>
           <w:p>
             <w:r>
               <w:rPr>
-                <w:rFonts w:ascii="Times New Roman" w:hAnsi="Times New Roman" w:cs="Times New Roman"/>
                 <w:rFonts w:ascii="Times New Roman" w:hAnsi="Times New Roman"/>
-                <w:b/>
-                <w:sz w:val="24"/>
+                <w:sz w:val="22"/>
               </w:rPr>
               <w:t>Фасетная фильтрация</w:t>
             </w:r>
@@ -451,15 +388,13 @@
         </w:tc>
         <w:tc>
           <w:tcPr>
-            <w:tcW w:type="dxa" w:w="4320"/>
+            <w:tcW w:type="dxa" w:w="4844"/>
           </w:tcPr>
           <w:p>
             <w:r>
               <w:rPr>
-                <w:rFonts w:ascii="Times New Roman" w:hAnsi="Times New Roman" w:cs="Times New Roman"/>
                 <w:rFonts w:ascii="Times New Roman" w:hAnsi="Times New Roman"/>
-                <w:b w:val="0"/>
-                <w:sz w:val="24"/>
+                <w:sz w:val="22"/>
               </w:rPr>
               <w:t>Метод фильтрации, при котором выбор в одном фильтре автоматически ограничивает варианты в других</w:t>
             </w:r>
@@ -469,15 +404,13 @@
       <w:tr>
         <w:tc>
           <w:tcPr>
-            <w:tcW w:type="dxa" w:w="4320"/>
+            <w:tcW w:type="dxa" w:w="4844"/>
           </w:tcPr>
           <w:p>
             <w:r>
               <w:rPr>
-                <w:rFonts w:ascii="Times New Roman" w:hAnsi="Times New Roman" w:cs="Times New Roman"/>
                 <w:rFonts w:ascii="Times New Roman" w:hAnsi="Times New Roman"/>
-                <w:b/>
-                <w:sz w:val="24"/>
+                <w:sz w:val="22"/>
               </w:rPr>
               <w:t>SVG</w:t>
             </w:r>
@@ -485,15 +418,13 @@
         </w:tc>
         <w:tc>
           <w:tcPr>
-            <w:tcW w:type="dxa" w:w="4320"/>
+            <w:tcW w:type="dxa" w:w="4844"/>
           </w:tcPr>
           <w:p>
             <w:r>
               <w:rPr>
-                <w:rFonts w:ascii="Times New Roman" w:hAnsi="Times New Roman" w:cs="Times New Roman"/>
                 <w:rFonts w:ascii="Times New Roman" w:hAnsi="Times New Roman"/>
-                <w:b w:val="0"/>
-                <w:sz w:val="24"/>
+                <w:sz w:val="22"/>
               </w:rPr>
               <w:t>XML-формат для векторной графики в браузере; используется для рисования графа</w:t>
             </w:r>
@@ -503,15 +434,13 @@
       <w:tr>
         <w:tc>
           <w:tcPr>
-            <w:tcW w:type="dxa" w:w="4320"/>
+            <w:tcW w:type="dxa" w:w="4844"/>
           </w:tcPr>
           <w:p>
             <w:r>
               <w:rPr>
-                <w:rFonts w:ascii="Times New Roman" w:hAnsi="Times New Roman" w:cs="Times New Roman"/>
                 <w:rFonts w:ascii="Times New Roman" w:hAnsi="Times New Roman"/>
-                <w:b/>
-                <w:sz w:val="24"/>
+                <w:sz w:val="22"/>
               </w:rPr>
               <w:t>Cursor pagination</w:t>
             </w:r>
@@ -519,15 +448,13 @@
         </w:tc>
         <w:tc>
           <w:tcPr>
-            <w:tcW w:type="dxa" w:w="4320"/>
+            <w:tcW w:type="dxa" w:w="4844"/>
           </w:tcPr>
           <w:p>
             <w:r>
               <w:rPr>
-                <w:rFonts w:ascii="Times New Roman" w:hAnsi="Times New Roman" w:cs="Times New Roman"/>
                 <w:rFonts w:ascii="Times New Roman" w:hAnsi="Times New Roman"/>
-                <w:b w:val="0"/>
-                <w:sz w:val="24"/>
+                <w:sz w:val="22"/>
               </w:rPr>
               <w:t>Постраничный обход данных через токены-курсоры, исключающий пропуски при большой выборке</w:t>
             </w:r>
@@ -537,15 +464,13 @@
       <w:tr>
         <w:tc>
           <w:tcPr>
-            <w:tcW w:type="dxa" w:w="4320"/>
+            <w:tcW w:type="dxa" w:w="4844"/>
           </w:tcPr>
           <w:p>
             <w:r>
               <w:rPr>
-                <w:rFonts w:ascii="Times New Roman" w:hAnsi="Times New Roman" w:cs="Times New Roman"/>
                 <w:rFonts w:ascii="Times New Roman" w:hAnsi="Times New Roman"/>
-                <w:b/>
-                <w:sz w:val="24"/>
+                <w:sz w:val="22"/>
               </w:rPr>
               <w:t>Библиометрия</w:t>
             </w:r>
@@ -553,15 +478,13 @@
         </w:tc>
         <w:tc>
           <w:tcPr>
-            <w:tcW w:type="dxa" w:w="4320"/>
+            <w:tcW w:type="dxa" w:w="4844"/>
           </w:tcPr>
           <w:p>
             <w:r>
               <w:rPr>
-                <w:rFonts w:ascii="Times New Roman" w:hAnsi="Times New Roman" w:cs="Times New Roman"/>
                 <w:rFonts w:ascii="Times New Roman" w:hAnsi="Times New Roman"/>
-                <w:b w:val="0"/>
-                <w:sz w:val="24"/>
+                <w:sz w:val="22"/>
               </w:rPr>
               <w:t>Количественный анализ научных публикаций: цитирования, коавторские связи, тематические кластеры</w:t>
             </w:r>
@@ -571,15 +494,13 @@
       <w:tr>
         <w:tc>
           <w:tcPr>
-            <w:tcW w:type="dxa" w:w="4320"/>
+            <w:tcW w:type="dxa" w:w="4844"/>
           </w:tcPr>
           <w:p>
             <w:r>
               <w:rPr>
-                <w:rFonts w:ascii="Times New Roman" w:hAnsi="Times New Roman" w:cs="Times New Roman"/>
                 <w:rFonts w:ascii="Times New Roman" w:hAnsi="Times New Roman"/>
-                <w:b/>
-                <w:sz w:val="24"/>
+                <w:sz w:val="22"/>
               </w:rPr>
               <w:t>Балл сходства</w:t>
             </w:r>
@@ -587,15 +508,13 @@
         </w:tc>
         <w:tc>
           <w:tcPr>
-            <w:tcW w:type="dxa" w:w="4320"/>
+            <w:tcW w:type="dxa" w:w="4844"/>
           </w:tcPr>
           <w:p>
             <w:r>
               <w:rPr>
-                <w:rFonts w:ascii="Times New Roman" w:hAnsi="Times New Roman" w:cs="Times New Roman"/>
                 <w:rFonts w:ascii="Times New Roman" w:hAnsi="Times New Roman"/>
-                <w:b w:val="0"/>
-                <w:sz w:val="24"/>
+                <w:sz w:val="22"/>
               </w:rPr>
               <w:t>Числовая мера близости двух публикаций по взвешенной сумме совпадающих признаков</w:t>
             </w:r>
@@ -605,15 +524,13 @@
       <w:tr>
         <w:tc>
           <w:tcPr>
-            <w:tcW w:type="dxa" w:w="4320"/>
+            <w:tcW w:type="dxa" w:w="4844"/>
           </w:tcPr>
           <w:p>
             <w:r>
               <w:rPr>
-                <w:rFonts w:ascii="Times New Roman" w:hAnsi="Times New Roman" w:cs="Times New Roman"/>
                 <w:rFonts w:ascii="Times New Roman" w:hAnsi="Times New Roman"/>
-                <w:b/>
-                <w:sz w:val="24"/>
+                <w:sz w:val="22"/>
               </w:rPr>
               <w:t>requestAnimationFrame</w:t>
             </w:r>
@@ -621,17 +538,15 @@
         </w:tc>
         <w:tc>
           <w:tcPr>
-            <w:tcW w:type="dxa" w:w="4320"/>
+            <w:tcW w:type="dxa" w:w="4844"/>
           </w:tcPr>
           <w:p>
             <w:r>
               <w:rPr>
-                <w:rFonts w:ascii="Times New Roman" w:hAnsi="Times New Roman" w:cs="Times New Roman"/>
                 <w:rFonts w:ascii="Times New Roman" w:hAnsi="Times New Roman"/>
-                <w:b w:val="0"/>
-                <w:sz w:val="24"/>
+                <w:sz w:val="22"/>
               </w:rPr>
-              <w:t>Браузерный API для выполнения тяжёлых операций между кадрами, не блокируя интерфейс</w:t>
+              <w:t>Браузерный API для выполнения тяжёлых операций в промежутках между отрисовкой кадров, не блокируя интерфейс</w:t>
             </w:r>
           </w:p>
         </w:tc>
@@ -639,15 +554,13 @@
       <w:tr>
         <w:tc>
           <w:tcPr>
-            <w:tcW w:type="dxa" w:w="4320"/>
+            <w:tcW w:type="dxa" w:w="4844"/>
           </w:tcPr>
           <w:p>
             <w:r>
               <w:rPr>
-                <w:rFonts w:ascii="Times New Roman" w:hAnsi="Times New Roman" w:cs="Times New Roman"/>
                 <w:rFonts w:ascii="Times New Roman" w:hAnsi="Times New Roman"/>
-                <w:b/>
-                <w:sz w:val="24"/>
+                <w:sz w:val="22"/>
               </w:rPr>
               <w:t>ijson</w:t>
             </w:r>
@@ -655,15 +568,13 @@
         </w:tc>
         <w:tc>
           <w:tcPr>
-            <w:tcW w:type="dxa" w:w="4320"/>
+            <w:tcW w:type="dxa" w:w="4844"/>
           </w:tcPr>
           <w:p>
             <w:r>
               <w:rPr>
-                <w:rFonts w:ascii="Times New Roman" w:hAnsi="Times New Roman" w:cs="Times New Roman"/>
                 <w:rFonts w:ascii="Times New Roman" w:hAnsi="Times New Roman"/>
-                <w:b w:val="0"/>
-                <w:sz w:val="24"/>
+                <w:sz w:val="22"/>
               </w:rPr>
               <w:t>Python-библиотека для потокового чтения JSON-файлов без загрузки всего файла в память</w:t>
             </w:r>
@@ -673,15 +584,13 @@
       <w:tr>
         <w:tc>
           <w:tcPr>
-            <w:tcW w:type="dxa" w:w="4320"/>
+            <w:tcW w:type="dxa" w:w="4844"/>
           </w:tcPr>
           <w:p>
             <w:r>
               <w:rPr>
-                <w:rFonts w:ascii="Times New Roman" w:hAnsi="Times New Roman" w:cs="Times New Roman"/>
                 <w:rFonts w:ascii="Times New Roman" w:hAnsi="Times New Roman"/>
-                <w:b/>
-                <w:sz w:val="24"/>
+                <w:sz w:val="22"/>
               </w:rPr>
               <w:t>Savepoint</w:t>
             </w:r>
@@ -689,15 +598,13 @@
         </w:tc>
         <w:tc>
           <w:tcPr>
-            <w:tcW w:type="dxa" w:w="4320"/>
+            <w:tcW w:type="dxa" w:w="4844"/>
           </w:tcPr>
           <w:p>
             <w:r>
               <w:rPr>
-                <w:rFonts w:ascii="Times New Roman" w:hAnsi="Times New Roman" w:cs="Times New Roman"/>
                 <w:rFonts w:ascii="Times New Roman" w:hAnsi="Times New Roman"/>
-                <w:b w:val="0"/>
-                <w:sz w:val="24"/>
+                <w:sz w:val="22"/>
               </w:rPr>
               <w:t>Механизм PostgreSQL для частичного отката транзакции при ошибке без потери остальных данных</w:t>
             </w:r>
@@ -707,15 +614,13 @@
       <w:tr>
         <w:tc>
           <w:tcPr>
-            <w:tcW w:type="dxa" w:w="4320"/>
+            <w:tcW w:type="dxa" w:w="4844"/>
           </w:tcPr>
           <w:p>
             <w:r>
               <w:rPr>
-                <w:rFonts w:ascii="Times New Roman" w:hAnsi="Times New Roman" w:cs="Times New Roman"/>
                 <w:rFonts w:ascii="Times New Roman" w:hAnsi="Times New Roman"/>
-                <w:b/>
-                <w:sz w:val="24"/>
+                <w:sz w:val="22"/>
               </w:rPr>
               <w:t>Force-directed layout</w:t>
             </w:r>
@@ -723,17 +628,15 @@
         </w:tc>
         <w:tc>
           <w:tcPr>
-            <w:tcW w:type="dxa" w:w="4320"/>
+            <w:tcW w:type="dxa" w:w="4844"/>
           </w:tcPr>
           <w:p>
             <w:r>
               <w:rPr>
-                <w:rFonts w:ascii="Times New Roman" w:hAnsi="Times New Roman" w:cs="Times New Roman"/>
                 <w:rFonts w:ascii="Times New Roman" w:hAnsi="Times New Roman"/>
-                <w:b w:val="0"/>
-                <w:sz w:val="24"/>
+                <w:sz w:val="22"/>
               </w:rPr>
-              <w:t>Алгоритм физической симуляции для размещения узлов графа; даёт хаотичный результат при 70+ узлах</w:t>
+              <w:t>Алгоритм физической симуляции для размещения узлов графа; даёт хаотичный результат при большом числе узлов</w:t>
             </w:r>
           </w:p>
         </w:tc>
@@ -741,15 +644,13 @@
       <w:tr>
         <w:tc>
           <w:tcPr>
-            <w:tcW w:type="dxa" w:w="4320"/>
+            <w:tcW w:type="dxa" w:w="4844"/>
           </w:tcPr>
           <w:p>
             <w:r>
               <w:rPr>
-                <w:rFonts w:ascii="Times New Roman" w:hAnsi="Times New Roman" w:cs="Times New Roman"/>
                 <w:rFonts w:ascii="Times New Roman" w:hAnsi="Times New Roman"/>
-                <w:b/>
-                <w:sz w:val="24"/>
+                <w:sz w:val="22"/>
               </w:rPr>
               <w:t>Колоночная раскладка</w:t>
             </w:r>
@@ -757,52 +658,46 @@
         </w:tc>
         <w:tc>
           <w:tcPr>
-            <w:tcW w:type="dxa" w:w="4320"/>
+            <w:tcW w:type="dxa" w:w="4844"/>
           </w:tcPr>
           <w:p>
             <w:r>
               <w:rPr>
-                <w:rFonts w:ascii="Times New Roman" w:hAnsi="Times New Roman" w:cs="Times New Roman"/>
                 <w:rFonts w:ascii="Times New Roman" w:hAnsi="Times New Roman"/>
-                <w:b w:val="0"/>
-                <w:sz w:val="24"/>
+                <w:sz w:val="22"/>
               </w:rPr>
-              <w:t>Способ размещения узлов графа: каждый тип узла занимает фиксированную вертикальную колонку</w:t>
+              <w:t>Детерминированный способ размещения узлов графа: каждый тип узла занимает фиксированную вертикальную колонку</w:t>
             </w:r>
           </w:p>
         </w:tc>
       </w:tr>
     </w:tbl>
+    <w:p/>
     <w:p>
       <w:pPr>
-        <w:spacing w:before="0" w:after="240"/>
+        <w:spacing w:before="120" w:after="120"/>
       </w:pPr>
-      <w:r/>
     </w:p>
     <w:p>
       <w:pPr>
-        <w:spacing w:before="280" w:after="160"/>
-        <w:ind w:firstLine="0"/>
+        <w:spacing w:before="240" w:after="120"/>
       </w:pPr>
       <w:r>
         <w:rPr>
-          <w:rFonts w:ascii="Times New Roman" w:hAnsi="Times New Roman" w:cs="Times New Roman"/>
           <w:rFonts w:ascii="Times New Roman" w:hAnsi="Times New Roman"/>
           <w:b/>
-          <w:sz w:val="28"/>
+          <w:sz w:val="32"/>
         </w:rPr>
         <w:t>Слайд 1 — Титульный (10–15 секунд)</w:t>
       </w:r>
     </w:p>
     <w:p>
       <w:pPr>
-        <w:spacing w:before="0" w:after="120"/>
+        <w:spacing w:after="0" w:line="360" w:lineRule="exact"/>
         <w:ind w:firstLine="709"/>
-        <w:jc w:val="both"/>
       </w:pPr>
       <w:r>
         <w:rPr>
-          <w:rFonts w:ascii="Times New Roman" w:hAnsi="Times New Roman" w:cs="Times New Roman"/>
           <w:rFonts w:ascii="Times New Roman" w:hAnsi="Times New Roman"/>
           <w:b w:val="0"/>
           <w:sz w:val="28"/>
@@ -812,28 +707,107 @@
     </w:p>
     <w:p>
       <w:pPr>
-        <w:spacing w:before="280" w:after="160"/>
-        <w:ind w:firstLine="0"/>
+        <w:spacing w:before="120" w:after="120"/>
+      </w:pPr>
+    </w:p>
+    <w:p>
+      <w:pPr>
+        <w:spacing w:before="240" w:after="120"/>
       </w:pPr>
       <w:r>
         <w:rPr>
-          <w:rFonts w:ascii="Times New Roman" w:hAnsi="Times New Roman" w:cs="Times New Roman"/>
           <w:rFonts w:ascii="Times New Roman" w:hAnsi="Times New Roman"/>
           <w:b/>
-          <w:sz w:val="28"/>
+          <w:sz w:val="32"/>
         </w:rPr>
-        <w:t>Слайд 2 — Цель и задачи (50–60 секунд)</w:t>
+        <w:t>Слайд 2 — Актуальность (40–50 секунд)</w:t>
       </w:r>
     </w:p>
     <w:p>
       <w:pPr>
-        <w:spacing w:before="0" w:after="120"/>
+        <w:spacing w:after="0" w:line="360" w:lineRule="exact"/>
         <w:ind w:firstLine="709"/>
-        <w:jc w:val="both"/>
       </w:pPr>
       <w:r>
         <w:rPr>
-          <w:rFonts w:ascii="Times New Roman" w:hAnsi="Times New Roman" w:cs="Times New Roman"/>
+          <w:rFonts w:ascii="Times New Roman" w:hAnsi="Times New Roman"/>
+          <w:b w:val="0"/>
+          <w:sz w:val="28"/>
+        </w:rPr>
+        <w:t>Сегодня в открытом доступе находится более 250 миллионов научных работ, и их число удваивается каждые девять лет. В таких условиях обычный поиск по ключевым словам помогает найти конкретную статью, но не отвечает на более широкие вопросы: кто с кем сотрудничает в научном сообществе, из каких стран приходят исследования по теме, как менялась тематика за последние годы.</w:t>
+      </w:r>
+    </w:p>
+    <w:p>
+      <w:pPr>
+        <w:spacing w:after="0" w:line="360" w:lineRule="exact"/>
+        <w:ind w:firstLine="709"/>
+      </w:pPr>
+      <w:r>
+        <w:rPr>
+          <w:rFonts w:ascii="Times New Roman" w:hAnsi="Times New Roman"/>
+          <w:b w:val="0"/>
+          <w:sz w:val="28"/>
+        </w:rPr>
+        <w:t>Карта и граф — это два визуальных инструмента, которые превращают тысячи строк метаданных в наглядный научный ландшафт. Именно это и есть суть данной работы.</w:t>
+      </w:r>
+    </w:p>
+    <w:p>
+      <w:pPr>
+        <w:spacing w:before="120" w:after="120"/>
+      </w:pPr>
+    </w:p>
+    <w:p>
+      <w:pPr>
+        <w:spacing w:before="240" w:after="120"/>
+      </w:pPr>
+      <w:r>
+        <w:rPr>
+          <w:rFonts w:ascii="Times New Roman" w:hAnsi="Times New Roman"/>
+          <w:b/>
+          <w:sz w:val="32"/>
+        </w:rPr>
+        <w:t>Слайд 3 — Динамика публикационной активности (20–30 секунд)</w:t>
+      </w:r>
+    </w:p>
+    <w:p>
+      <w:pPr>
+        <w:spacing w:after="0" w:line="360" w:lineRule="exact"/>
+        <w:ind w:firstLine="709"/>
+      </w:pPr>
+      <w:r>
+        <w:rPr>
+          <w:rFonts w:ascii="Times New Roman" w:hAnsi="Times New Roman"/>
+          <w:b w:val="0"/>
+          <w:sz w:val="28"/>
+        </w:rPr>
+        <w:t>На графике показана публикационная активность по годам на основе реальных данных из базы. Пик приходится на 2009–2010 годы. После 2020 года число публикаций снижается — это связано не с падением науки, а с неполнотой индексации свежих работ в OpenAlex: новые статьи попадают в каталог с задержкой.</w:t>
+      </w:r>
+    </w:p>
+    <w:p>
+      <w:pPr>
+        <w:spacing w:before="120" w:after="120"/>
+      </w:pPr>
+    </w:p>
+    <w:p>
+      <w:pPr>
+        <w:spacing w:before="240" w:after="120"/>
+      </w:pPr>
+      <w:r>
+        <w:rPr>
+          <w:rFonts w:ascii="Times New Roman" w:hAnsi="Times New Roman"/>
+          <w:b/>
+          <w:sz w:val="32"/>
+        </w:rPr>
+        <w:t>Слайд 4 — Цель и задачи (50–60 секунд)</w:t>
+      </w:r>
+    </w:p>
+    <w:p>
+      <w:pPr>
+        <w:spacing w:after="0" w:line="360" w:lineRule="exact"/>
+        <w:ind w:firstLine="709"/>
+      </w:pPr>
+      <w:r>
+        <w:rPr>
           <w:rFonts w:ascii="Times New Roman" w:hAnsi="Times New Roman"/>
           <w:b w:val="0"/>
           <w:sz w:val="28"/>
@@ -843,170 +817,177 @@
     </w:p>
     <w:p>
       <w:pPr>
-        <w:spacing w:before="0" w:after="120"/>
+        <w:spacing w:after="0" w:line="360" w:lineRule="exact"/>
         <w:ind w:firstLine="709"/>
-        <w:jc w:val="both"/>
       </w:pPr>
       <w:r>
         <w:rPr>
-          <w:rFonts w:ascii="Times New Roman" w:hAnsi="Times New Roman" w:cs="Times New Roman"/>
           <w:rFonts w:ascii="Times New Roman" w:hAnsi="Times New Roman"/>
           <w:b w:val="0"/>
           <w:sz w:val="28"/>
         </w:rPr>
-        <w:t>Формально задача ставится так. Дано: открытый API OpenAlex с метаданными более 250 миллионов работ — названия, авторы, организации, темы, ключевые слова. Требуется: разработать веб-приложение, в котором исследователь видит географию публикаций на карте, структурные связи в графе, может фильтровать данные и находить похожие статьи. Критерий: покрытие геокодирования не менее 75%, граф без зависания браузера, фильтры без пустых результатов.</w:t>
+        <w:t>Цель работы: разработать веб-приложение для анализа и интерактивной визуализации научных публикаций на основе открытых метаданных.</w:t>
       </w:r>
     </w:p>
     <w:p>
       <w:pPr>
-        <w:spacing w:before="0" w:after="120"/>
+        <w:spacing w:after="0" w:line="360" w:lineRule="exact"/>
         <w:ind w:firstLine="709"/>
-        <w:jc w:val="both"/>
       </w:pPr>
       <w:r>
         <w:rPr>
-          <w:rFonts w:ascii="Times New Roman" w:hAnsi="Times New Roman" w:cs="Times New Roman"/>
           <w:rFonts w:ascii="Times New Roman" w:hAnsi="Times New Roman"/>
           <w:b w:val="0"/>
           <w:sz w:val="28"/>
         </w:rPr>
-        <w:t>Для достижения этой цели решены шесть задач: загрузка метаданных, проектирование базы данных, геокодирование организаций, реализация карты и графа, разработка API и интерфейса.</w:t>
+        <w:t>Для достижения этой цели поставлено шесть задач: загрузить метаданные из OpenAlex, спроектировать и заполнить базу данных, геокодировать аффилиации авторов, реализовать карту и граф, разработать REST API и браузерный интерфейс с фасетными фильтрами.</w:t>
       </w:r>
     </w:p>
     <w:p>
       <w:pPr>
-        <w:spacing w:before="280" w:after="160"/>
-        <w:ind w:firstLine="0"/>
+        <w:spacing w:after="0" w:line="360" w:lineRule="exact"/>
+        <w:ind w:firstLine="709"/>
       </w:pPr>
       <w:r>
         <w:rPr>
-          <w:rFonts w:ascii="Times New Roman" w:hAnsi="Times New Roman" w:cs="Times New Roman"/>
           <w:rFonts w:ascii="Times New Roman" w:hAnsi="Times New Roman"/>
-          <w:b/>
+          <w:b w:val="0"/>
           <w:sz w:val="28"/>
         </w:rPr>
-        <w:t>Слайд 3 — Актуальность (40–50 секунд)</w:t>
+        <w:t>Критерии качества: покрытие геокодирования не менее 75%, граф без зависания браузера, фильтры без пустых результатов.</w:t>
       </w:r>
     </w:p>
     <w:p>
       <w:pPr>
-        <w:spacing w:before="0" w:after="120"/>
-        <w:ind w:firstLine="709"/>
-        <w:jc w:val="both"/>
+        <w:spacing w:before="120" w:after="120"/>
+      </w:pPr>
+    </w:p>
+    <w:p>
+      <w:pPr>
+        <w:spacing w:before="240" w:after="120"/>
       </w:pPr>
       <w:r>
         <w:rPr>
-          <w:rFonts w:ascii="Times New Roman" w:hAnsi="Times New Roman" w:cs="Times New Roman"/>
+          <w:rFonts w:ascii="Times New Roman" w:hAnsi="Times New Roman"/>
+          <w:b/>
+          <w:sz w:val="32"/>
+        </w:rPr>
+        <w:t>Слайд 5 — Обзор существующих решений (50–60 секунд)</w:t>
+      </w:r>
+    </w:p>
+    <w:p>
+      <w:pPr>
+        <w:spacing w:after="0" w:line="360" w:lineRule="exact"/>
+        <w:ind w:firstLine="709"/>
+      </w:pPr>
+      <w:r>
+        <w:rPr>
           <w:rFonts w:ascii="Times New Roman" w:hAnsi="Times New Roman"/>
           <w:b w:val="0"/>
           <w:sz w:val="28"/>
         </w:rPr>
-        <w:t>Сегодня в открытом доступе находится более 250 миллионов научных работ, и их число удваивается каждые девять лет. В таких условиях обычный поиск по ключевым словам помогает найти конкретную статью, но не отвечает на более широкие вопросы: кто с кем сотрудничает в научном сообществе, из каких стран приходят исследования по теме, как менялась тематика за последние годы.</w:t>
+        <w:t>Перед разработкой был проведён анализ девяти существующих инструментов: VOSviewer, CiteSpace, Connected Papers, Bibliometrix, Gephi, Lens.org, ResearchRabbit, Inciteful и Litmaps.</w:t>
       </w:r>
     </w:p>
     <w:p>
       <w:pPr>
-        <w:spacing w:before="0" w:after="120"/>
+        <w:spacing w:after="0" w:line="360" w:lineRule="exact"/>
         <w:ind w:firstLine="709"/>
-        <w:jc w:val="both"/>
       </w:pPr>
       <w:r>
         <w:rPr>
-          <w:rFonts w:ascii="Times New Roman" w:hAnsi="Times New Roman" w:cs="Times New Roman"/>
           <w:rFonts w:ascii="Times New Roman" w:hAnsi="Times New Roman"/>
           <w:b w:val="0"/>
           <w:sz w:val="28"/>
         </w:rPr>
-        <w:t>Карта и граф — это два визуальных инструмента, которые превращают тысячи строк метаданных в наглядный научный ландшафт. Именно это и есть суть данной работы.</w:t>
+        <w:t>VOSviewer и CiteSpace — мощные инструменты, но требуют установки и не имеют алгоритма похожих статей. Connected Papers строит граф похожих публикаций, но работает только с одной статьёй за раз и не имеет карты. Bibliometrix интегрируется с OpenAlex, но требует знания языка R. ResearchRabbit, Inciteful и Litmaps — современные браузерные сервисы, но ни один не сочетает карту с точными координатами и граф связей одновременно.</w:t>
       </w:r>
     </w:p>
     <w:p>
       <w:pPr>
-        <w:spacing w:before="280" w:after="160"/>
-        <w:ind w:firstLine="0"/>
+        <w:spacing w:after="0" w:line="360" w:lineRule="exact"/>
+        <w:ind w:firstLine="709"/>
       </w:pPr>
       <w:r>
         <w:rPr>
-          <w:rFonts w:ascii="Times New Roman" w:hAnsi="Times New Roman" w:cs="Times New Roman"/>
           <w:rFonts w:ascii="Times New Roman" w:hAnsi="Times New Roman"/>
-          <w:b/>
+          <w:b w:val="0"/>
           <w:sz w:val="28"/>
         </w:rPr>
-        <w:t>Слайд 4 — Обзор существующих решений (50–60 секунд)</w:t>
+        <w:t>Таким образом, ни один из рассмотренных инструментов не объединяет все четыре возможности: карту с точными координатами, граф связей, фасетную фильтрацию и поиск похожих статей — что и определило необходимость разработки собственной системы.</w:t>
       </w:r>
     </w:p>
     <w:p>
       <w:pPr>
-        <w:spacing w:before="0" w:after="120"/>
-        <w:ind w:firstLine="709"/>
-        <w:jc w:val="both"/>
+        <w:spacing w:before="120" w:after="120"/>
+      </w:pPr>
+    </w:p>
+    <w:p>
+      <w:pPr>
+        <w:spacing w:before="240" w:after="120"/>
       </w:pPr>
       <w:r>
         <w:rPr>
-          <w:rFonts w:ascii="Times New Roman" w:hAnsi="Times New Roman" w:cs="Times New Roman"/>
+          <w:rFonts w:ascii="Times New Roman" w:hAnsi="Times New Roman"/>
+          <w:b/>
+          <w:sz w:val="32"/>
+        </w:rPr>
+        <w:t>Слайд 6 — Анализ публикационной активности (40–50 секунд)</w:t>
+      </w:r>
+    </w:p>
+    <w:p>
+      <w:pPr>
+        <w:spacing w:after="0" w:line="360" w:lineRule="exact"/>
+        <w:ind w:firstLine="709"/>
+      </w:pPr>
+      <w:r>
+        <w:rPr>
           <w:rFonts w:ascii="Times New Roman" w:hAnsi="Times New Roman"/>
           <w:b w:val="0"/>
           <w:sz w:val="28"/>
         </w:rPr>
-        <w:t>Перед разработкой был проведён анализ шести существующих инструментов: VOSviewer, CiteSpace, Connected Papers, Bibliometrix, Gephi и Lens.org.</w:t>
+        <w:t>На основе загруженных данных был проведён библиометрический анализ. В базе 444 уникальных журнала и 2 594 тематических записи. Журналы разделены на четыре типа: монотематические, профильные, мультидисциплинарные и обзорные.</w:t>
       </w:r>
     </w:p>
     <w:p>
       <w:pPr>
-        <w:spacing w:before="0" w:after="120"/>
+        <w:spacing w:after="0" w:line="360" w:lineRule="exact"/>
         <w:ind w:firstLine="709"/>
-        <w:jc w:val="both"/>
       </w:pPr>
       <w:r>
         <w:rPr>
-          <w:rFonts w:ascii="Times New Roman" w:hAnsi="Times New Roman" w:cs="Times New Roman"/>
           <w:rFonts w:ascii="Times New Roman" w:hAnsi="Times New Roman"/>
           <w:b w:val="0"/>
           <w:sz w:val="28"/>
         </w:rPr>
-        <w:t>VOSviewer и CiteSpace — мощные инструменты, но требуют установки и не имеют алгоритма похожих статей. Connected Papers строит граф похожих публикаций, но работает только с одной статьёй за раз и не имеет карты. Bibliometrix интегрируется с OpenAlex, но требует знания языка R. Lens.org имеет карту по странам, но не строит граф связей между отдельными статьями.</w:t>
+        <w:t>Анализ тематических трендов показал, что нейронные сети и COVID-исследования возникли как новые темы после 2013 года, тогда как химическая физика и исследования графена полностью исчезли из публикаций. Это подтверждает, что тематический ландшафт науки меняется, и именно такие сдвиги система позволяет увидеть визуально.</w:t>
       </w:r>
     </w:p>
     <w:p>
       <w:pPr>
-        <w:spacing w:before="0" w:after="120"/>
-        <w:ind w:firstLine="709"/>
-        <w:jc w:val="both"/>
+        <w:spacing w:before="120" w:after="120"/>
+      </w:pPr>
+    </w:p>
+    <w:p>
+      <w:pPr>
+        <w:spacing w:before="240" w:after="120"/>
       </w:pPr>
       <w:r>
         <w:rPr>
-          <w:rFonts w:ascii="Times New Roman" w:hAnsi="Times New Roman" w:cs="Times New Roman"/>
           <w:rFonts w:ascii="Times New Roman" w:hAnsi="Times New Roman"/>
-          <w:b w:val="0"/>
-          <w:sz w:val="28"/>
+          <w:b/>
+          <w:sz w:val="32"/>
         </w:rPr>
-        <w:t>Таким образом, ни один из существующих инструментов не сочетает одновременно все четыре возможности: карту с точными координатами, граф связей, фасетную фильтрацию и поиск похожих статей. Это и определило необходимость разработки собственной системы.</w:t>
+        <w:t>Слайд 7 — Архитектура системы (50–60 секунд)</w:t>
       </w:r>
     </w:p>
     <w:p>
       <w:pPr>
-        <w:spacing w:before="280" w:after="160"/>
-        <w:ind w:firstLine="0"/>
+        <w:spacing w:after="0" w:line="360" w:lineRule="exact"/>
+        <w:ind w:firstLine="709"/>
       </w:pPr>
       <w:r>
         <w:rPr>
-          <w:rFonts w:ascii="Times New Roman" w:hAnsi="Times New Roman" w:cs="Times New Roman"/>
-          <w:rFonts w:ascii="Times New Roman" w:hAnsi="Times New Roman"/>
-          <w:b/>
-          <w:sz w:val="28"/>
-        </w:rPr>
-        <w:t>Слайд 5 — Архитектура (50–60 секунд)</w:t>
-      </w:r>
-    </w:p>
-    <w:p>
-      <w:pPr>
-        <w:spacing w:before="0" w:after="120"/>
-        <w:ind w:firstLine="709"/>
-        <w:jc w:val="both"/>
-      </w:pPr>
-      <w:r>
-        <w:rPr>
-          <w:rFonts w:ascii="Times New Roman" w:hAnsi="Times New Roman" w:cs="Times New Roman"/>
           <w:rFonts w:ascii="Times New Roman" w:hAnsi="Times New Roman"/>
           <w:b w:val="0"/>
           <w:sz w:val="28"/>
@@ -1016,13 +997,11 @@
     </w:p>
     <w:p>
       <w:pPr>
-        <w:spacing w:before="0" w:after="120"/>
+        <w:spacing w:after="0" w:line="360" w:lineRule="exact"/>
         <w:ind w:firstLine="709"/>
-        <w:jc w:val="both"/>
       </w:pPr>
       <w:r>
         <w:rPr>
-          <w:rFonts w:ascii="Times New Roman" w:hAnsi="Times New Roman" w:cs="Times New Roman"/>
           <w:rFonts w:ascii="Times New Roman" w:hAnsi="Times New Roman"/>
           <w:b w:val="0"/>
           <w:sz w:val="28"/>
@@ -1032,13 +1011,11 @@
     </w:p>
     <w:p>
       <w:pPr>
-        <w:spacing w:before="0" w:after="120"/>
+        <w:spacing w:after="0" w:line="360" w:lineRule="exact"/>
         <w:ind w:firstLine="709"/>
-        <w:jc w:val="both"/>
       </w:pPr>
       <w:r>
         <w:rPr>
-          <w:rFonts w:ascii="Times New Roman" w:hAnsi="Times New Roman" w:cs="Times New Roman"/>
           <w:rFonts w:ascii="Times New Roman" w:hAnsi="Times New Roman"/>
           <w:b w:val="0"/>
           <w:sz w:val="28"/>
@@ -1048,28 +1025,29 @@
     </w:p>
     <w:p>
       <w:pPr>
-        <w:spacing w:before="280" w:after="160"/>
-        <w:ind w:firstLine="0"/>
+        <w:spacing w:before="120" w:after="120"/>
+      </w:pPr>
+    </w:p>
+    <w:p>
+      <w:pPr>
+        <w:spacing w:before="240" w:after="120"/>
       </w:pPr>
       <w:r>
         <w:rPr>
-          <w:rFonts w:ascii="Times New Roman" w:hAnsi="Times New Roman" w:cs="Times New Roman"/>
           <w:rFonts w:ascii="Times New Roman" w:hAnsi="Times New Roman"/>
           <w:b/>
-          <w:sz w:val="28"/>
+          <w:sz w:val="32"/>
         </w:rPr>
-        <w:t>Слайд 6 — База данных (40–50 секунд)</w:t>
+        <w:t>Слайд 8 — База данных (40–50 секунд)</w:t>
       </w:r>
     </w:p>
     <w:p>
       <w:pPr>
-        <w:spacing w:before="0" w:after="120"/>
+        <w:spacing w:after="0" w:line="360" w:lineRule="exact"/>
         <w:ind w:firstLine="709"/>
-        <w:jc w:val="both"/>
       </w:pPr>
       <w:r>
         <w:rPr>
-          <w:rFonts w:ascii="Times New Roman" w:hAnsi="Times New Roman" w:cs="Times New Roman"/>
           <w:rFonts w:ascii="Times New Roman" w:hAnsi="Times New Roman"/>
           <w:b w:val="0"/>
           <w:sz w:val="28"/>
@@ -1079,328 +1057,371 @@
     </w:p>
     <w:p>
       <w:pPr>
-        <w:spacing w:before="0" w:after="120"/>
+        <w:spacing w:after="0" w:line="360" w:lineRule="exact"/>
         <w:ind w:firstLine="709"/>
-        <w:jc w:val="both"/>
       </w:pPr>
       <w:r>
         <w:rPr>
-          <w:rFonts w:ascii="Times New Roman" w:hAnsi="Times New Roman" w:cs="Times New Roman"/>
           <w:rFonts w:ascii="Times New Roman" w:hAnsi="Times New Roman"/>
           <w:b w:val="0"/>
           <w:sz w:val="28"/>
         </w:rPr>
-        <w:t>Настройки подключения вынесены в файл pg_config.py. Параметр client_encoding: utf8 обязателен — без него на Windows PostgreSQL возвращает ошибки в кодировке cp1251. При загрузке использовались savepoint-ы для обработки конфликтов DOI. Все 9 994 публикации загружены без ошибок.</w:t>
+        <w:t>Настройки подключения вынесены в отдельный файл pg_config.py. Параметр client_encoding: utf8 там обязателен — без него на Windows PostgreSQL возвращает сообщения об ошибках в кодировке cp1251, что приводит к сбоям в Python.</w:t>
       </w:r>
     </w:p>
     <w:p>
       <w:pPr>
-        <w:spacing w:before="280" w:after="160"/>
-        <w:ind w:firstLine="0"/>
+        <w:spacing w:after="0" w:line="360" w:lineRule="exact"/>
+        <w:ind w:firstLine="709"/>
       </w:pPr>
       <w:r>
         <w:rPr>
-          <w:rFonts w:ascii="Times New Roman" w:hAnsi="Times New Roman" w:cs="Times New Roman"/>
           <w:rFonts w:ascii="Times New Roman" w:hAnsi="Times New Roman"/>
-          <w:b/>
+          <w:b w:val="0"/>
           <w:sz w:val="28"/>
         </w:rPr>
-        <w:t>Слайд 7 — Геокодирование (50–60 секунд)</w:t>
+        <w:t>При загрузке данных использовались savepoint-ы для обработки конфликтов: иногда два объекта OpenAlex ссылались на один и тот же DOI. В итоге все 9 994 публикации были загружены без ошибок.</w:t>
       </w:r>
     </w:p>
     <w:p>
       <w:pPr>
-        <w:spacing w:before="0" w:after="120"/>
-        <w:ind w:firstLine="709"/>
-        <w:jc w:val="both"/>
+        <w:spacing w:before="120" w:after="120"/>
+      </w:pPr>
+    </w:p>
+    <w:p>
+      <w:pPr>
+        <w:spacing w:before="240" w:after="120"/>
       </w:pPr>
       <w:r>
         <w:rPr>
-          <w:rFonts w:ascii="Times New Roman" w:hAnsi="Times New Roman" w:cs="Times New Roman"/>
+          <w:rFonts w:ascii="Times New Roman" w:hAnsi="Times New Roman"/>
+          <w:b/>
+          <w:sz w:val="32"/>
+        </w:rPr>
+        <w:t>Слайд 9 — Географическая привязка (50–60 секунд)</w:t>
+      </w:r>
+    </w:p>
+    <w:p>
+      <w:pPr>
+        <w:spacing w:after="0" w:line="360" w:lineRule="exact"/>
+        <w:ind w:firstLine="709"/>
+      </w:pPr>
+      <w:r>
+        <w:rPr>
           <w:rFonts w:ascii="Times New Roman" w:hAnsi="Times New Roman"/>
           <w:b w:val="0"/>
           <w:sz w:val="28"/>
         </w:rPr>
-        <w:t>Геокодирование прошло в два этапа. На первом — для организаций с идентификатором OpenAlex координаты запрашивались батчами по 100 — покрытие 78%.</w:t>
+        <w:t>Геокодирование прошло в два этапа. На первом этапе для организаций с идентификатором OpenAlex координаты запрашивались через API учреждений батчами по 100 — это дало покрытие 78%.</w:t>
       </w:r>
     </w:p>
     <w:p>
       <w:pPr>
-        <w:spacing w:before="0" w:after="120"/>
+        <w:spacing w:after="0" w:line="360" w:lineRule="exact"/>
         <w:ind w:firstLine="709"/>
-        <w:jc w:val="both"/>
       </w:pPr>
       <w:r>
         <w:rPr>
-          <w:rFonts w:ascii="Times New Roman" w:hAnsi="Times New Roman" w:cs="Times New Roman"/>
           <w:rFonts w:ascii="Times New Roman" w:hAnsi="Times New Roman"/>
           <w:b w:val="0"/>
           <w:sz w:val="28"/>
         </w:rPr>
-        <w:t>Оставшиеся 22% — аффилиации без идентификатора. Для них использован геокодер Photon от Komoot со стратегией сокращения строки: полное название → три части через запятую → две части. Photon возвращает координаты в порядке longitude, latitude — при сохранении они переставляются. Итого: 80,8% публикаций получили географическую привязку.</w:t>
+        <w:t>Оставшиеся 22% — аффилиации, записанные только строкой названия без ссылки. Для них написан скрипт, который запрашивает геокодер Photon от Komoot. Скрипт применяет стратегию сокращения строки: сначала пробует полное название, потом последние три части через запятую, потом две — пока не получит результат. При этом важная деталь: Photon возвращает координаты в формате GeoJSON — порядок longitude, latitude, а не наоборот, поэтому при сохранении они переставляются.</w:t>
       </w:r>
     </w:p>
     <w:p>
       <w:pPr>
-        <w:spacing w:before="280" w:after="160"/>
-        <w:ind w:firstLine="0"/>
+        <w:spacing w:after="0" w:line="360" w:lineRule="exact"/>
+        <w:ind w:firstLine="709"/>
       </w:pPr>
       <w:r>
         <w:rPr>
-          <w:rFonts w:ascii="Times New Roman" w:hAnsi="Times New Roman" w:cs="Times New Roman"/>
           <w:rFonts w:ascii="Times New Roman" w:hAnsi="Times New Roman"/>
-          <w:b/>
+          <w:b w:val="0"/>
           <w:sz w:val="28"/>
         </w:rPr>
-        <w:t>Слайд 8 — Граф связей (50–60 секунд)</w:t>
+        <w:t>Обрабатываются в первую очередь те организации, которые разблокируют наибольшее число публикаций без координат. Итого: 80,8% публикаций получили географическую привязку.</w:t>
       </w:r>
     </w:p>
     <w:p>
       <w:pPr>
-        <w:spacing w:before="0" w:after="120"/>
-        <w:ind w:firstLine="709"/>
-        <w:jc w:val="both"/>
+        <w:spacing w:before="120" w:after="120"/>
+      </w:pPr>
+    </w:p>
+    <w:p>
+      <w:pPr>
+        <w:spacing w:before="240" w:after="120"/>
       </w:pPr>
       <w:r>
         <w:rPr>
-          <w:rFonts w:ascii="Times New Roman" w:hAnsi="Times New Roman" w:cs="Times New Roman"/>
+          <w:rFonts w:ascii="Times New Roman" w:hAnsi="Times New Roman"/>
+          <w:b/>
+          <w:sz w:val="32"/>
+        </w:rPr>
+        <w:t>Слайд 10 — Граф связей (50–60 секунд)</w:t>
+      </w:r>
+    </w:p>
+    <w:p>
+      <w:pPr>
+        <w:spacing w:after="0" w:line="360" w:lineRule="exact"/>
+        <w:ind w:firstLine="709"/>
+      </w:pPr>
+      <w:r>
+        <w:rPr>
           <w:rFonts w:ascii="Times New Roman" w:hAnsi="Times New Roman"/>
           <w:b w:val="0"/>
           <w:sz w:val="28"/>
         </w:rPr>
-        <w:t>Граф рисуется в браузере в SVG без внешних библиотек. Данные для него уже загружены — дополнительных запросов к серверу не требуется.</w:t>
+        <w:t>Граф рисуется в браузере в SVG без внешних библиотек. Данные для него уже загружены — дополнительных запросов к серверу не требуется. Из каждой статьи извлекаются год, журнал, авторы и аффилиации, из них строятся узлы и рёбра.</w:t>
       </w:r>
     </w:p>
     <w:p>
       <w:pPr>
-        <w:spacing w:before="0" w:after="120"/>
+        <w:spacing w:after="0" w:line="360" w:lineRule="exact"/>
         <w:ind w:firstLine="709"/>
-        <w:jc w:val="both"/>
       </w:pPr>
       <w:r>
         <w:rPr>
-          <w:rFonts w:ascii="Times New Roman" w:hAnsi="Times New Roman" w:cs="Times New Roman"/>
           <w:rFonts w:ascii="Times New Roman" w:hAnsi="Times New Roman"/>
           <w:b w:val="0"/>
           <w:sz w:val="28"/>
         </w:rPr>
-        <w:t>Используется колоночная раскладка: каждый тип сущности занимает свою вертикальную колонку. Рёбра — кривые Безье. Физической симуляции нет — граф предсказуем при любом числе узлов.</w:t>
+        <w:t>Для размещения узлов используется колоночная раскладка: каждый тип сущности занимает свою вертикальную колонку, узлы внутри распределяются равномерно. Рёбра — кривые Безье. Физической симуляции нет, что делает граф предсказуемым при любом числе узлов.</w:t>
       </w:r>
     </w:p>
     <w:p>
       <w:pPr>
-        <w:spacing w:before="0" w:after="120"/>
+        <w:spacing w:after="0" w:line="360" w:lineRule="exact"/>
         <w:ind w:firstLine="709"/>
-        <w:jc w:val="both"/>
       </w:pPr>
       <w:r>
         <w:rPr>
-          <w:rFonts w:ascii="Times New Roman" w:hAnsi="Times New Roman" w:cs="Times New Roman"/>
           <w:rFonts w:ascii="Times New Roman" w:hAnsi="Times New Roman"/>
           <w:b w:val="0"/>
           <w:sz w:val="28"/>
         </w:rPr>
-        <w:t>Доступно пять режимов: полный граф, годы и журналы, авторы, аффилиации, и режим похожих статей.</w:t>
+        <w:t>Доступно пять режимов отображения: полный граф со всеми типами связей, только годы и журналы, только авторы, только аффилиации, и режим похожих статей.</w:t>
       </w:r>
     </w:p>
     <w:p>
       <w:pPr>
-        <w:spacing w:before="280" w:after="160"/>
-        <w:ind w:firstLine="0"/>
+        <w:spacing w:before="120" w:after="120"/>
+      </w:pPr>
+    </w:p>
+    <w:p>
+      <w:pPr>
+        <w:spacing w:before="240" w:after="120"/>
       </w:pPr>
       <w:r>
         <w:rPr>
-          <w:rFonts w:ascii="Times New Roman" w:hAnsi="Times New Roman" w:cs="Times New Roman"/>
           <w:rFonts w:ascii="Times New Roman" w:hAnsi="Times New Roman"/>
           <w:b/>
-          <w:sz w:val="28"/>
+          <w:sz w:val="32"/>
         </w:rPr>
-        <w:t>Слайд 9 — Поиск похожих статей (50–60 секунд)</w:t>
+        <w:t>Слайд 11 — Поиск похожих статей (50–60 секунд)</w:t>
       </w:r>
     </w:p>
     <w:p>
       <w:pPr>
-        <w:spacing w:before="0" w:after="120"/>
+        <w:spacing w:after="0" w:line="360" w:lineRule="exact"/>
         <w:ind w:firstLine="709"/>
-        <w:jc w:val="both"/>
       </w:pPr>
       <w:r>
         <w:rPr>
-          <w:rFonts w:ascii="Times New Roman" w:hAnsi="Times New Roman" w:cs="Times New Roman"/>
           <w:rFonts w:ascii="Times New Roman" w:hAnsi="Times New Roman"/>
           <w:b w:val="0"/>
           <w:sz w:val="28"/>
         </w:rPr>
-        <w:t>При клике на статью система считает балл сходства для каждой публикации набора. Алгоритм учитывает пять признаков: общие авторы с весом 4, темы с весом 3, ключевые слова и аффилиации с весом 2, и плюс 2 за одинаковый журнал.</w:t>
+        <w:t>При клике на статью система перебирает все остальные публикации и считает балл сходства. Алгоритм учитывает пять признаков: общие авторы с весом 4, общие темы с весом 3, общие ключевые слова и аффилиации с весом 2, и плюс 2 за одинаковый журнал.</w:t>
       </w:r>
     </w:p>
     <w:p>
       <w:pPr>
-        <w:spacing w:before="0" w:after="120"/>
+        <w:spacing w:after="0" w:line="360" w:lineRule="exact"/>
         <w:ind w:firstLine="709"/>
-        <w:jc w:val="both"/>
       </w:pPr>
       <w:r>
         <w:rPr>
-          <w:rFonts w:ascii="Times New Roman" w:hAnsi="Times New Roman" w:cs="Times New Roman"/>
           <w:rFonts w:ascii="Times New Roman" w:hAnsi="Times New Roman"/>
           <w:b w:val="0"/>
           <w:sz w:val="28"/>
         </w:rPr>
-        <w:t>Авторы получили наибольший вес, потому что один исследователь работает в одной предметной области. Перед сравнением все строки приводятся к нижнему регистру.</w:t>
+        <w:t>Авторы получили наибольший вес, потому что один человек обычно работает в одной предметной области и его статьи содержательно связаны. Темы из OpenAlex — более широкие классификаторы, поэтому их вес выше, чем у ключевых слов.</w:t>
       </w:r>
     </w:p>
     <w:p>
       <w:pPr>
-        <w:spacing w:before="0" w:after="120"/>
+        <w:spacing w:after="0" w:line="360" w:lineRule="exact"/>
         <w:ind w:firstLine="709"/>
-        <w:jc w:val="both"/>
       </w:pPr>
       <w:r>
         <w:rPr>
-          <w:rFonts w:ascii="Times New Roman" w:hAnsi="Times New Roman" w:cs="Times New Roman"/>
           <w:rFonts w:ascii="Times New Roman" w:hAnsi="Times New Roman"/>
           <w:b w:val="0"/>
           <w:sz w:val="28"/>
         </w:rPr>
-        <w:t>Результат виден в правой панели как ранжированный список и в режиме графа «Похожие статьи» в виде рёбер.</w:t>
+        <w:t>Перед сравнением все строки приводятся к нижнему регистру — иначе «MIT» и «mit» считались бы разными значениями и совпадения терялись.</w:t>
       </w:r>
     </w:p>
     <w:p>
       <w:pPr>
-        <w:spacing w:before="280" w:after="160"/>
-        <w:ind w:firstLine="0"/>
+        <w:spacing w:after="0" w:line="360" w:lineRule="exact"/>
+        <w:ind w:firstLine="709"/>
       </w:pPr>
       <w:r>
         <w:rPr>
-          <w:rFonts w:ascii="Times New Roman" w:hAnsi="Times New Roman" w:cs="Times New Roman"/>
           <w:rFonts w:ascii="Times New Roman" w:hAnsi="Times New Roman"/>
-          <w:b/>
+          <w:b w:val="0"/>
           <w:sz w:val="28"/>
         </w:rPr>
-        <w:t>Слайд 10 — Интерфейс (40–50 секунд)</w:t>
+        <w:t>Результат виден в двух местах: в правой панели как ранжированный список с объяснением, и в режиме графа «Похожие статьи» в виде рёбер с подписями.</w:t>
       </w:r>
     </w:p>
     <w:p>
       <w:pPr>
-        <w:spacing w:before="0" w:after="120"/>
-        <w:ind w:firstLine="709"/>
-        <w:jc w:val="both"/>
+        <w:spacing w:before="120" w:after="120"/>
+      </w:pPr>
+    </w:p>
+    <w:p>
+      <w:pPr>
+        <w:spacing w:before="240" w:after="120"/>
       </w:pPr>
       <w:r>
         <w:rPr>
-          <w:rFonts w:ascii="Times New Roman" w:hAnsi="Times New Roman" w:cs="Times New Roman"/>
+          <w:rFonts w:ascii="Times New Roman" w:hAnsi="Times New Roman"/>
+          <w:b/>
+          <w:sz w:val="32"/>
+        </w:rPr>
+        <w:t>Слайд 12 — Веб-интерфейс (40–50 секунд)</w:t>
+      </w:r>
+    </w:p>
+    <w:p>
+      <w:pPr>
+        <w:spacing w:after="0" w:line="360" w:lineRule="exact"/>
+        <w:ind w:firstLine="709"/>
+      </w:pPr>
+      <w:r>
+        <w:rPr>
           <w:rFonts w:ascii="Times New Roman" w:hAnsi="Times New Roman"/>
           <w:b w:val="0"/>
           <w:sz w:val="28"/>
         </w:rPr>
-        <w:t>Интерфейс — одностраничное приложение с тремя колонками. Слева — фильтры и список статей. По центру — карта или граф. Справа — детали статьи и список похожих.</w:t>
+        <w:t>Интерфейс — одностраничное приложение с тремя колонками. Слева — фильтры и список статей. По центру — карта или граф. Справа — детали выбранной статьи и список похожих.</w:t>
       </w:r>
     </w:p>
     <w:p>
       <w:pPr>
-        <w:spacing w:before="0" w:after="120"/>
+        <w:spacing w:after="0" w:line="360" w:lineRule="exact"/>
         <w:ind w:firstLine="709"/>
-        <w:jc w:val="both"/>
       </w:pPr>
       <w:r>
         <w:rPr>
-          <w:rFonts w:ascii="Times New Roman" w:hAnsi="Times New Roman" w:cs="Times New Roman"/>
           <w:rFonts w:ascii="Times New Roman" w:hAnsi="Times New Roman"/>
           <w:b w:val="0"/>
           <w:sz w:val="28"/>
         </w:rPr>
-        <w:t>Фасетная фильтрация: при выборе значения в одном фильтре остальные показывают только допустимые варианты — пустые результаты исключены.</w:t>
+        <w:t>Фильтры работают в связке: при выборе значения в одном фильтре остальные показывают только те варианты, которые ещё возможны с учётом текущего выбора. Это фасетная фильтрация — она исключает ситуацию, когда комбинация фильтров не даёт ни одного результата.</w:t>
       </w:r>
     </w:p>
     <w:p>
       <w:pPr>
-        <w:spacing w:before="0" w:after="120"/>
+        <w:spacing w:after="0" w:line="360" w:lineRule="exact"/>
         <w:ind w:firstLine="709"/>
-        <w:jc w:val="both"/>
       </w:pPr>
       <w:r>
         <w:rPr>
-          <w:rFonts w:ascii="Times New Roman" w:hAnsi="Times New Roman" w:cs="Times New Roman"/>
           <w:rFonts w:ascii="Times New Roman" w:hAnsi="Times New Roman"/>
           <w:b w:val="0"/>
           <w:sz w:val="28"/>
         </w:rPr>
-        <w:t>Интерфейс поддерживает светлую и тёмную тему через CSS-переменные. Переключение сохраняется в localStorage.</w:t>
+        <w:t>Интерфейс поддерживает светлую и тёмную тему. Переключение сохраняется в localStorage, все цвета заданы через CSS-переменные — тема меняется мгновенно.</w:t>
       </w:r>
     </w:p>
     <w:p>
       <w:pPr>
-        <w:spacing w:before="280" w:after="160"/>
-        <w:ind w:firstLine="0"/>
+        <w:spacing w:before="120" w:after="120"/>
+      </w:pPr>
+    </w:p>
+    <w:p>
+      <w:pPr>
+        <w:spacing w:before="240" w:after="120"/>
       </w:pPr>
       <w:r>
         <w:rPr>
-          <w:rFonts w:ascii="Times New Roman" w:hAnsi="Times New Roman" w:cs="Times New Roman"/>
           <w:rFonts w:ascii="Times New Roman" w:hAnsi="Times New Roman"/>
           <w:b/>
-          <w:sz w:val="28"/>
+          <w:sz w:val="32"/>
         </w:rPr>
-        <w:t>Слайд 11 — Результаты (40–50 секунд)</w:t>
+        <w:t>Слайд 13 — Проблемы и решения (20–30 секунд)</w:t>
       </w:r>
     </w:p>
     <w:p>
       <w:pPr>
-        <w:spacing w:before="0" w:after="120"/>
+        <w:spacing w:after="0" w:line="360" w:lineRule="exact"/>
         <w:ind w:firstLine="709"/>
-        <w:jc w:val="both"/>
       </w:pPr>
       <w:r>
         <w:rPr>
-          <w:rFonts w:ascii="Times New Roman" w:hAnsi="Times New Roman" w:cs="Times New Roman"/>
           <w:rFonts w:ascii="Times New Roman" w:hAnsi="Times New Roman"/>
           <w:b w:val="0"/>
           <w:sz w:val="28"/>
         </w:rPr>
-        <w:t>Все поставленные критерии качества выполнены. Покрытие геокодирования — 80,8% при пороге 75%. Граф работает без зависания при 70 статьях. Фасетные фильтры исключают пустые результаты. Алгоритм использует пять признаков вместо минимальных трёх.</w:t>
+        <w:t>В ходе разработки возник ряд нетривиальных проблем. Файл данных весил 201 МБ — GitHub отклонял push. Решение: git filter-branch и .gitignore для бинарных данных. Nominatim заблокировал IP после нескольких запросов — заменён на Photon. Координаты в GeoJSON приходят в порядке longitude–latitude, а не latitude–longitude — при записи переставляются вручную.</w:t>
       </w:r>
     </w:p>
     <w:p>
       <w:pPr>
-        <w:spacing w:before="0" w:after="120"/>
-        <w:ind w:firstLine="709"/>
-        <w:jc w:val="both"/>
+        <w:spacing w:before="120" w:after="120"/>
+      </w:pPr>
+    </w:p>
+    <w:p>
+      <w:pPr>
+        <w:spacing w:before="240" w:after="120"/>
       </w:pPr>
       <w:r>
         <w:rPr>
-          <w:rFonts w:ascii="Times New Roman" w:hAnsi="Times New Roman" w:cs="Times New Roman"/>
+          <w:rFonts w:ascii="Times New Roman" w:hAnsi="Times New Roman"/>
+          <w:b/>
+          <w:sz w:val="32"/>
+        </w:rPr>
+        <w:t>Слайд 14 — Результаты (40–50 секунд)</w:t>
+      </w:r>
+    </w:p>
+    <w:p>
+      <w:pPr>
+        <w:spacing w:after="0" w:line="360" w:lineRule="exact"/>
+        <w:ind w:firstLine="709"/>
+      </w:pPr>
+      <w:r>
+        <w:rPr>
           <w:rFonts w:ascii="Times New Roman" w:hAnsi="Times New Roman"/>
           <w:b w:val="0"/>
           <w:sz w:val="28"/>
         </w:rPr>
-        <w:t>Загружено 9 994 публикации, создана база из 7 таблиц, реализован граф с пятью режимами и алгоритм поиска похожих статей.</w:t>
+        <w:t>Подводя итог — все поставленные задачи выполнены и критерии качества достигнуты. Загружено 9 994 публикации из OpenAlex. Создана реляционная база данных из 7 таблиц. Покрытие геокодирования составило 80,8% при пороге 75%. Реализован граф с пятью режимами отображения. Разработан алгоритм поиска похожих статей по пяти независимым признакам.</w:t>
       </w:r>
     </w:p>
     <w:p>
       <w:pPr>
-        <w:spacing w:before="0" w:after="120"/>
+        <w:spacing w:after="0" w:line="360" w:lineRule="exact"/>
         <w:ind w:firstLine="709"/>
-        <w:jc w:val="both"/>
       </w:pPr>
       <w:r>
         <w:rPr>
-          <w:rFonts w:ascii="Times New Roman" w:hAnsi="Times New Roman" w:cs="Times New Roman"/>
           <w:rFonts w:ascii="Times New Roman" w:hAnsi="Times New Roman"/>
           <w:b w:val="0"/>
           <w:sz w:val="28"/>
         </w:rPr>
-        <w:t>В отличие от рассмотренных аналогов, система сочетает карту, граф, фильтрацию и поиск похожих в единой браузерной среде без установки стороннего ПО.</w:t>
+        <w:t>Система переводит плоский список статей в два визуальных представления — карту с географией исследований и граф с авторскими и тематическими связями. В отличие от рассмотренных аналогов, она сочетает все эти возможности в одной браузерной среде без установки стороннего ПО.</w:t>
       </w:r>
     </w:p>
     <w:p>
       <w:pPr>
-        <w:spacing w:before="0" w:after="120"/>
+        <w:spacing w:after="0" w:line="360" w:lineRule="exact"/>
         <w:ind w:firstLine="709"/>
-        <w:jc w:val="both"/>
       </w:pPr>
       <w:r>
         <w:rPr>
-          <w:rFonts w:ascii="Times New Roman" w:hAnsi="Times New Roman" w:cs="Times New Roman"/>
           <w:rFonts w:ascii="Times New Roman" w:hAnsi="Times New Roman"/>
           <w:b w:val="0"/>
           <w:sz w:val="28"/>
@@ -1410,13 +1431,15 @@
     </w:p>
     <w:p>
       <w:pPr>
-        <w:spacing w:before="280" w:after="160"/>
-        <w:ind w:firstLine="0"/>
-        <w:jc w:val="center"/>
+        <w:spacing w:before="120" w:after="120"/>
+      </w:pPr>
+    </w:p>
+    <w:p>
+      <w:pPr>
+        <w:spacing w:before="240" w:after="120"/>
       </w:pPr>
       <w:r>
         <w:rPr>
-          <w:rFonts w:ascii="Times New Roman" w:hAnsi="Times New Roman" w:cs="Times New Roman"/>
           <w:rFonts w:ascii="Times New Roman" w:hAnsi="Times New Roman"/>
           <w:b/>
           <w:sz w:val="32"/>
@@ -1427,11 +1450,9 @@
     <w:p>
       <w:pPr>
         <w:spacing w:before="160" w:after="40"/>
-        <w:ind w:firstLine="0"/>
       </w:pPr>
       <w:r>
         <w:rPr>
-          <w:rFonts w:ascii="Times New Roman" w:hAnsi="Times New Roman" w:cs="Times New Roman"/>
           <w:rFonts w:ascii="Times New Roman" w:hAnsi="Times New Roman"/>
           <w:b/>
           <w:sz w:val="28"/>
@@ -1441,28 +1462,24 @@
     </w:p>
     <w:p>
       <w:pPr>
-        <w:spacing w:before="0" w:after="160"/>
+        <w:spacing w:after="0" w:line="360" w:lineRule="exact"/>
         <w:ind w:firstLine="709"/>
-        <w:jc w:val="both"/>
       </w:pPr>
       <w:r>
         <w:rPr>
-          <w:rFonts w:ascii="Times New Roman" w:hAnsi="Times New Roman" w:cs="Times New Roman"/>
           <w:rFonts w:ascii="Times New Roman" w:hAnsi="Times New Roman"/>
           <w:b w:val="0"/>
           <w:sz w:val="28"/>
         </w:rPr>
-        <w:t>Между сущностями чёткие реляционные связи: один журнал — много статей, одна статья — много авторов. PostgreSQL поддерживает сложные JOIN-запросы для фильтрации. SQLite ограничен по параллельным запросам. MongoDB не даёт преимуществ при структурированных реляционных данных.</w:t>
+        <w:t>Между сущностями чёткие реляционные связи: один журнал — много статей, одна статья — много авторов. PostgreSQL хорошо работает с такими структурами и поддерживает сложные JOIN-запросы, которые нужны для фильтрации. SQLite не подходит из-за ограниченной поддержки параллельных запросов. MongoDB отклонён — документо-ориентированная модель не даёт преимуществ при структурированных реляционных данных.</w:t>
       </w:r>
     </w:p>
     <w:p>
       <w:pPr>
         <w:spacing w:before="160" w:after="40"/>
-        <w:ind w:firstLine="0"/>
       </w:pPr>
       <w:r>
         <w:rPr>
-          <w:rFonts w:ascii="Times New Roman" w:hAnsi="Times New Roman" w:cs="Times New Roman"/>
           <w:rFonts w:ascii="Times New Roman" w:hAnsi="Times New Roman"/>
           <w:b/>
           <w:sz w:val="28"/>
@@ -1472,28 +1489,24 @@
     </w:p>
     <w:p>
       <w:pPr>
-        <w:spacing w:before="0" w:after="160"/>
+        <w:spacing w:after="0" w:line="360" w:lineRule="exact"/>
         <w:ind w:firstLine="709"/>
-        <w:jc w:val="both"/>
       </w:pPr>
       <w:r>
         <w:rPr>
-          <w:rFonts w:ascii="Times New Roman" w:hAnsi="Times New Roman" w:cs="Times New Roman"/>
           <w:rFonts w:ascii="Times New Roman" w:hAnsi="Times New Roman"/>
           <w:b w:val="0"/>
           <w:sz w:val="28"/>
         </w:rPr>
-        <w:t>Стандартные физические симуляции (force-directed layout) при 70+ узлах дают хаотичное расположение. Колоночная раскладка предсказуема и читаема при любом числе узлов.</w:t>
+        <w:t>Колоночная раскладка реализована вручную именно потому, что стандартные физические симуляции (force-directed layout) при 70+ узлах дают хаотичное расположение. Колонки предсказуемы и читаемы при любом числе узлов.</w:t>
       </w:r>
     </w:p>
     <w:p>
       <w:pPr>
         <w:spacing w:before="160" w:after="40"/>
-        <w:ind w:firstLine="0"/>
       </w:pPr>
       <w:r>
         <w:rPr>
-          <w:rFonts w:ascii="Times New Roman" w:hAnsi="Times New Roman" w:cs="Times New Roman"/>
           <w:rFonts w:ascii="Times New Roman" w:hAnsi="Times New Roman"/>
           <w:b/>
           <w:sz w:val="28"/>
@@ -1503,28 +1516,24 @@
     </w:p>
     <w:p>
       <w:pPr>
-        <w:spacing w:before="0" w:after="160"/>
+        <w:spacing w:after="0" w:line="360" w:lineRule="exact"/>
         <w:ind w:firstLine="709"/>
-        <w:jc w:val="both"/>
       </w:pPr>
       <w:r>
         <w:rPr>
-          <w:rFonts w:ascii="Times New Roman" w:hAnsi="Times New Roman" w:cs="Times New Roman"/>
           <w:rFonts w:ascii="Times New Roman" w:hAnsi="Times New Roman"/>
           <w:b w:val="0"/>
           <w:sz w:val="28"/>
         </w:rPr>
-        <w:t>Connected Papers строит граф вокруг одной статьи на основе цитирований и ограничен 5 графами в месяц бесплатно. Разработанная система работает с набором из 10 000 статей, имеет географическую карту, фасетные фильтры и вычисляет сходство по пяти структурным признакам. Полностью бесплатна.</w:t>
+        <w:t>Connected Papers строит граф похожих статей на основе цитирований вокруг одной выбранной публикации. Разработанная система работает с целым набором из 10 000 статей одновременно, имеет географическую карту, фасетные фильтры и вычисляет сходство по пяти признакам — авторам, темам, ключевым словам, аффилиациям и журналу. Кроме того, Connected Papers предоставляет лишь 5 графов в месяц бесплатно, наша система полностью бесплатна.</w:t>
       </w:r>
     </w:p>
     <w:p>
       <w:pPr>
         <w:spacing w:before="160" w:after="40"/>
-        <w:ind w:firstLine="0"/>
       </w:pPr>
       <w:r>
         <w:rPr>
-          <w:rFonts w:ascii="Times New Roman" w:hAnsi="Times New Roman" w:cs="Times New Roman"/>
           <w:rFonts w:ascii="Times New Roman" w:hAnsi="Times New Roman"/>
           <w:b/>
           <w:sz w:val="28"/>
@@ -1534,28 +1543,24 @@
     </w:p>
     <w:p>
       <w:pPr>
-        <w:spacing w:before="0" w:after="160"/>
+        <w:spacing w:after="0" w:line="360" w:lineRule="exact"/>
         <w:ind w:firstLine="709"/>
-        <w:jc w:val="both"/>
       </w:pPr>
       <w:r>
         <w:rPr>
-          <w:rFonts w:ascii="Times New Roman" w:hAnsi="Times New Roman" w:cs="Times New Roman"/>
           <w:rFonts w:ascii="Times New Roman" w:hAnsi="Times New Roman"/>
           <w:b w:val="0"/>
           <w:sz w:val="28"/>
         </w:rPr>
-        <w:t>Часть аффилиаций записана как произвольные строки без географической привязки — например, «Department of Physics». Геокодер возвращает результат только если строка содержит название места. 19,2% публикаций не удалось геокодировать по этой причине.</w:t>
+        <w:t>Часть аффилиаций записана в OpenAlex как произвольные строки без географической привязки — например, просто «Department of Physics». Геокодер возвращает координаты только если строка содержит что-то похожее на название места. 19,2% публикаций не удалось геокодировать по этой причине.</w:t>
       </w:r>
     </w:p>
     <w:p>
       <w:pPr>
         <w:spacing w:before="160" w:after="40"/>
-        <w:ind w:firstLine="0"/>
       </w:pPr>
       <w:r>
         <w:rPr>
-          <w:rFonts w:ascii="Times New Roman" w:hAnsi="Times New Roman" w:cs="Times New Roman"/>
           <w:rFonts w:ascii="Times New Roman" w:hAnsi="Times New Roman"/>
           <w:b/>
           <w:sz w:val="28"/>
@@ -1565,28 +1570,24 @@
     </w:p>
     <w:p>
       <w:pPr>
-        <w:spacing w:before="0" w:after="160"/>
+        <w:spacing w:after="0" w:line="360" w:lineRule="exact"/>
         <w:ind w:firstLine="709"/>
-        <w:jc w:val="both"/>
       </w:pPr>
       <w:r>
         <w:rPr>
-          <w:rFonts w:ascii="Times New Roman" w:hAnsi="Times New Roman" w:cs="Times New Roman"/>
           <w:rFonts w:ascii="Times New Roman" w:hAnsi="Times New Roman"/>
           <w:b w:val="0"/>
           <w:sz w:val="28"/>
         </w:rPr>
-        <w:t>Граф ограничен 70 статьями — для читаемости. Фильтры сужают выборку. Карта работает с полным набором через requestAnimationFrame. При необходимости масштабирования свыше 10 000 публикаций потребуется серверный рендеринг графа.</w:t>
+        <w:t>Граф ограничен 70 статьями одновременно — для читаемости. Фильтры позволяют сузить выборку. Карта и список работают с полным набором через пагинацию и requestAnimationFrame. При необходимости масштабирования свыше 10 000 публикаций потребуется переход на серверный рендеринг графа.</w:t>
       </w:r>
     </w:p>
     <w:p>
       <w:pPr>
         <w:spacing w:before="160" w:after="40"/>
-        <w:ind w:firstLine="0"/>
       </w:pPr>
       <w:r>
         <w:rPr>
-          <w:rFonts w:ascii="Times New Roman" w:hAnsi="Times New Roman" w:cs="Times New Roman"/>
           <w:rFonts w:ascii="Times New Roman" w:hAnsi="Times New Roman"/>
           <w:b/>
           <w:sz w:val="28"/>
@@ -1596,28 +1597,24 @@
     </w:p>
     <w:p>
       <w:pPr>
-        <w:spacing w:before="0" w:after="160"/>
+        <w:spacing w:after="0" w:line="360" w:lineRule="exact"/>
         <w:ind w:firstLine="709"/>
-        <w:jc w:val="both"/>
       </w:pPr>
       <w:r>
         <w:rPr>
-          <w:rFonts w:ascii="Times New Roman" w:hAnsi="Times New Roman" w:cs="Times New Roman"/>
           <w:rFonts w:ascii="Times New Roman" w:hAnsi="Times New Roman"/>
           <w:b w:val="0"/>
           <w:sz w:val="28"/>
         </w:rPr>
-        <w:t>OpenAlex предоставляет бесплатный доступ без регистрации, полные метаданные с аффилиациями и идентификаторами организаций, cursor pagination и эндпоинт /institutions для пакетного запроса координат — ключевой для геокодирования.</w:t>
+        <w:t>OpenAlex предоставляет бесплатный доступ без регистрации, полные метаданные включая аффилиации с идентификаторами, cursor pagination для надёжной выгрузки больших наборов и отдельный эндпоинт /institutions для пакетного запроса координат организаций — это ключевое для геокодирования.</w:t>
       </w:r>
     </w:p>
     <w:p>
       <w:pPr>
         <w:spacing w:before="160" w:after="40"/>
-        <w:ind w:firstLine="0"/>
       </w:pPr>
       <w:r>
         <w:rPr>
-          <w:rFonts w:ascii="Times New Roman" w:hAnsi="Times New Roman" w:cs="Times New Roman"/>
           <w:rFonts w:ascii="Times New Roman" w:hAnsi="Times New Roman"/>
           <w:b/>
           <w:sz w:val="28"/>
@@ -1627,18 +1624,43 @@
     </w:p>
     <w:p>
       <w:pPr>
-        <w:spacing w:before="0" w:after="160"/>
+        <w:spacing w:after="0" w:line="360" w:lineRule="exact"/>
         <w:ind w:firstLine="709"/>
-        <w:jc w:val="both"/>
       </w:pPr>
       <w:r>
         <w:rPr>
-          <w:rFonts w:ascii="Times New Roman" w:hAnsi="Times New Roman" w:cs="Times New Roman"/>
           <w:rFonts w:ascii="Times New Roman" w:hAnsi="Times New Roman"/>
           <w:b w:val="0"/>
           <w:sz w:val="28"/>
         </w:rPr>
-        <w:t>Алгоритм основан на структурных признаках метаданных, не на семантическом анализе текста. Это обеспечивает высокую скорость вычисления в браузере без внешних запросов, но ограничивает точность для статей из разных областей с общими авторами. Веса подобраны эмпирически на основе информативности каждого признака.</w:t>
+        <w:t>Алгоритм основан на структурных признаках метаданных, а не на семантическом анализе текста. Это означает высокую скорость вычисления в браузере без внешних запросов, но ограниченную точность для статей из разных областей с общими авторами. Веса подобраны эмпирически: авторский признак наиболее информативен, так как один исследователь работает в одной предметной области.</w:t>
+      </w:r>
+    </w:p>
+    <w:p>
+      <w:pPr>
+        <w:spacing w:before="160" w:after="40"/>
+      </w:pPr>
+      <w:r>
+        <w:rPr>
+          <w:rFonts w:ascii="Times New Roman" w:hAnsi="Times New Roman"/>
+          <w:b/>
+          <w:sz w:val="28"/>
+        </w:rPr>
+        <w:t>— Что нового по сравнению с аналогами на 2025 год (ResearchRabbit, Inciteful, Litmaps)?</w:t>
+      </w:r>
+    </w:p>
+    <w:p>
+      <w:pPr>
+        <w:spacing w:after="0" w:line="360" w:lineRule="exact"/>
+        <w:ind w:firstLine="709"/>
+      </w:pPr>
+      <w:r>
+        <w:rPr>
+          <w:rFonts w:ascii="Times New Roman" w:hAnsi="Times New Roman"/>
+          <w:b w:val="0"/>
+          <w:sz w:val="28"/>
+        </w:rPr>
+        <w:t>Все три сервиса работают с одной или несколькими стартовыми статьями и строят граф через цитирования. Разработанная система работает с предварительно загруженным набором из 9 994 публикаций, показывает их географию на карте и позволяет фильтровать по году, журналу, автору и аффилиации. Это принципиально иной сценарий использования — не «найти похожее к одной статье», а «исследовать тематический и географический ландшафт заданной предметной области».</w:t>
       </w:r>
     </w:p>
     <w:sectPr>
@@ -2014,6 +2036,10 @@
     <w:name w:val="Normal"/>
     <w:qFormat/>
     <w:rsid w:val="00FC693F"/>
+    <w:rPr>
+      <w:rFonts w:ascii="Times New Roman" w:hAnsi="Times New Roman"/>
+      <w:sz w:val="28"/>
+    </w:rPr>
   </w:style>
   <w:style w:type="paragraph" w:styleId="Header">
     <w:name w:val="header"/>

</xml_diff>

<commit_message>
fix(presentation+docs): apply reviewer feedback (Варвара)
Presentation (14 slides):
- Removed slide "Анализ публикационной активности"
- Removed "Оптимизация производительности" section from Architecture slide
- Added slide numbers (N/total) to all slides
- Added new slide 8: ER-diagram with 7 tables and their relationships
- Added "режим отображения" explanation to Graph slide

Defense speech:
- Renumbered all slides to match new order
- Added Slide 8 (ER-diagram) speech section
- Added "режим отображения" to glossary
- Added "ER-диаграмма" to glossary
- Added FAQ: "Что такое режим отображения?"
- Updated docx
</commit_message>
<xml_diff>
--- a/docs/текст для защиты.docx
+++ b/docs/текст для защиты.docx
@@ -671,11 +671,71 @@
           </w:p>
         </w:tc>
       </w:tr>
+      <w:tr>
+        <w:tc>
+          <w:tcPr>
+            <w:tcW w:type="dxa" w:w="4844"/>
+          </w:tcPr>
+          <w:p>
+            <w:r>
+              <w:rPr>
+                <w:rFonts w:ascii="Times New Roman" w:hAnsi="Times New Roman"/>
+                <w:sz w:val="22"/>
+              </w:rPr>
+              <w:t>Режим отображения</w:t>
+            </w:r>
+          </w:p>
+        </w:tc>
+        <w:tc>
+          <w:tcPr>
+            <w:tcW w:type="dxa" w:w="4844"/>
+          </w:tcPr>
+          <w:p>
+            <w:r>
+              <w:rPr>
+                <w:rFonts w:ascii="Times New Roman" w:hAnsi="Times New Roman"/>
+                <w:sz w:val="22"/>
+              </w:rPr>
+              <w:t>Настройка типов узлов и связей, одновременно видимых на графе; каждый режим показывает определённый «срез» данных</w:t>
+            </w:r>
+          </w:p>
+        </w:tc>
+      </w:tr>
+      <w:tr>
+        <w:tc>
+          <w:tcPr>
+            <w:tcW w:type="dxa" w:w="4844"/>
+          </w:tcPr>
+          <w:p>
+            <w:r>
+              <w:rPr>
+                <w:rFonts w:ascii="Times New Roman" w:hAnsi="Times New Roman"/>
+                <w:sz w:val="22"/>
+              </w:rPr>
+              <w:t>ER-диаграмма</w:t>
+            </w:r>
+          </w:p>
+        </w:tc>
+        <w:tc>
+          <w:tcPr>
+            <w:tcW w:type="dxa" w:w="4844"/>
+          </w:tcPr>
+          <w:p>
+            <w:r>
+              <w:rPr>
+                <w:rFonts w:ascii="Times New Roman" w:hAnsi="Times New Roman"/>
+                <w:sz w:val="22"/>
+              </w:rPr>
+              <w:t>Схема сущностей и связей базы данных: таблицы изображаются прямоугольниками, связи — линиями с кардинальностью (1:N, N:M)</w:t>
+            </w:r>
+          </w:p>
+        </w:tc>
+      </w:tr>
     </w:tbl>
     <w:p/>
     <w:p>
       <w:pPr>
-        <w:spacing w:before="120" w:after="120"/>
+        <w:spacing w:before="80" w:after="80"/>
       </w:pPr>
     </w:p>
     <w:p>
@@ -707,7 +767,7 @@
     </w:p>
     <w:p>
       <w:pPr>
-        <w:spacing w:before="120" w:after="120"/>
+        <w:spacing w:before="80" w:after="80"/>
       </w:pPr>
     </w:p>
     <w:p>
@@ -753,7 +813,7 @@
     </w:p>
     <w:p>
       <w:pPr>
-        <w:spacing w:before="120" w:after="120"/>
+        <w:spacing w:before="80" w:after="80"/>
       </w:pPr>
     </w:p>
     <w:p>
@@ -785,7 +845,7 @@
     </w:p>
     <w:p>
       <w:pPr>
-        <w:spacing w:before="120" w:after="120"/>
+        <w:spacing w:before="80" w:after="80"/>
       </w:pPr>
     </w:p>
     <w:p>
@@ -859,7 +919,7 @@
     </w:p>
     <w:p>
       <w:pPr>
-        <w:spacing w:before="120" w:after="120"/>
+        <w:spacing w:before="80" w:after="80"/>
       </w:pPr>
     </w:p>
     <w:p>
@@ -919,7 +979,7 @@
     </w:p>
     <w:p>
       <w:pPr>
-        <w:spacing w:before="120" w:after="120"/>
+        <w:spacing w:before="80" w:after="80"/>
       </w:pPr>
     </w:p>
     <w:p>
@@ -932,53 +992,7 @@
           <w:b/>
           <w:sz w:val="32"/>
         </w:rPr>
-        <w:t>Слайд 6 — Анализ публикационной активности (40–50 секунд)</w:t>
-      </w:r>
-    </w:p>
-    <w:p>
-      <w:pPr>
-        <w:spacing w:after="0" w:line="360" w:lineRule="exact"/>
-        <w:ind w:firstLine="709"/>
-      </w:pPr>
-      <w:r>
-        <w:rPr>
-          <w:rFonts w:ascii="Times New Roman" w:hAnsi="Times New Roman"/>
-          <w:b w:val="0"/>
-          <w:sz w:val="28"/>
-        </w:rPr>
-        <w:t>На основе загруженных данных был проведён библиометрический анализ. В базе 444 уникальных журнала и 2 594 тематических записи. Журналы разделены на четыре типа: монотематические, профильные, мультидисциплинарные и обзорные.</w:t>
-      </w:r>
-    </w:p>
-    <w:p>
-      <w:pPr>
-        <w:spacing w:after="0" w:line="360" w:lineRule="exact"/>
-        <w:ind w:firstLine="709"/>
-      </w:pPr>
-      <w:r>
-        <w:rPr>
-          <w:rFonts w:ascii="Times New Roman" w:hAnsi="Times New Roman"/>
-          <w:b w:val="0"/>
-          <w:sz w:val="28"/>
-        </w:rPr>
-        <w:t>Анализ тематических трендов показал, что нейронные сети и COVID-исследования возникли как новые темы после 2013 года, тогда как химическая физика и исследования графена полностью исчезли из публикаций. Это подтверждает, что тематический ландшафт науки меняется, и именно такие сдвиги система позволяет увидеть визуально.</w:t>
-      </w:r>
-    </w:p>
-    <w:p>
-      <w:pPr>
-        <w:spacing w:before="120" w:after="120"/>
-      </w:pPr>
-    </w:p>
-    <w:p>
-      <w:pPr>
-        <w:spacing w:before="240" w:after="120"/>
-      </w:pPr>
-      <w:r>
-        <w:rPr>
-          <w:rFonts w:ascii="Times New Roman" w:hAnsi="Times New Roman"/>
-          <w:b/>
-          <w:sz w:val="32"/>
-        </w:rPr>
-        <w:t>Слайд 7 — Архитектура системы (50–60 секунд)</w:t>
+        <w:t>Слайд 6 — Архитектура системы (50–60 секунд)</w:t>
       </w:r>
     </w:p>
     <w:p>
@@ -1011,21 +1025,7 @@
     </w:p>
     <w:p>
       <w:pPr>
-        <w:spacing w:after="0" w:line="360" w:lineRule="exact"/>
-        <w:ind w:firstLine="709"/>
-      </w:pPr>
-      <w:r>
-        <w:rPr>
-          <w:rFonts w:ascii="Times New Roman" w:hAnsi="Times New Roman"/>
-          <w:b w:val="0"/>
-          <w:sz w:val="28"/>
-        </w:rPr>
-        <w:t>Для производительности: карта и граф рендерятся через requestAnimationFrame, ответы сжимаются gzip, JSON читается потоково через ijson.</w:t>
-      </w:r>
-    </w:p>
-    <w:p>
-      <w:pPr>
-        <w:spacing w:before="120" w:after="120"/>
+        <w:spacing w:before="80" w:after="80"/>
       </w:pPr>
     </w:p>
     <w:p>
@@ -1038,7 +1038,7 @@
           <w:b/>
           <w:sz w:val="32"/>
         </w:rPr>
-        <w:t>Слайд 8 — База данных (40–50 секунд)</w:t>
+        <w:t>Слайд 7 — База данных (40–50 секунд)</w:t>
       </w:r>
     </w:p>
     <w:p>
@@ -1085,7 +1085,39 @@
     </w:p>
     <w:p>
       <w:pPr>
-        <w:spacing w:before="120" w:after="120"/>
+        <w:spacing w:before="80" w:after="80"/>
+      </w:pPr>
+    </w:p>
+    <w:p>
+      <w:pPr>
+        <w:spacing w:before="240" w:after="120"/>
+      </w:pPr>
+      <w:r>
+        <w:rPr>
+          <w:rFonts w:ascii="Times New Roman" w:hAnsi="Times New Roman"/>
+          <w:b/>
+          <w:sz w:val="32"/>
+        </w:rPr>
+        <w:t>Слайд 8 — ER-диаграмма базы данных (20–30 секунд)</w:t>
+      </w:r>
+    </w:p>
+    <w:p>
+      <w:pPr>
+        <w:spacing w:after="0" w:line="360" w:lineRule="exact"/>
+        <w:ind w:firstLine="709"/>
+      </w:pPr>
+      <w:r>
+        <w:rPr>
+          <w:rFonts w:ascii="Times New Roman" w:hAnsi="Times New Roman"/>
+          <w:b w:val="0"/>
+          <w:sz w:val="28"/>
+        </w:rPr>
+        <w:t>На диаграмме показаны связи между таблицами. Журналы связаны с публикациями отношением «один ко многим». Публикации связаны с авторами через таблицу publication_authors — это классическое отношение «многие ко многим». Отдельно хранятся тематические классификаторы и ключевые слова — они также привязаны к публикациям. Аффилиации организаций хранятся вместе с координатами и связаны с авторами.</w:t>
+      </w:r>
+    </w:p>
+    <w:p>
+      <w:pPr>
+        <w:spacing w:before="80" w:after="80"/>
       </w:pPr>
     </w:p>
     <w:p>
@@ -1145,7 +1177,7 @@
     </w:p>
     <w:p>
       <w:pPr>
-        <w:spacing w:before="120" w:after="120"/>
+        <w:spacing w:before="80" w:after="80"/>
       </w:pPr>
     </w:p>
     <w:p>
@@ -1200,12 +1232,12 @@
           <w:b w:val="0"/>
           <w:sz w:val="28"/>
         </w:rPr>
-        <w:t>Доступно пять режимов отображения: полный граф со всеми типами связей, только годы и журналы, только авторы, только аффилиации, и режим похожих статей.</w:t>
+        <w:t>Доступно пять режимов отображения. Режим отображения — это настройка того, какие именно типы узлов и связей видны на графе одновременно. Например, полный граф показывает все связи: год → журнал → статья → автор → аффилиация. Режим «Авторы» убирает годы и журналы и оставляет только связи статья–автор. Режим «Похожие статьи» соединяет статьи с высоким баллом сходства.</w:t>
       </w:r>
     </w:p>
     <w:p>
       <w:pPr>
-        <w:spacing w:before="120" w:after="120"/>
+        <w:spacing w:before="80" w:after="80"/>
       </w:pPr>
     </w:p>
     <w:p>
@@ -1279,7 +1311,7 @@
     </w:p>
     <w:p>
       <w:pPr>
-        <w:spacing w:before="120" w:after="120"/>
+        <w:spacing w:before="80" w:after="80"/>
       </w:pPr>
     </w:p>
     <w:p>
@@ -1339,7 +1371,7 @@
     </w:p>
     <w:p>
       <w:pPr>
-        <w:spacing w:before="120" w:after="120"/>
+        <w:spacing w:before="80" w:after="80"/>
       </w:pPr>
     </w:p>
     <w:p>
@@ -1371,7 +1403,7 @@
     </w:p>
     <w:p>
       <w:pPr>
-        <w:spacing w:before="120" w:after="120"/>
+        <w:spacing w:before="80" w:after="80"/>
       </w:pPr>
     </w:p>
     <w:p>
@@ -1431,7 +1463,7 @@
     </w:p>
     <w:p>
       <w:pPr>
-        <w:spacing w:before="120" w:after="120"/>
+        <w:spacing w:before="80" w:after="80"/>
       </w:pPr>
     </w:p>
     <w:p>
@@ -1661,6 +1693,33 @@
           <w:sz w:val="28"/>
         </w:rPr>
         <w:t>Все три сервиса работают с одной или несколькими стартовыми статьями и строят граф через цитирования. Разработанная система работает с предварительно загруженным набором из 9 994 публикаций, показывает их географию на карте и позволяет фильтровать по году, журналу, автору и аффилиации. Это принципиально иной сценарий использования — не «найти похожее к одной статье», а «исследовать тематический и географический ландшафт заданной предметной области».</w:t>
+      </w:r>
+    </w:p>
+    <w:p>
+      <w:pPr>
+        <w:spacing w:before="160" w:after="40"/>
+      </w:pPr>
+      <w:r>
+        <w:rPr>
+          <w:rFonts w:ascii="Times New Roman" w:hAnsi="Times New Roman"/>
+          <w:b/>
+          <w:sz w:val="28"/>
+        </w:rPr>
+        <w:t>— Что такое режим отображения в графе?</w:t>
+      </w:r>
+    </w:p>
+    <w:p>
+      <w:pPr>
+        <w:spacing w:after="0" w:line="360" w:lineRule="exact"/>
+        <w:ind w:firstLine="709"/>
+      </w:pPr>
+      <w:r>
+        <w:rPr>
+          <w:rFonts w:ascii="Times New Roman" w:hAnsi="Times New Roman"/>
+          <w:b w:val="0"/>
+          <w:sz w:val="28"/>
+        </w:rPr>
+        <w:t>Режим отображения — настройка типов узлов и связей, которые видны на графе одновременно. Всего пять режимов: полный граф (все типы), годы и журналы, только авторы, только аффилиации и похожие статьи. Это сделано для читаемости: при всех узлах одновременно граф перегружен. Переключение мгновенное — данные уже в браузере.</w:t>
       </w:r>
     </w:p>
     <w:sectPr>

</xml_diff>

<commit_message>
docs: add slide 4 speech + renumber all subsequent slides
New section: «Слайд 4 — Почему публикации после 2020 хуже представлены в базах?»
Four factors: 2022 sanctions, OpenAlex indexing lag, migration to РИНЦ, affiliation fragmentation.
Renumbered slides 5–15 throughout the defense text.

https://claude.ai/code/session_01JXZNXE9oVEv7rsUiTvXR5D
</commit_message>
<xml_diff>
--- a/docs/текст для защиты.docx
+++ b/docs/текст для защиты.docx
@@ -858,7 +858,95 @@
           <w:b/>
           <w:sz w:val="32"/>
         </w:rPr>
-        <w:t>Слайд 4 — Цель и задачи (50–60 секунд)</w:t>
+        <w:t>Слайд 4 — Почему публикации после 2020 хуже представлены в базах? (30–40 секунд)</w:t>
+      </w:r>
+    </w:p>
+    <w:p>
+      <w:pPr>
+        <w:spacing w:after="0" w:line="360" w:lineRule="exact"/>
+        <w:ind w:firstLine="709"/>
+      </w:pPr>
+      <w:r>
+        <w:rPr>
+          <w:rFonts w:ascii="Times New Roman" w:hAnsi="Times New Roman"/>
+          <w:b w:val="0"/>
+          <w:sz w:val="28"/>
+        </w:rPr>
+        <w:t>Спад на предыдущем графике требует объяснения — это не падение науки, а совокупность четырёх факторов.</w:t>
+      </w:r>
+    </w:p>
+    <w:p>
+      <w:pPr>
+        <w:spacing w:after="0" w:line="360" w:lineRule="exact"/>
+        <w:ind w:firstLine="709"/>
+      </w:pPr>
+      <w:r>
+        <w:rPr>
+          <w:rFonts w:ascii="Times New Roman" w:hAnsi="Times New Roman"/>
+          <w:b w:val="0"/>
+          <w:sz w:val="28"/>
+        </w:rPr>
+        <w:t>Первый — санкции 2022 года: Scopus и Web of Science приостановили индексацию российских журналов, около пятисот изданий было удалено из Scopus.</w:t>
+      </w:r>
+    </w:p>
+    <w:p>
+      <w:pPr>
+        <w:spacing w:after="0" w:line="360" w:lineRule="exact"/>
+        <w:ind w:firstLine="709"/>
+      </w:pPr>
+      <w:r>
+        <w:rPr>
+          <w:rFonts w:ascii="Times New Roman" w:hAnsi="Times New Roman"/>
+          <w:b w:val="0"/>
+          <w:sz w:val="28"/>
+        </w:rPr>
+        <w:t>Второй — задержка индексации OpenAlex: новые статьи попадают в каталог через шесть-восемнадцать месяцев после публикации, поэтому данные за 2023–2024 годы заведомо неполные.</w:t>
+      </w:r>
+    </w:p>
+    <w:p>
+      <w:pPr>
+        <w:spacing w:after="0" w:line="360" w:lineRule="exact"/>
+        <w:ind w:firstLine="709"/>
+      </w:pPr>
+      <w:r>
+        <w:rPr>
+          <w:rFonts w:ascii="Times New Roman" w:hAnsi="Times New Roman"/>
+          <w:b w:val="0"/>
+          <w:sz w:val="28"/>
+        </w:rPr>
+        <w:t>Третий — уход в отечественные базы: часть российских журналов переориентировалась на eLIBRARY и РИНЦ, которые не интегрированы с OpenAlex.</w:t>
+      </w:r>
+    </w:p>
+    <w:p>
+      <w:pPr>
+        <w:spacing w:after="0" w:line="360" w:lineRule="exact"/>
+        <w:ind w:firstLine="709"/>
+      </w:pPr>
+      <w:r>
+        <w:rPr>
+          <w:rFonts w:ascii="Times New Roman" w:hAnsi="Times New Roman"/>
+          <w:b w:val="0"/>
+          <w:sz w:val="28"/>
+        </w:rPr>
+        <w:t>Четвёртый — фрагментация аффилиаций: авторы меняют или не указывают российскую принадлежность, идентификаторы организаций пропадают из метаданных.</w:t>
+      </w:r>
+    </w:p>
+    <w:p>
+      <w:pPr>
+        <w:spacing w:before="80" w:after="80"/>
+      </w:pPr>
+    </w:p>
+    <w:p>
+      <w:pPr>
+        <w:spacing w:before="240" w:after="120"/>
+      </w:pPr>
+      <w:r>
+        <w:rPr>
+          <w:rFonts w:ascii="Times New Roman" w:hAnsi="Times New Roman"/>
+          <w:b/>
+          <w:sz w:val="32"/>
+        </w:rPr>
+        <w:t>Слайд 5 — Цель и задачи (50–60 секунд)</w:t>
       </w:r>
     </w:p>
     <w:p>
@@ -932,7 +1020,7 @@
           <w:b/>
           <w:sz w:val="32"/>
         </w:rPr>
-        <w:t>Слайд 5 — Обзор существующих решений (50–60 секунд)</w:t>
+        <w:t>Слайд 6 — Обзор существующих решений (50–60 секунд)</w:t>
       </w:r>
     </w:p>
     <w:p>
@@ -992,7 +1080,7 @@
           <w:b/>
           <w:sz w:val="32"/>
         </w:rPr>
-        <w:t>Слайд 6 — Архитектура системы (50–60 секунд)</w:t>
+        <w:t>Слайд 7 — Архитектура системы (50–60 секунд)</w:t>
       </w:r>
     </w:p>
     <w:p>
@@ -1038,7 +1126,7 @@
           <w:b/>
           <w:sz w:val="32"/>
         </w:rPr>
-        <w:t>Слайд 7 — База данных (40–50 секунд)</w:t>
+        <w:t>Слайд 8 — База данных (40–50 секунд)</w:t>
       </w:r>
     </w:p>
     <w:p>
@@ -1098,7 +1186,7 @@
           <w:b/>
           <w:sz w:val="32"/>
         </w:rPr>
-        <w:t>Слайд 8 — ER-диаграмма базы данных (20–30 секунд)</w:t>
+        <w:t>Слайд 9 — ER-диаграмма базы данных (20–30 секунд)</w:t>
       </w:r>
     </w:p>
     <w:p>
@@ -1130,7 +1218,7 @@
           <w:b/>
           <w:sz w:val="32"/>
         </w:rPr>
-        <w:t>Слайд 9 — Географическая привязка (50–60 секунд)</w:t>
+        <w:t>Слайд 10 — Географическая привязка (50–60 секунд)</w:t>
       </w:r>
     </w:p>
     <w:p>
@@ -1190,7 +1278,7 @@
           <w:b/>
           <w:sz w:val="32"/>
         </w:rPr>
-        <w:t>Слайд 10 — Граф связей (50–60 секунд)</w:t>
+        <w:t>Слайд 11 — Граф связей (50–60 секунд)</w:t>
       </w:r>
     </w:p>
     <w:p>
@@ -1250,7 +1338,7 @@
           <w:b/>
           <w:sz w:val="32"/>
         </w:rPr>
-        <w:t>Слайд 11 — Поиск похожих статей (50–60 секунд)</w:t>
+        <w:t>Слайд 12 — Поиск похожих статей (50–60 секунд)</w:t>
       </w:r>
     </w:p>
     <w:p>
@@ -1324,7 +1412,7 @@
           <w:b/>
           <w:sz w:val="32"/>
         </w:rPr>
-        <w:t>Слайд 12 — Веб-интерфейс (40–50 секунд)</w:t>
+        <w:t>Слайд 13 — Веб-интерфейс (40–50 секунд)</w:t>
       </w:r>
     </w:p>
     <w:p>
@@ -1384,7 +1472,7 @@
           <w:b/>
           <w:sz w:val="32"/>
         </w:rPr>
-        <w:t>Слайд 13 — Проблемы и решения (20–30 секунд)</w:t>
+        <w:t>Слайд 14 — Проблемы и решения (20–30 секунд)</w:t>
       </w:r>
     </w:p>
     <w:p>
@@ -1416,7 +1504,7 @@
           <w:b/>
           <w:sz w:val="32"/>
         </w:rPr>
-        <w:t>Слайд 14 — Результаты (40–50 секунд)</w:t>
+        <w:t>Слайд 15 — Результаты (40–50 секунд)</w:t>
       </w:r>
     </w:p>
     <w:p>
@@ -1481,7 +1569,7 @@
     </w:p>
     <w:p>
       <w:pPr>
-        <w:spacing w:before="160" w:after="40"/>
+        <w:spacing w:before="160"/>
       </w:pPr>
       <w:r>
         <w:rPr>
@@ -1508,7 +1596,7 @@
     </w:p>
     <w:p>
       <w:pPr>
-        <w:spacing w:before="160" w:after="40"/>
+        <w:spacing w:before="160"/>
       </w:pPr>
       <w:r>
         <w:rPr>
@@ -1535,7 +1623,7 @@
     </w:p>
     <w:p>
       <w:pPr>
-        <w:spacing w:before="160" w:after="40"/>
+        <w:spacing w:before="160"/>
       </w:pPr>
       <w:r>
         <w:rPr>
@@ -1562,7 +1650,7 @@
     </w:p>
     <w:p>
       <w:pPr>
-        <w:spacing w:before="160" w:after="40"/>
+        <w:spacing w:before="160"/>
       </w:pPr>
       <w:r>
         <w:rPr>
@@ -1589,7 +1677,7 @@
     </w:p>
     <w:p>
       <w:pPr>
-        <w:spacing w:before="160" w:after="40"/>
+        <w:spacing w:before="160"/>
       </w:pPr>
       <w:r>
         <w:rPr>
@@ -1616,7 +1704,7 @@
     </w:p>
     <w:p>
       <w:pPr>
-        <w:spacing w:before="160" w:after="40"/>
+        <w:spacing w:before="160"/>
       </w:pPr>
       <w:r>
         <w:rPr>
@@ -1643,7 +1731,7 @@
     </w:p>
     <w:p>
       <w:pPr>
-        <w:spacing w:before="160" w:after="40"/>
+        <w:spacing w:before="160"/>
       </w:pPr>
       <w:r>
         <w:rPr>
@@ -1670,7 +1758,7 @@
     </w:p>
     <w:p>
       <w:pPr>
-        <w:spacing w:before="160" w:after="40"/>
+        <w:spacing w:before="160"/>
       </w:pPr>
       <w:r>
         <w:rPr>
@@ -1697,7 +1785,7 @@
     </w:p>
     <w:p>
       <w:pPr>
-        <w:spacing w:before="160" w:after="40"/>
+        <w:spacing w:before="160"/>
       </w:pPr>
       <w:r>
         <w:rPr>

</xml_diff>

<commit_message>
Update defense speech text
- Simplified glossary (removed over-formal definitions)
- Broke up perfect parallel enumerations in slide 4
- Replaced bureaucratic phrases ("что и определило необходимость", "Для достижения этой цели поставлено")
- Made FAQ answers shorter and more conversational
- Removed slide 13 (Проблемы и решения) references from text
</commit_message>
<xml_diff>
--- a/docs/текст для защиты.docx
+++ b/docs/текст для защиты.docx
@@ -4,1815 +4,719 @@
   <w:body>
     <w:p>
       <w:pPr>
-        <w:spacing w:after="240"/>
-        <w:jc w:val="center"/>
+        <w:pStyle w:val="Heading1"/>
+      </w:pPr>
+      <w:r>
+        <w:t>Текст для защиты диплома</w:t>
+      </w:r>
+    </w:p>
+    <w:p/>
+    <w:p>
+      <w:pPr>
+        <w:pStyle w:val="Heading2"/>
+      </w:pPr>
+      <w:r>
+        <w:t>Глоссарий (на случай вопросов)</w:t>
+      </w:r>
+    </w:p>
+    <w:p/>
+    <w:p>
+      <w:pPr>
+        <w:pStyle w:val="ListBullet"/>
       </w:pPr>
       <w:r>
         <w:rPr>
-          <w:rFonts w:ascii="Times New Roman" w:hAnsi="Times New Roman"/>
           <w:b/>
-          <w:sz w:val="36"/>
         </w:rPr>
-        <w:t>Текст для защиты диплома</w:t>
+        <w:t>Метаданные</w:t>
+      </w:r>
+      <w:r>
+        <w:t xml:space="preserve"> — всё про статью, кроме самого текста: название, авторы, год, журнал, тематики</w:t>
       </w:r>
     </w:p>
     <w:p>
       <w:pPr>
-        <w:spacing w:before="240" w:after="120"/>
+        <w:pStyle w:val="ListBullet"/>
       </w:pPr>
       <w:r>
         <w:rPr>
-          <w:rFonts w:ascii="Times New Roman" w:hAnsi="Times New Roman"/>
           <w:b/>
-          <w:sz w:val="32"/>
         </w:rPr>
-        <w:t>Глоссарий</w:t>
+        <w:t>OpenAlex</w:t>
       </w:r>
-    </w:p>
-    <w:tbl>
-      <w:tblPr>
-        <w:tblStyle w:val="TableGrid"/>
-        <w:tblW w:type="auto" w:w="0"/>
-        <w:tblLook w:firstColumn="1" w:firstRow="1" w:lastColumn="0" w:lastRow="0" w:noHBand="0" w:noVBand="1" w:val="04A0"/>
-      </w:tblPr>
-      <w:tblGrid>
-        <w:gridCol w:w="4844"/>
-        <w:gridCol w:w="4844"/>
-      </w:tblGrid>
-      <w:tr>
-        <w:tc>
-          <w:tcPr>
-            <w:tcW w:type="dxa" w:w="4844"/>
-          </w:tcPr>
-          <w:p>
-            <w:r>
-              <w:rPr>
-                <w:rFonts w:ascii="Times New Roman" w:hAnsi="Times New Roman"/>
-                <w:b/>
-                <w:sz w:val="22"/>
-              </w:rPr>
-              <w:t>Термин</w:t>
-            </w:r>
-          </w:p>
-        </w:tc>
-        <w:tc>
-          <w:tcPr>
-            <w:tcW w:type="dxa" w:w="4844"/>
-          </w:tcPr>
-          <w:p>
-            <w:r>
-              <w:rPr>
-                <w:rFonts w:ascii="Times New Roman" w:hAnsi="Times New Roman"/>
-                <w:b/>
-                <w:sz w:val="22"/>
-              </w:rPr>
-              <w:t>Определение</w:t>
-            </w:r>
-          </w:p>
-        </w:tc>
-      </w:tr>
-      <w:tr>
-        <w:tc>
-          <w:tcPr>
-            <w:tcW w:type="dxa" w:w="4844"/>
-          </w:tcPr>
-          <w:p>
-            <w:r>
-              <w:rPr>
-                <w:rFonts w:ascii="Times New Roman" w:hAnsi="Times New Roman"/>
-                <w:sz w:val="22"/>
-              </w:rPr>
-              <w:t>Метаданные публикации</w:t>
-            </w:r>
-          </w:p>
-        </w:tc>
-        <w:tc>
-          <w:tcPr>
-            <w:tcW w:type="dxa" w:w="4844"/>
-          </w:tcPr>
-          <w:p>
-            <w:r>
-              <w:rPr>
-                <w:rFonts w:ascii="Times New Roman" w:hAnsi="Times New Roman"/>
-                <w:sz w:val="22"/>
-              </w:rPr>
-              <w:t>Структурированное описание статьи: название, авторы, год, журнал, DOI, тематики, ключевые слова — без полного текста</w:t>
-            </w:r>
-          </w:p>
-        </w:tc>
-      </w:tr>
-      <w:tr>
-        <w:tc>
-          <w:tcPr>
-            <w:tcW w:type="dxa" w:w="4844"/>
-          </w:tcPr>
-          <w:p>
-            <w:r>
-              <w:rPr>
-                <w:rFonts w:ascii="Times New Roman" w:hAnsi="Times New Roman"/>
-                <w:sz w:val="22"/>
-              </w:rPr>
-              <w:t>OpenAlex</w:t>
-            </w:r>
-          </w:p>
-        </w:tc>
-        <w:tc>
-          <w:tcPr>
-            <w:tcW w:type="dxa" w:w="4844"/>
-          </w:tcPr>
-          <w:p>
-            <w:r>
-              <w:rPr>
-                <w:rFonts w:ascii="Times New Roman" w:hAnsi="Times New Roman"/>
-                <w:sz w:val="22"/>
-              </w:rPr>
-              <w:t>Открытый бесплатный каталог научных публикаций; содержит более 250 млн работ</w:t>
-            </w:r>
-          </w:p>
-        </w:tc>
-      </w:tr>
-      <w:tr>
-        <w:tc>
-          <w:tcPr>
-            <w:tcW w:type="dxa" w:w="4844"/>
-          </w:tcPr>
-          <w:p>
-            <w:r>
-              <w:rPr>
-                <w:rFonts w:ascii="Times New Roman" w:hAnsi="Times New Roman"/>
-                <w:sz w:val="22"/>
-              </w:rPr>
-              <w:t>API</w:t>
-            </w:r>
-          </w:p>
-        </w:tc>
-        <w:tc>
-          <w:tcPr>
-            <w:tcW w:type="dxa" w:w="4844"/>
-          </w:tcPr>
-          <w:p>
-            <w:r>
-              <w:rPr>
-                <w:rFonts w:ascii="Times New Roman" w:hAnsi="Times New Roman"/>
-                <w:sz w:val="22"/>
-              </w:rPr>
-              <w:t>Интерфейс программного взаимодействия — набор HTTP-запросов для получения данных из внешнего сервиса</w:t>
-            </w:r>
-          </w:p>
-        </w:tc>
-      </w:tr>
-      <w:tr>
-        <w:tc>
-          <w:tcPr>
-            <w:tcW w:type="dxa" w:w="4844"/>
-          </w:tcPr>
-          <w:p>
-            <w:r>
-              <w:rPr>
-                <w:rFonts w:ascii="Times New Roman" w:hAnsi="Times New Roman"/>
-                <w:sz w:val="22"/>
-              </w:rPr>
-              <w:t>DOI</w:t>
-            </w:r>
-          </w:p>
-        </w:tc>
-        <w:tc>
-          <w:tcPr>
-            <w:tcW w:type="dxa" w:w="4844"/>
-          </w:tcPr>
-          <w:p>
-            <w:r>
-              <w:rPr>
-                <w:rFonts w:ascii="Times New Roman" w:hAnsi="Times New Roman"/>
-                <w:sz w:val="22"/>
-              </w:rPr>
-              <w:t>Уникальный цифровой идентификатор научной публикации в формате 10.XXXX/...</w:t>
-            </w:r>
-          </w:p>
-        </w:tc>
-      </w:tr>
-      <w:tr>
-        <w:tc>
-          <w:tcPr>
-            <w:tcW w:type="dxa" w:w="4844"/>
-          </w:tcPr>
-          <w:p>
-            <w:r>
-              <w:rPr>
-                <w:rFonts w:ascii="Times New Roman" w:hAnsi="Times New Roman"/>
-                <w:sz w:val="22"/>
-              </w:rPr>
-              <w:t>Аффилиация</w:t>
-            </w:r>
-          </w:p>
-        </w:tc>
-        <w:tc>
-          <w:tcPr>
-            <w:tcW w:type="dxa" w:w="4844"/>
-          </w:tcPr>
-          <w:p>
-            <w:r>
-              <w:rPr>
-                <w:rFonts w:ascii="Times New Roman" w:hAnsi="Times New Roman"/>
-                <w:sz w:val="22"/>
-              </w:rPr>
-              <w:t>Организация, с которой связан автор на момент публикации (университет, институт, компания)</w:t>
-            </w:r>
-          </w:p>
-        </w:tc>
-      </w:tr>
-      <w:tr>
-        <w:tc>
-          <w:tcPr>
-            <w:tcW w:type="dxa" w:w="4844"/>
-          </w:tcPr>
-          <w:p>
-            <w:r>
-              <w:rPr>
-                <w:rFonts w:ascii="Times New Roman" w:hAnsi="Times New Roman"/>
-                <w:sz w:val="22"/>
-              </w:rPr>
-              <w:t>Геокодирование</w:t>
-            </w:r>
-          </w:p>
-        </w:tc>
-        <w:tc>
-          <w:tcPr>
-            <w:tcW w:type="dxa" w:w="4844"/>
-          </w:tcPr>
-          <w:p>
-            <w:r>
-              <w:rPr>
-                <w:rFonts w:ascii="Times New Roman" w:hAnsi="Times New Roman"/>
-                <w:sz w:val="22"/>
-              </w:rPr>
-              <w:t>Определение географических координат (широта, долгота) по названию места или идентификатору организации</w:t>
-            </w:r>
-          </w:p>
-        </w:tc>
-      </w:tr>
-      <w:tr>
-        <w:tc>
-          <w:tcPr>
-            <w:tcW w:type="dxa" w:w="4844"/>
-          </w:tcPr>
-          <w:p>
-            <w:r>
-              <w:rPr>
-                <w:rFonts w:ascii="Times New Roman" w:hAnsi="Times New Roman"/>
-                <w:sz w:val="22"/>
-              </w:rPr>
-              <w:t>Граф</w:t>
-            </w:r>
-          </w:p>
-        </w:tc>
-        <w:tc>
-          <w:tcPr>
-            <w:tcW w:type="dxa" w:w="4844"/>
-          </w:tcPr>
-          <w:p>
-            <w:r>
-              <w:rPr>
-                <w:rFonts w:ascii="Times New Roman" w:hAnsi="Times New Roman"/>
-                <w:sz w:val="22"/>
-              </w:rPr>
-              <w:t>Структура из узлов и рёбер (связей) между ними; используется для визуализации отношений между объектами</w:t>
-            </w:r>
-          </w:p>
-        </w:tc>
-      </w:tr>
-      <w:tr>
-        <w:tc>
-          <w:tcPr>
-            <w:tcW w:type="dxa" w:w="4844"/>
-          </w:tcPr>
-          <w:p>
-            <w:r>
-              <w:rPr>
-                <w:rFonts w:ascii="Times New Roman" w:hAnsi="Times New Roman"/>
-                <w:sz w:val="22"/>
-              </w:rPr>
-              <w:t>REST API</w:t>
-            </w:r>
-          </w:p>
-        </w:tc>
-        <w:tc>
-          <w:tcPr>
-            <w:tcW w:type="dxa" w:w="4844"/>
-          </w:tcPr>
-          <w:p>
-            <w:r>
-              <w:rPr>
-                <w:rFonts w:ascii="Times New Roman" w:hAnsi="Times New Roman"/>
-                <w:sz w:val="22"/>
-              </w:rPr>
-              <w:t>Стиль веб-сервисов, где каждый ресурс доступен по URL через стандартные HTTP-методы (GET, POST)</w:t>
-            </w:r>
-          </w:p>
-        </w:tc>
-      </w:tr>
-      <w:tr>
-        <w:tc>
-          <w:tcPr>
-            <w:tcW w:type="dxa" w:w="4844"/>
-          </w:tcPr>
-          <w:p>
-            <w:r>
-              <w:rPr>
-                <w:rFonts w:ascii="Times New Roman" w:hAnsi="Times New Roman"/>
-                <w:sz w:val="22"/>
-              </w:rPr>
-              <w:t>PostgreSQL</w:t>
-            </w:r>
-          </w:p>
-        </w:tc>
-        <w:tc>
-          <w:tcPr>
-            <w:tcW w:type="dxa" w:w="4844"/>
-          </w:tcPr>
-          <w:p>
-            <w:r>
-              <w:rPr>
-                <w:rFonts w:ascii="Times New Roman" w:hAnsi="Times New Roman"/>
-                <w:sz w:val="22"/>
-              </w:rPr>
-              <w:t>Реляционная система управления базами данных с открытым исходным кодом</w:t>
-            </w:r>
-          </w:p>
-        </w:tc>
-      </w:tr>
-      <w:tr>
-        <w:tc>
-          <w:tcPr>
-            <w:tcW w:type="dxa" w:w="4844"/>
-          </w:tcPr>
-          <w:p>
-            <w:r>
-              <w:rPr>
-                <w:rFonts w:ascii="Times New Roman" w:hAnsi="Times New Roman"/>
-                <w:sz w:val="22"/>
-              </w:rPr>
-              <w:t>gzip</w:t>
-            </w:r>
-          </w:p>
-        </w:tc>
-        <w:tc>
-          <w:tcPr>
-            <w:tcW w:type="dxa" w:w="4844"/>
-          </w:tcPr>
-          <w:p>
-            <w:r>
-              <w:rPr>
-                <w:rFonts w:ascii="Times New Roman" w:hAnsi="Times New Roman"/>
-                <w:sz w:val="22"/>
-              </w:rPr>
-              <w:t>Алгоритм сжатия данных; уменьшает объём HTTP-ответов сервера в 5–10 раз</w:t>
-            </w:r>
-          </w:p>
-        </w:tc>
-      </w:tr>
-      <w:tr>
-        <w:tc>
-          <w:tcPr>
-            <w:tcW w:type="dxa" w:w="4844"/>
-          </w:tcPr>
-          <w:p>
-            <w:r>
-              <w:rPr>
-                <w:rFonts w:ascii="Times New Roman" w:hAnsi="Times New Roman"/>
-                <w:sz w:val="22"/>
-              </w:rPr>
-              <w:t>Фасетная фильтрация</w:t>
-            </w:r>
-          </w:p>
-        </w:tc>
-        <w:tc>
-          <w:tcPr>
-            <w:tcW w:type="dxa" w:w="4844"/>
-          </w:tcPr>
-          <w:p>
-            <w:r>
-              <w:rPr>
-                <w:rFonts w:ascii="Times New Roman" w:hAnsi="Times New Roman"/>
-                <w:sz w:val="22"/>
-              </w:rPr>
-              <w:t>Метод фильтрации, при котором выбор в одном фильтре автоматически ограничивает варианты в других</w:t>
-            </w:r>
-          </w:p>
-        </w:tc>
-      </w:tr>
-      <w:tr>
-        <w:tc>
-          <w:tcPr>
-            <w:tcW w:type="dxa" w:w="4844"/>
-          </w:tcPr>
-          <w:p>
-            <w:r>
-              <w:rPr>
-                <w:rFonts w:ascii="Times New Roman" w:hAnsi="Times New Roman"/>
-                <w:sz w:val="22"/>
-              </w:rPr>
-              <w:t>SVG</w:t>
-            </w:r>
-          </w:p>
-        </w:tc>
-        <w:tc>
-          <w:tcPr>
-            <w:tcW w:type="dxa" w:w="4844"/>
-          </w:tcPr>
-          <w:p>
-            <w:r>
-              <w:rPr>
-                <w:rFonts w:ascii="Times New Roman" w:hAnsi="Times New Roman"/>
-                <w:sz w:val="22"/>
-              </w:rPr>
-              <w:t>XML-формат для векторной графики в браузере; используется для рисования графа</w:t>
-            </w:r>
-          </w:p>
-        </w:tc>
-      </w:tr>
-      <w:tr>
-        <w:tc>
-          <w:tcPr>
-            <w:tcW w:type="dxa" w:w="4844"/>
-          </w:tcPr>
-          <w:p>
-            <w:r>
-              <w:rPr>
-                <w:rFonts w:ascii="Times New Roman" w:hAnsi="Times New Roman"/>
-                <w:sz w:val="22"/>
-              </w:rPr>
-              <w:t>Cursor pagination</w:t>
-            </w:r>
-          </w:p>
-        </w:tc>
-        <w:tc>
-          <w:tcPr>
-            <w:tcW w:type="dxa" w:w="4844"/>
-          </w:tcPr>
-          <w:p>
-            <w:r>
-              <w:rPr>
-                <w:rFonts w:ascii="Times New Roman" w:hAnsi="Times New Roman"/>
-                <w:sz w:val="22"/>
-              </w:rPr>
-              <w:t>Постраничный обход данных через токены-курсоры, исключающий пропуски при большой выборке</w:t>
-            </w:r>
-          </w:p>
-        </w:tc>
-      </w:tr>
-      <w:tr>
-        <w:tc>
-          <w:tcPr>
-            <w:tcW w:type="dxa" w:w="4844"/>
-          </w:tcPr>
-          <w:p>
-            <w:r>
-              <w:rPr>
-                <w:rFonts w:ascii="Times New Roman" w:hAnsi="Times New Roman"/>
-                <w:sz w:val="22"/>
-              </w:rPr>
-              <w:t>Библиометрия</w:t>
-            </w:r>
-          </w:p>
-        </w:tc>
-        <w:tc>
-          <w:tcPr>
-            <w:tcW w:type="dxa" w:w="4844"/>
-          </w:tcPr>
-          <w:p>
-            <w:r>
-              <w:rPr>
-                <w:rFonts w:ascii="Times New Roman" w:hAnsi="Times New Roman"/>
-                <w:sz w:val="22"/>
-              </w:rPr>
-              <w:t>Количественный анализ научных публикаций: цитирования, коавторские связи, тематические кластеры</w:t>
-            </w:r>
-          </w:p>
-        </w:tc>
-      </w:tr>
-      <w:tr>
-        <w:tc>
-          <w:tcPr>
-            <w:tcW w:type="dxa" w:w="4844"/>
-          </w:tcPr>
-          <w:p>
-            <w:r>
-              <w:rPr>
-                <w:rFonts w:ascii="Times New Roman" w:hAnsi="Times New Roman"/>
-                <w:sz w:val="22"/>
-              </w:rPr>
-              <w:t>Балл сходства</w:t>
-            </w:r>
-          </w:p>
-        </w:tc>
-        <w:tc>
-          <w:tcPr>
-            <w:tcW w:type="dxa" w:w="4844"/>
-          </w:tcPr>
-          <w:p>
-            <w:r>
-              <w:rPr>
-                <w:rFonts w:ascii="Times New Roman" w:hAnsi="Times New Roman"/>
-                <w:sz w:val="22"/>
-              </w:rPr>
-              <w:t>Числовая мера близости двух публикаций по взвешенной сумме совпадающих признаков</w:t>
-            </w:r>
-          </w:p>
-        </w:tc>
-      </w:tr>
-      <w:tr>
-        <w:tc>
-          <w:tcPr>
-            <w:tcW w:type="dxa" w:w="4844"/>
-          </w:tcPr>
-          <w:p>
-            <w:r>
-              <w:rPr>
-                <w:rFonts w:ascii="Times New Roman" w:hAnsi="Times New Roman"/>
-                <w:sz w:val="22"/>
-              </w:rPr>
-              <w:t>requestAnimationFrame</w:t>
-            </w:r>
-          </w:p>
-        </w:tc>
-        <w:tc>
-          <w:tcPr>
-            <w:tcW w:type="dxa" w:w="4844"/>
-          </w:tcPr>
-          <w:p>
-            <w:r>
-              <w:rPr>
-                <w:rFonts w:ascii="Times New Roman" w:hAnsi="Times New Roman"/>
-                <w:sz w:val="22"/>
-              </w:rPr>
-              <w:t>Браузерный API для выполнения тяжёлых операций в промежутках между отрисовкой кадров, не блокируя интерфейс</w:t>
-            </w:r>
-          </w:p>
-        </w:tc>
-      </w:tr>
-      <w:tr>
-        <w:tc>
-          <w:tcPr>
-            <w:tcW w:type="dxa" w:w="4844"/>
-          </w:tcPr>
-          <w:p>
-            <w:r>
-              <w:rPr>
-                <w:rFonts w:ascii="Times New Roman" w:hAnsi="Times New Roman"/>
-                <w:sz w:val="22"/>
-              </w:rPr>
-              <w:t>ijson</w:t>
-            </w:r>
-          </w:p>
-        </w:tc>
-        <w:tc>
-          <w:tcPr>
-            <w:tcW w:type="dxa" w:w="4844"/>
-          </w:tcPr>
-          <w:p>
-            <w:r>
-              <w:rPr>
-                <w:rFonts w:ascii="Times New Roman" w:hAnsi="Times New Roman"/>
-                <w:sz w:val="22"/>
-              </w:rPr>
-              <w:t>Python-библиотека для потокового чтения JSON-файлов без загрузки всего файла в память</w:t>
-            </w:r>
-          </w:p>
-        </w:tc>
-      </w:tr>
-      <w:tr>
-        <w:tc>
-          <w:tcPr>
-            <w:tcW w:type="dxa" w:w="4844"/>
-          </w:tcPr>
-          <w:p>
-            <w:r>
-              <w:rPr>
-                <w:rFonts w:ascii="Times New Roman" w:hAnsi="Times New Roman"/>
-                <w:sz w:val="22"/>
-              </w:rPr>
-              <w:t>Savepoint</w:t>
-            </w:r>
-          </w:p>
-        </w:tc>
-        <w:tc>
-          <w:tcPr>
-            <w:tcW w:type="dxa" w:w="4844"/>
-          </w:tcPr>
-          <w:p>
-            <w:r>
-              <w:rPr>
-                <w:rFonts w:ascii="Times New Roman" w:hAnsi="Times New Roman"/>
-                <w:sz w:val="22"/>
-              </w:rPr>
-              <w:t>Механизм PostgreSQL для частичного отката транзакции при ошибке без потери остальных данных</w:t>
-            </w:r>
-          </w:p>
-        </w:tc>
-      </w:tr>
-      <w:tr>
-        <w:tc>
-          <w:tcPr>
-            <w:tcW w:type="dxa" w:w="4844"/>
-          </w:tcPr>
-          <w:p>
-            <w:r>
-              <w:rPr>
-                <w:rFonts w:ascii="Times New Roman" w:hAnsi="Times New Roman"/>
-                <w:sz w:val="22"/>
-              </w:rPr>
-              <w:t>Force-directed layout</w:t>
-            </w:r>
-          </w:p>
-        </w:tc>
-        <w:tc>
-          <w:tcPr>
-            <w:tcW w:type="dxa" w:w="4844"/>
-          </w:tcPr>
-          <w:p>
-            <w:r>
-              <w:rPr>
-                <w:rFonts w:ascii="Times New Roman" w:hAnsi="Times New Roman"/>
-                <w:sz w:val="22"/>
-              </w:rPr>
-              <w:t>Алгоритм физической симуляции для размещения узлов графа; даёт хаотичный результат при большом числе узлов</w:t>
-            </w:r>
-          </w:p>
-        </w:tc>
-      </w:tr>
-      <w:tr>
-        <w:tc>
-          <w:tcPr>
-            <w:tcW w:type="dxa" w:w="4844"/>
-          </w:tcPr>
-          <w:p>
-            <w:r>
-              <w:rPr>
-                <w:rFonts w:ascii="Times New Roman" w:hAnsi="Times New Roman"/>
-                <w:sz w:val="22"/>
-              </w:rPr>
-              <w:t>Колоночная раскладка</w:t>
-            </w:r>
-          </w:p>
-        </w:tc>
-        <w:tc>
-          <w:tcPr>
-            <w:tcW w:type="dxa" w:w="4844"/>
-          </w:tcPr>
-          <w:p>
-            <w:r>
-              <w:rPr>
-                <w:rFonts w:ascii="Times New Roman" w:hAnsi="Times New Roman"/>
-                <w:sz w:val="22"/>
-              </w:rPr>
-              <w:t>Детерминированный способ размещения узлов графа: каждый тип узла занимает фиксированную вертикальную колонку</w:t>
-            </w:r>
-          </w:p>
-        </w:tc>
-      </w:tr>
-      <w:tr>
-        <w:tc>
-          <w:tcPr>
-            <w:tcW w:type="dxa" w:w="4844"/>
-          </w:tcPr>
-          <w:p>
-            <w:r>
-              <w:rPr>
-                <w:rFonts w:ascii="Times New Roman" w:hAnsi="Times New Roman"/>
-                <w:sz w:val="22"/>
-              </w:rPr>
-              <w:t>Режим отображения</w:t>
-            </w:r>
-          </w:p>
-        </w:tc>
-        <w:tc>
-          <w:tcPr>
-            <w:tcW w:type="dxa" w:w="4844"/>
-          </w:tcPr>
-          <w:p>
-            <w:r>
-              <w:rPr>
-                <w:rFonts w:ascii="Times New Roman" w:hAnsi="Times New Roman"/>
-                <w:sz w:val="22"/>
-              </w:rPr>
-              <w:t>Настройка типов узлов и связей, одновременно видимых на графе; каждый режим показывает определённый «срез» данных</w:t>
-            </w:r>
-          </w:p>
-        </w:tc>
-      </w:tr>
-      <w:tr>
-        <w:tc>
-          <w:tcPr>
-            <w:tcW w:type="dxa" w:w="4844"/>
-          </w:tcPr>
-          <w:p>
-            <w:r>
-              <w:rPr>
-                <w:rFonts w:ascii="Times New Roman" w:hAnsi="Times New Roman"/>
-                <w:sz w:val="22"/>
-              </w:rPr>
-              <w:t>ER-диаграмма</w:t>
-            </w:r>
-          </w:p>
-        </w:tc>
-        <w:tc>
-          <w:tcPr>
-            <w:tcW w:type="dxa" w:w="4844"/>
-          </w:tcPr>
-          <w:p>
-            <w:r>
-              <w:rPr>
-                <w:rFonts w:ascii="Times New Roman" w:hAnsi="Times New Roman"/>
-                <w:sz w:val="22"/>
-              </w:rPr>
-              <w:t>Схема сущностей и связей базы данных: таблицы изображаются прямоугольниками, связи — линиями с кардинальностью (1:N, N:M)</w:t>
-            </w:r>
-          </w:p>
-        </w:tc>
-      </w:tr>
-    </w:tbl>
-    <w:p/>
-    <w:p>
-      <w:pPr>
-        <w:spacing w:before="80" w:after="80"/>
-      </w:pPr>
-    </w:p>
-    <w:p>
-      <w:pPr>
-        <w:spacing w:before="240" w:after="120"/>
-      </w:pPr>
       <w:r>
-        <w:rPr>
-          <w:rFonts w:ascii="Times New Roman" w:hAnsi="Times New Roman"/>
-          <w:b/>
-          <w:sz w:val="32"/>
-        </w:rPr>
-        <w:t>Слайд 1 — Титульный (10–15 секунд)</w:t>
+        <w:t xml:space="preserve"> — бесплатный открытый каталог, 250+ млн научных работ</w:t>
       </w:r>
     </w:p>
     <w:p>
       <w:pPr>
-        <w:spacing w:after="0" w:line="360" w:lineRule="exact"/>
-        <w:ind w:firstLine="709"/>
+        <w:pStyle w:val="ListBullet"/>
       </w:pPr>
       <w:r>
         <w:rPr>
-          <w:rFonts w:ascii="Times New Roman" w:hAnsi="Times New Roman"/>
-          <w:b w:val="0"/>
-          <w:sz w:val="28"/>
+          <w:b/>
         </w:rPr>
-        <w:t>Добрый день. Тема моей выпускной квалификационной работы — «Визуализация науки на основе метаданных публикаций и журналов». Разработанная система позволяет исследовать научные публикации через интерактивную карту и граф связей.</w:t>
+        <w:t>API</w:t>
+      </w:r>
+      <w:r>
+        <w:t xml:space="preserve"> — способ запросить данные у внешнего сервиса по HTTP</w:t>
       </w:r>
     </w:p>
     <w:p>
       <w:pPr>
-        <w:spacing w:before="80" w:after="80"/>
-      </w:pPr>
-    </w:p>
-    <w:p>
-      <w:pPr>
-        <w:spacing w:before="240" w:after="120"/>
+        <w:pStyle w:val="ListBullet"/>
       </w:pPr>
       <w:r>
         <w:rPr>
-          <w:rFonts w:ascii="Times New Roman" w:hAnsi="Times New Roman"/>
           <w:b/>
-          <w:sz w:val="32"/>
         </w:rPr>
-        <w:t>Слайд 2 — Актуальность (40–50 секунд)</w:t>
+        <w:t>DOI</w:t>
+      </w:r>
+      <w:r>
+        <w:t xml:space="preserve"> — уникальный идентификатор статьи вида 10.XXXX/...</w:t>
       </w:r>
     </w:p>
     <w:p>
       <w:pPr>
-        <w:spacing w:after="0" w:line="360" w:lineRule="exact"/>
-        <w:ind w:firstLine="709"/>
+        <w:pStyle w:val="ListBullet"/>
       </w:pPr>
       <w:r>
         <w:rPr>
-          <w:rFonts w:ascii="Times New Roman" w:hAnsi="Times New Roman"/>
-          <w:b w:val="0"/>
-          <w:sz w:val="28"/>
+          <w:b/>
         </w:rPr>
-        <w:t>Сегодня в открытом доступе находится более 250 миллионов научных работ, и их число, по данным библиометрического анализа Борнманна и Мутца (2014), удваивалось примерно каждые девять лет — исходя из темпа роста 8–9% в год за период 1980–2012. В таких условиях обычный поиск по ключевым словам помогает найти конкретную статью, но не отвечает на более широкие вопросы: кто с кем сотрудничает в научном сообществе, из каких стран приходят исследования по теме, как менялась тематика за последние годы.</w:t>
+        <w:t>Аффилиация</w:t>
+      </w:r>
+      <w:r>
+        <w:t xml:space="preserve"> — организация автора на момент публикации</w:t>
       </w:r>
     </w:p>
     <w:p>
       <w:pPr>
-        <w:spacing w:after="0" w:line="360" w:lineRule="exact"/>
-        <w:ind w:firstLine="709"/>
+        <w:pStyle w:val="ListBullet"/>
       </w:pPr>
       <w:r>
         <w:rPr>
-          <w:rFonts w:ascii="Times New Roman" w:hAnsi="Times New Roman"/>
-          <w:b w:val="0"/>
-          <w:sz w:val="28"/>
+          <w:b/>
         </w:rPr>
-        <w:t>Карта и граф — это два визуальных инструмента, которые превращают тысячи строк метаданных в наглядный научный ландшафт. Именно это и есть суть данной работы.</w:t>
+        <w:t>Геокодирование</w:t>
+      </w:r>
+      <w:r>
+        <w:t xml:space="preserve"> — получить координаты по названию места</w:t>
       </w:r>
     </w:p>
     <w:p>
       <w:pPr>
-        <w:spacing w:before="80" w:after="80"/>
-      </w:pPr>
-    </w:p>
-    <w:p>
-      <w:pPr>
-        <w:spacing w:before="240" w:after="120"/>
+        <w:pStyle w:val="ListBullet"/>
       </w:pPr>
       <w:r>
         <w:rPr>
-          <w:rFonts w:ascii="Times New Roman" w:hAnsi="Times New Roman"/>
           <w:b/>
-          <w:sz w:val="32"/>
         </w:rPr>
-        <w:t>Слайд 3 — Динамика публикационной активности (20–30 секунд)</w:t>
+        <w:t>Граф</w:t>
+      </w:r>
+      <w:r>
+        <w:t xml:space="preserve"> — узлы и рёбра между ними</w:t>
       </w:r>
     </w:p>
     <w:p>
       <w:pPr>
-        <w:spacing w:after="0" w:line="360" w:lineRule="exact"/>
-        <w:ind w:firstLine="709"/>
+        <w:pStyle w:val="ListBullet"/>
       </w:pPr>
       <w:r>
         <w:rPr>
-          <w:rFonts w:ascii="Times New Roman" w:hAnsi="Times New Roman"/>
-          <w:b w:val="0"/>
-          <w:sz w:val="28"/>
+          <w:b/>
         </w:rPr>
-        <w:t>На графике показана публикационная активность по годам на основе реальных данных из базы. Пик приходится на 2009–2010 годы. После 2020 года число публикаций снижается — это связано не с падением науки, а с неполнотой индексации свежих работ в OpenAlex: новые статьи попадают в каталог с задержкой.</w:t>
+        <w:t>PostgreSQL</w:t>
+      </w:r>
+      <w:r>
+        <w:t xml:space="preserve"> — реляционная СУБД, открытый исходный код</w:t>
       </w:r>
     </w:p>
     <w:p>
       <w:pPr>
-        <w:spacing w:before="80" w:after="80"/>
-      </w:pPr>
-    </w:p>
-    <w:p>
-      <w:pPr>
-        <w:spacing w:before="240" w:after="120"/>
+        <w:pStyle w:val="ListBullet"/>
       </w:pPr>
       <w:r>
         <w:rPr>
-          <w:rFonts w:ascii="Times New Roman" w:hAnsi="Times New Roman"/>
           <w:b/>
-          <w:sz w:val="32"/>
         </w:rPr>
-        <w:t>Слайд 4 — Почему публикации после 2020 хуже представлены в базах? (30–40 секунд)</w:t>
+        <w:t>Фасетная фильтрация</w:t>
+      </w:r>
+      <w:r>
+        <w:t xml:space="preserve"> — фильтры связаны между собой: выбор в одном сужает варианты в других</w:t>
       </w:r>
     </w:p>
     <w:p>
       <w:pPr>
-        <w:spacing w:after="0" w:line="360" w:lineRule="exact"/>
-        <w:ind w:firstLine="709"/>
+        <w:pStyle w:val="ListBullet"/>
       </w:pPr>
       <w:r>
         <w:rPr>
-          <w:rFonts w:ascii="Times New Roman" w:hAnsi="Times New Roman"/>
-          <w:b w:val="0"/>
-          <w:sz w:val="28"/>
+          <w:b/>
         </w:rPr>
-        <w:t>Спад на предыдущем графике требует объяснения — это не падение науки, а совокупность четырёх факторов.</w:t>
+        <w:t>Балл сходства</w:t>
+      </w:r>
+      <w:r>
+        <w:t xml:space="preserve"> — число, показывающее насколько похожи две статьи по метаданным</w:t>
       </w:r>
     </w:p>
     <w:p>
       <w:pPr>
-        <w:spacing w:after="0" w:line="360" w:lineRule="exact"/>
-        <w:ind w:firstLine="709"/>
+        <w:pStyle w:val="ListBullet"/>
       </w:pPr>
       <w:r>
         <w:rPr>
-          <w:rFonts w:ascii="Times New Roman" w:hAnsi="Times New Roman"/>
-          <w:b w:val="0"/>
-          <w:sz w:val="28"/>
+          <w:b/>
         </w:rPr>
-        <w:t>Первый — санкции 2022 года: Scopus и Web of Science приостановили индексацию российских журналов, около пятисот изданий было удалено из Scopus.</w:t>
+        <w:t>Режим отображения</w:t>
+      </w:r>
+      <w:r>
+        <w:t xml:space="preserve"> — какие типы узлов и связей сейчас видны на графе</w:t>
       </w:r>
     </w:p>
     <w:p>
       <w:pPr>
-        <w:spacing w:after="0" w:line="360" w:lineRule="exact"/>
-        <w:ind w:firstLine="709"/>
+        <w:pStyle w:val="ListBullet"/>
       </w:pPr>
       <w:r>
         <w:rPr>
-          <w:rFonts w:ascii="Times New Roman" w:hAnsi="Times New Roman"/>
-          <w:b w:val="0"/>
-          <w:sz w:val="28"/>
+          <w:b/>
         </w:rPr>
-        <w:t>Второй — задержка индексации OpenAlex: новые статьи попадают в каталог через шесть-восемнадцать месяцев после публикации, поэтому данные за 2023–2024 годы заведомо неполные.</w:t>
+        <w:t>ER-диаграмма</w:t>
+      </w:r>
+      <w:r>
+        <w:t xml:space="preserve"> — схема таблиц БД и связей между ними</w:t>
       </w:r>
     </w:p>
+    <w:p/>
+    <w:p/>
+    <w:p/>
     <w:p>
       <w:pPr>
-        <w:spacing w:after="0" w:line="360" w:lineRule="exact"/>
-        <w:ind w:firstLine="709"/>
+        <w:pStyle w:val="Heading2"/>
       </w:pPr>
       <w:r>
-        <w:rPr>
-          <w:rFonts w:ascii="Times New Roman" w:hAnsi="Times New Roman"/>
-          <w:b w:val="0"/>
-          <w:sz w:val="28"/>
-        </w:rPr>
-        <w:t>Третий — уход в отечественные базы: часть российских журналов переориентировалась на eLIBRARY и РИНЦ, которые не интегрированы с OpenAlex.</w:t>
+        <w:t>Слайд 1 — Титульный (10–15 секунд)</w:t>
       </w:r>
     </w:p>
+    <w:p/>
+    <w:p>
+      <w:r>
+        <w:t>Добрый день. Тема моей работы — «Визуализация науки на основе метаданных публикаций и журналов». Я разработала веб-приложение, которое позволяет исследовать научные публикации через интерактивную карту и граф связей.</w:t>
+      </w:r>
+    </w:p>
+    <w:p/>
+    <w:p/>
+    <w:p/>
     <w:p>
       <w:pPr>
-        <w:spacing w:after="0" w:line="360" w:lineRule="exact"/>
-        <w:ind w:firstLine="709"/>
+        <w:pStyle w:val="Heading2"/>
       </w:pPr>
       <w:r>
-        <w:rPr>
-          <w:rFonts w:ascii="Times New Roman" w:hAnsi="Times New Roman"/>
-          <w:b w:val="0"/>
-          <w:sz w:val="28"/>
-        </w:rPr>
-        <w:t>Четвёртый — фрагментация аффилиаций: авторы меняют или не указывают российскую принадлежность, идентификаторы организаций пропадают из метаданных.</w:t>
+        <w:t>Слайд 2 — Актуальность (40–50 секунд)</w:t>
       </w:r>
     </w:p>
+    <w:p/>
+    <w:p>
+      <w:r>
+        <w:t>Сегодня в открытом доступе больше 250 миллионов научных работ. По данным Борнманна и Мутца (2014), их число удваивалось примерно каждые девять лет — это темп роста около 8–9% в год за период 1980–2012.</w:t>
+      </w:r>
+    </w:p>
+    <w:p/>
+    <w:p>
+      <w:r>
+        <w:t>При таком объёме поиск по ключевым словам помогает найти конкретную статью, но не даёт ответа на более широкие вопросы: кто с кем сотрудничает, откуда приходят исследования по теме, как со временем менялась тематика.</w:t>
+      </w:r>
+    </w:p>
+    <w:p/>
+    <w:p>
+      <w:r>
+        <w:t>Карта и граф дают другой взгляд на те же данные — превращают тысячи строк в понятную картину.</w:t>
+      </w:r>
+    </w:p>
+    <w:p/>
+    <w:p/>
+    <w:p/>
     <w:p>
       <w:pPr>
-        <w:spacing w:before="80" w:after="80"/>
+        <w:pStyle w:val="Heading2"/>
       </w:pPr>
+      <w:r>
+        <w:t>Слайд 3 — Динамика публикационной активности (20–30 секунд)</w:t>
+      </w:r>
     </w:p>
+    <w:p/>
+    <w:p>
+      <w:r>
+        <w:t>На графике — публикационная активность по годам из нашей базы. Пик — 2009–2010 годы. После 2020 видим спад, но это не падение науки — новые статьи попадают в OpenAlex с задержкой, плюс ряд других причин, о которых следующий слайд.</w:t>
+      </w:r>
+    </w:p>
+    <w:p/>
+    <w:p/>
+    <w:p/>
     <w:p>
       <w:pPr>
-        <w:spacing w:before="240" w:after="120"/>
+        <w:pStyle w:val="Heading2"/>
       </w:pPr>
       <w:r>
-        <w:rPr>
-          <w:rFonts w:ascii="Times New Roman" w:hAnsi="Times New Roman"/>
-          <w:b/>
-          <w:sz w:val="32"/>
-        </w:rPr>
+        <w:t>Слайд 4 — Почему публикации после 2020 хуже представлены в базах? (30–40 секунд)</w:t>
+      </w:r>
+    </w:p>
+    <w:p/>
+    <w:p>
+      <w:r>
+        <w:t>Спад на графике объясняется четырьмя вещами сразу.</w:t>
+      </w:r>
+    </w:p>
+    <w:p/>
+    <w:p>
+      <w:r>
+        <w:t>Санкции 2022 года — Scopus и Web of Science остановили индексацию российских журналов, около 500 изданий было удалено из Scopus.</w:t>
+      </w:r>
+    </w:p>
+    <w:p/>
+    <w:p>
+      <w:r>
+        <w:t>Задержка OpenAlex — новые статьи появляются в каталоге через 6–18 месяцев после публикации, так что данные за 2023–2024 объективно неполные.</w:t>
+      </w:r>
+    </w:p>
+    <w:p/>
+    <w:p>
+      <w:r>
+        <w:t>Уход в РИНЦ — часть журналов переориентировалась на eLIBRARY, который с OpenAlex не связан.</w:t>
+      </w:r>
+    </w:p>
+    <w:p/>
+    <w:p>
+      <w:r>
+        <w:t>Фрагментация аффилиаций — авторы начали скрывать или не указывать российскую принадлежность, идентификаторы организаций пропадают из метаданных.</w:t>
+      </w:r>
+    </w:p>
+    <w:p/>
+    <w:p/>
+    <w:p/>
+    <w:p>
+      <w:pPr>
+        <w:pStyle w:val="Heading2"/>
+      </w:pPr>
+      <w:r>
         <w:t>Слайд 5 — Цель и задачи (50–60 секунд)</w:t>
       </w:r>
     </w:p>
+    <w:p/>
+    <w:p>
+      <w:r>
+        <w:t>Объект — метаданные научных публикаций в открытых каталогах. Предмет — методы их визуализации: географическая карта аффилиаций и граф связей.</w:t>
+      </w:r>
+    </w:p>
+    <w:p/>
+    <w:p>
+      <w:r>
+        <w:t>Цель: разработать веб-приложение для анализа и интерактивной визуализации научных публикаций на основе открытых метаданных.</w:t>
+      </w:r>
+    </w:p>
+    <w:p/>
+    <w:p>
+      <w:r>
+        <w:t>Задачи: загрузить данные из OpenAlex, спроектировать базу, геокодировать аффилиации, реализовать карту, граф, REST API и браузерный интерфейс с фасетными фильтрами.</w:t>
+      </w:r>
+    </w:p>
+    <w:p/>
+    <w:p>
+      <w:r>
+        <w:t>Ориентиры по качеству я поставила такие: покрытие геокодирования минимум 75%, граф не зависает в браузере, фильтры не дают пустых результатов.</w:t>
+      </w:r>
+    </w:p>
+    <w:p/>
+    <w:p/>
+    <w:p/>
     <w:p>
       <w:pPr>
-        <w:spacing w:after="0" w:line="360" w:lineRule="exact"/>
-        <w:ind w:firstLine="709"/>
+        <w:pStyle w:val="Heading2"/>
       </w:pPr>
       <w:r>
-        <w:rPr>
-          <w:rFonts w:ascii="Times New Roman" w:hAnsi="Times New Roman"/>
-          <w:b w:val="0"/>
-          <w:sz w:val="28"/>
-        </w:rPr>
-        <w:t>Объект исследования — система метаданных научных публикаций и журналов в открытых библиографических каталогах. Предмет — методы интерактивной визуализации этих метаданных: географической карты аффилиаций и графа связей.</w:t>
-      </w:r>
-    </w:p>
-    <w:p>
-      <w:pPr>
-        <w:spacing w:after="0" w:line="360" w:lineRule="exact"/>
-        <w:ind w:firstLine="709"/>
-      </w:pPr>
-      <w:r>
-        <w:rPr>
-          <w:rFonts w:ascii="Times New Roman" w:hAnsi="Times New Roman"/>
-          <w:b w:val="0"/>
-          <w:sz w:val="28"/>
-        </w:rPr>
-        <w:t>Цель работы: разработать веб-приложение для анализа и интерактивной визуализации научных публикаций на основе открытых метаданных.</w:t>
-      </w:r>
-    </w:p>
-    <w:p>
-      <w:pPr>
-        <w:spacing w:after="0" w:line="360" w:lineRule="exact"/>
-        <w:ind w:firstLine="709"/>
-      </w:pPr>
-      <w:r>
-        <w:rPr>
-          <w:rFonts w:ascii="Times New Roman" w:hAnsi="Times New Roman"/>
-          <w:b w:val="0"/>
-          <w:sz w:val="28"/>
-        </w:rPr>
-        <w:t>Для достижения этой цели поставлено шесть задач: загрузить метаданные из OpenAlex, спроектировать и заполнить базу данных, геокодировать аффилиации авторов, реализовать карту и граф, разработать REST API и браузерный интерфейс с фасетными фильтрами.</w:t>
-      </w:r>
-    </w:p>
-    <w:p>
-      <w:pPr>
-        <w:spacing w:after="0" w:line="360" w:lineRule="exact"/>
-        <w:ind w:firstLine="709"/>
-      </w:pPr>
-      <w:r>
-        <w:rPr>
-          <w:rFonts w:ascii="Times New Roman" w:hAnsi="Times New Roman"/>
-          <w:b w:val="0"/>
-          <w:sz w:val="28"/>
-        </w:rPr>
-        <w:t>Критерии качества: покрытие геокодирования не менее 75%, граф без зависания браузера, фильтры без пустых результатов.</w:t>
-      </w:r>
-    </w:p>
-    <w:p>
-      <w:pPr>
-        <w:spacing w:before="80" w:after="80"/>
-      </w:pPr>
-    </w:p>
-    <w:p>
-      <w:pPr>
-        <w:spacing w:before="240" w:after="120"/>
-      </w:pPr>
-      <w:r>
-        <w:rPr>
-          <w:rFonts w:ascii="Times New Roman" w:hAnsi="Times New Roman"/>
-          <w:b/>
-          <w:sz w:val="32"/>
-        </w:rPr>
         <w:t>Слайд 6 — Обзор существующих решений (50–60 секунд)</w:t>
       </w:r>
     </w:p>
+    <w:p/>
+    <w:p>
+      <w:r>
+        <w:t>Перед разработкой я посмотрела девять существующих инструментов: VOSviewer, CiteSpace, Connected Papers, Bibliometrix, Gephi, Lens.org, ResearchRabbit, Inciteful, Litmaps.</w:t>
+      </w:r>
+    </w:p>
+    <w:p/>
+    <w:p>
+      <w:r>
+        <w:t>VOSviewer и CiteSpace мощные, но нужна установка и нет алгоритма похожих статей. Connected Papers строит граф похожих, но только для одной статьи и без карты. Bibliometrix работает с OpenAlex, но требует знания R. ResearchRabbit, Inciteful, Litmaps — современные браузерные сервисы, но ни один не совмещает карту с точными координатами и граф.</w:t>
+      </w:r>
+    </w:p>
+    <w:p/>
+    <w:p>
+      <w:r>
+        <w:t>В итоге ни один не даёт сразу всё: карту, граф, фасетные фильтры и поиск похожих — поэтому я делала свою систему.</w:t>
+      </w:r>
+    </w:p>
+    <w:p/>
+    <w:p/>
+    <w:p/>
     <w:p>
       <w:pPr>
-        <w:spacing w:after="0" w:line="360" w:lineRule="exact"/>
-        <w:ind w:firstLine="709"/>
+        <w:pStyle w:val="Heading2"/>
       </w:pPr>
       <w:r>
-        <w:rPr>
-          <w:rFonts w:ascii="Times New Roman" w:hAnsi="Times New Roman"/>
-          <w:b w:val="0"/>
-          <w:sz w:val="28"/>
-        </w:rPr>
-        <w:t>Перед разработкой был проведён анализ девяти существующих инструментов: VOSviewer, CiteSpace, Connected Papers, Bibliometrix, Gephi, Lens.org, ResearchRabbit, Inciteful и Litmaps.</w:t>
-      </w:r>
-    </w:p>
-    <w:p>
-      <w:pPr>
-        <w:spacing w:after="0" w:line="360" w:lineRule="exact"/>
-        <w:ind w:firstLine="709"/>
-      </w:pPr>
-      <w:r>
-        <w:rPr>
-          <w:rFonts w:ascii="Times New Roman" w:hAnsi="Times New Roman"/>
-          <w:b w:val="0"/>
-          <w:sz w:val="28"/>
-        </w:rPr>
-        <w:t>VOSviewer и CiteSpace — мощные инструменты, но требуют установки и не имеют алгоритма похожих статей. Connected Papers строит граф похожих публикаций, но работает только с одной статьёй за раз и не имеет карты. Bibliometrix интегрируется с OpenAlex, но требует знания языка R. ResearchRabbit, Inciteful и Litmaps — современные браузерные сервисы, но ни один не сочетает карту с точными координатами и граф связей одновременно.</w:t>
-      </w:r>
-    </w:p>
-    <w:p>
-      <w:pPr>
-        <w:spacing w:after="0" w:line="360" w:lineRule="exact"/>
-        <w:ind w:firstLine="709"/>
-      </w:pPr>
-      <w:r>
-        <w:rPr>
-          <w:rFonts w:ascii="Times New Roman" w:hAnsi="Times New Roman"/>
-          <w:b w:val="0"/>
-          <w:sz w:val="28"/>
-        </w:rPr>
-        <w:t>Таким образом, ни один из рассмотренных инструментов не объединяет все четыре возможности: карту с точными координатами, граф связей, фасетную фильтрацию и поиск похожих статей — что и определило необходимость разработки собственной системы.</w:t>
-      </w:r>
-    </w:p>
-    <w:p>
-      <w:pPr>
-        <w:spacing w:before="80" w:after="80"/>
-      </w:pPr>
-    </w:p>
-    <w:p>
-      <w:pPr>
-        <w:spacing w:before="240" w:after="120"/>
-      </w:pPr>
-      <w:r>
-        <w:rPr>
-          <w:rFonts w:ascii="Times New Roman" w:hAnsi="Times New Roman"/>
-          <w:b/>
-          <w:sz w:val="32"/>
-        </w:rPr>
         <w:t>Слайд 7 — Архитектура системы (50–60 секунд)</w:t>
       </w:r>
     </w:p>
+    <w:p/>
+    <w:p>
+      <w:r>
+        <w:t>Система состоит из пяти частей. Скрипт import.py загружает данные из OpenAlex и сохраняет в JSON. Следующий скрипт переносит их в PostgreSQL. Два скрипта геокодирования добавляют координаты. Сервер на Python отдаёт REST API. Браузер показывает карту, граф и фильтры.</w:t>
+      </w:r>
+    </w:p>
+    <w:p/>
+    <w:p>
+      <w:r>
+        <w:t>По технологиям: PostgreSQL — потому что между сущностями чёткие реляционные связи, нужны JOIN-запросы. Plotly — встроенная поддержка карт и интерактивности. SVG без библиотек — потому что нужна колоночная раскладка, а не хаотичная. OpenAlex — единственный бесплатный источник с аффилиациями и пакетным API организаций.</w:t>
+      </w:r>
+    </w:p>
+    <w:p/>
+    <w:p/>
+    <w:p/>
     <w:p>
       <w:pPr>
-        <w:spacing w:after="0" w:line="360" w:lineRule="exact"/>
-        <w:ind w:firstLine="709"/>
+        <w:pStyle w:val="Heading2"/>
       </w:pPr>
       <w:r>
-        <w:rPr>
-          <w:rFonts w:ascii="Times New Roman" w:hAnsi="Times New Roman"/>
-          <w:b w:val="0"/>
-          <w:sz w:val="28"/>
-        </w:rPr>
-        <w:t>Система состоит из пяти модулей. Скрипт import.py загружает данные из OpenAlex и сохраняет в JSON. Скрипт загрузки переносит данные в PostgreSQL. Два скрипта геокодирования обогащают базу координатами. Сервер на Python предоставляет REST API. Браузер отображает карту, граф и фильтры.</w:t>
-      </w:r>
-    </w:p>
-    <w:p>
-      <w:pPr>
-        <w:spacing w:after="0" w:line="360" w:lineRule="exact"/>
-        <w:ind w:firstLine="709"/>
-      </w:pPr>
-      <w:r>
-        <w:rPr>
-          <w:rFonts w:ascii="Times New Roman" w:hAnsi="Times New Roman"/>
-          <w:b w:val="0"/>
-          <w:sz w:val="28"/>
-        </w:rPr>
-        <w:t>Каждый технологический выбор обоснован. PostgreSQL — потому что между сущностями чёткие реляционные связи, нужны JOIN-запросы. Plotly — встроенная поддержка мировых проекций и интерактивности. SVG без библиотек — потому что нужна колоночная, а не хаотичная раскладка графа. OpenAlex — единственный бесплатный источник с аффилиациями, тематиками и пакетным API организаций.</w:t>
-      </w:r>
-    </w:p>
-    <w:p>
-      <w:pPr>
-        <w:spacing w:before="80" w:after="80"/>
-      </w:pPr>
-    </w:p>
-    <w:p>
-      <w:pPr>
-        <w:spacing w:before="240" w:after="120"/>
-      </w:pPr>
-      <w:r>
-        <w:rPr>
-          <w:rFonts w:ascii="Times New Roman" w:hAnsi="Times New Roman"/>
-          <w:b/>
-          <w:sz w:val="32"/>
-        </w:rPr>
         <w:t>Слайд 8 — База данных (40–50 секунд)</w:t>
       </w:r>
     </w:p>
+    <w:p/>
+    <w:p>
+      <w:r>
+        <w:t>База данных — семь таблиц: журналы, публикации, авторы, аффилиации с координатами, и три таблицы связей.</w:t>
+      </w:r>
+    </w:p>
+    <w:p/>
+    <w:p>
+      <w:r>
+        <w:t>Настройки подключения в отдельном pg_config.py. Там обязательно client_encoding: utf8 — без него на Windows PostgreSQL возвращает ошибки в cp1251 и Python падает.</w:t>
+      </w:r>
+    </w:p>
+    <w:p/>
+    <w:p>
+      <w:r>
+        <w:t>При загрузке использовались savepoint-ы — иногда два объекта из OpenAlex ссылались на один DOI. В итоге все 9 994 публикации загружены без потерь.</w:t>
+      </w:r>
+    </w:p>
+    <w:p/>
+    <w:p/>
+    <w:p/>
     <w:p>
       <w:pPr>
-        <w:spacing w:after="0" w:line="360" w:lineRule="exact"/>
-        <w:ind w:firstLine="709"/>
+        <w:pStyle w:val="Heading2"/>
       </w:pPr>
       <w:r>
-        <w:rPr>
-          <w:rFonts w:ascii="Times New Roman" w:hAnsi="Times New Roman"/>
-          <w:b w:val="0"/>
-          <w:sz w:val="28"/>
-        </w:rPr>
-        <w:t>База данных включает семь таблиц: журналы, публикации, авторы, аффилиации с координатами, и три таблицы связей — публикация–автор, публикация–тема, публикация–ключевое слово.</w:t>
-      </w:r>
-    </w:p>
-    <w:p>
-      <w:pPr>
-        <w:spacing w:after="0" w:line="360" w:lineRule="exact"/>
-        <w:ind w:firstLine="709"/>
-      </w:pPr>
-      <w:r>
-        <w:rPr>
-          <w:rFonts w:ascii="Times New Roman" w:hAnsi="Times New Roman"/>
-          <w:b w:val="0"/>
-          <w:sz w:val="28"/>
-        </w:rPr>
-        <w:t>Настройки подключения вынесены в отдельный файл pg_config.py. Параметр client_encoding: utf8 там обязателен — без него на Windows PostgreSQL возвращает сообщения об ошибках в кодировке cp1251, что приводит к сбоям в Python.</w:t>
-      </w:r>
-    </w:p>
-    <w:p>
-      <w:pPr>
-        <w:spacing w:after="0" w:line="360" w:lineRule="exact"/>
-        <w:ind w:firstLine="709"/>
-      </w:pPr>
-      <w:r>
-        <w:rPr>
-          <w:rFonts w:ascii="Times New Roman" w:hAnsi="Times New Roman"/>
-          <w:b w:val="0"/>
-          <w:sz w:val="28"/>
-        </w:rPr>
-        <w:t>При загрузке данных использовались savepoint-ы для обработки конфликтов: иногда два объекта OpenAlex ссылались на один и тот же DOI. В итоге все 9 994 публикации были загружены без ошибок.</w:t>
-      </w:r>
-    </w:p>
-    <w:p>
-      <w:pPr>
-        <w:spacing w:before="80" w:after="80"/>
-      </w:pPr>
-    </w:p>
-    <w:p>
-      <w:pPr>
-        <w:spacing w:before="240" w:after="120"/>
-      </w:pPr>
-      <w:r>
-        <w:rPr>
-          <w:rFonts w:ascii="Times New Roman" w:hAnsi="Times New Roman"/>
-          <w:b/>
-          <w:sz w:val="32"/>
-        </w:rPr>
         <w:t>Слайд 9 — ER-диаграмма базы данных (20–30 секунд)</w:t>
       </w:r>
     </w:p>
+    <w:p/>
+    <w:p>
+      <w:r>
+        <w:t>На схеме видны связи между таблицами. Журналы к публикациям — один ко многим. Публикации и авторы — многие ко многим через publication_authors. Аффилиации хранятся с координатами и привязаны к авторам. Тематики и ключевые слова тоже отдельными таблицами.</w:t>
+      </w:r>
+    </w:p>
+    <w:p/>
+    <w:p/>
+    <w:p/>
     <w:p>
       <w:pPr>
-        <w:spacing w:after="0" w:line="360" w:lineRule="exact"/>
-        <w:ind w:firstLine="709"/>
+        <w:pStyle w:val="Heading2"/>
       </w:pPr>
       <w:r>
-        <w:rPr>
-          <w:rFonts w:ascii="Times New Roman" w:hAnsi="Times New Roman"/>
-          <w:b w:val="0"/>
-          <w:sz w:val="28"/>
-        </w:rPr>
-        <w:t>На диаграмме показаны связи между таблицами. Журналы связаны с публикациями отношением «один ко многим». Публикации связаны с авторами через таблицу publication_authors — это классическое отношение «многие ко многим». Отдельно хранятся тематические классификаторы и ключевые слова — они также привязаны к публикациям. Аффилиации организаций хранятся вместе с координатами и связаны с авторами.</w:t>
-      </w:r>
-    </w:p>
-    <w:p>
-      <w:pPr>
-        <w:spacing w:before="80" w:after="80"/>
-      </w:pPr>
-    </w:p>
-    <w:p>
-      <w:pPr>
-        <w:spacing w:before="240" w:after="120"/>
-      </w:pPr>
-      <w:r>
-        <w:rPr>
-          <w:rFonts w:ascii="Times New Roman" w:hAnsi="Times New Roman"/>
-          <w:b/>
-          <w:sz w:val="32"/>
-        </w:rPr>
         <w:t>Слайд 10 — Географическая привязка (50–60 секунд)</w:t>
       </w:r>
     </w:p>
+    <w:p/>
+    <w:p>
+      <w:r>
+        <w:t>Геокодирование в два шага. Сначала — организации с идентификатором OpenAlex, координаты запрашиваются через API батчами по 100. Это дало 78%.</w:t>
+      </w:r>
+    </w:p>
+    <w:p/>
+    <w:p>
+      <w:r>
+        <w:t>Оставшиеся 22% — аффилиации только строкой названия. Для них написан скрипт с геокодером Photon от Komoot. Скрипт пробует полное название, потом сокращает строку по запятым, пока не получит результат. Важная деталь — Photon отдаёт координаты в формате longitude/latitude, а не наоборот, поэтому при сохранении переставляю вручную.</w:t>
+      </w:r>
+    </w:p>
+    <w:p/>
+    <w:p>
+      <w:r>
+        <w:t>Обрабатываются в первую очередь организации, которые закрывают максимум публикаций без координат. Итого: 80,8%.</w:t>
+      </w:r>
+    </w:p>
+    <w:p/>
+    <w:p/>
+    <w:p/>
     <w:p>
       <w:pPr>
-        <w:spacing w:after="0" w:line="360" w:lineRule="exact"/>
-        <w:ind w:firstLine="709"/>
+        <w:pStyle w:val="Heading2"/>
       </w:pPr>
       <w:r>
-        <w:rPr>
-          <w:rFonts w:ascii="Times New Roman" w:hAnsi="Times New Roman"/>
-          <w:b w:val="0"/>
-          <w:sz w:val="28"/>
-        </w:rPr>
-        <w:t>Геокодирование прошло в два этапа. На первом этапе для организаций с идентификатором OpenAlex координаты запрашивались через API учреждений батчами по 100 — это дало покрытие 78%.</w:t>
-      </w:r>
-    </w:p>
-    <w:p>
-      <w:pPr>
-        <w:spacing w:after="0" w:line="360" w:lineRule="exact"/>
-        <w:ind w:firstLine="709"/>
-      </w:pPr>
-      <w:r>
-        <w:rPr>
-          <w:rFonts w:ascii="Times New Roman" w:hAnsi="Times New Roman"/>
-          <w:b w:val="0"/>
-          <w:sz w:val="28"/>
-        </w:rPr>
-        <w:t>Оставшиеся 22% — аффилиации, записанные только строкой названия без ссылки. Для них написан скрипт, который запрашивает геокодер Photon от Komoot. Скрипт применяет стратегию сокращения строки: сначала пробует полное название, потом последние три части через запятую, потом две — пока не получит результат. При этом важная деталь: Photon возвращает координаты в формате GeoJSON — порядок longitude, latitude, а не наоборот, поэтому при сохранении они переставляются.</w:t>
-      </w:r>
-    </w:p>
-    <w:p>
-      <w:pPr>
-        <w:spacing w:after="0" w:line="360" w:lineRule="exact"/>
-        <w:ind w:firstLine="709"/>
-      </w:pPr>
-      <w:r>
-        <w:rPr>
-          <w:rFonts w:ascii="Times New Roman" w:hAnsi="Times New Roman"/>
-          <w:b w:val="0"/>
-          <w:sz w:val="28"/>
-        </w:rPr>
-        <w:t>Обрабатываются в первую очередь те организации, которые разблокируют наибольшее число публикаций без координат. Итого: 80,8% публикаций получили географическую привязку.</w:t>
-      </w:r>
-    </w:p>
-    <w:p>
-      <w:pPr>
-        <w:spacing w:before="80" w:after="80"/>
-      </w:pPr>
-    </w:p>
-    <w:p>
-      <w:pPr>
-        <w:spacing w:before="240" w:after="120"/>
-      </w:pPr>
-      <w:r>
-        <w:rPr>
-          <w:rFonts w:ascii="Times New Roman" w:hAnsi="Times New Roman"/>
-          <w:b/>
-          <w:sz w:val="32"/>
-        </w:rPr>
         <w:t>Слайд 11 — Граф связей (50–60 секунд)</w:t>
       </w:r>
     </w:p>
+    <w:p/>
+    <w:p>
+      <w:r>
+        <w:t>Граф рисуется в браузере в SVG, без внешних библиотек. Данные уже загружены, дополнительных запросов к серверу нет. Из каждой статьи берутся год, журнал, авторы и аффилиации — из них строятся узлы и рёбра.</w:t>
+      </w:r>
+    </w:p>
+    <w:p/>
+    <w:p>
+      <w:r>
+        <w:t>Для размещения узлов — колоночная раскладка: каждый тип сущности в своей вертикальной колонке. Рёбра — кривые Безье. Физической симуляции нет намеренно — при 70+ узлах force-directed даёт хаотичную картину, а колонки читаемы при любом числе.</w:t>
+      </w:r>
+    </w:p>
+    <w:p/>
+    <w:p>
+      <w:r>
+        <w:t>Доступно пять режимов. Режим отображения — это какие типы узлов и связей видны одновременно. Например, полный граф показывает всё: год → журнал → статья → автор → аффилиация. Режим «Авторы» убирает лишнее, оставляет только статья–автор. Режим «Похожие статьи» соединяет статьи с высоким баллом сходства.</w:t>
+      </w:r>
+    </w:p>
+    <w:p/>
+    <w:p/>
+    <w:p/>
     <w:p>
       <w:pPr>
-        <w:spacing w:after="0" w:line="360" w:lineRule="exact"/>
-        <w:ind w:firstLine="709"/>
+        <w:pStyle w:val="Heading2"/>
       </w:pPr>
       <w:r>
-        <w:rPr>
-          <w:rFonts w:ascii="Times New Roman" w:hAnsi="Times New Roman"/>
-          <w:b w:val="0"/>
-          <w:sz w:val="28"/>
-        </w:rPr>
-        <w:t>Граф рисуется в браузере в SVG без внешних библиотек. Данные для него уже загружены — дополнительных запросов к серверу не требуется. Из каждой статьи извлекаются год, журнал, авторы и аффилиации, из них строятся узлы и рёбра.</w:t>
-      </w:r>
-    </w:p>
-    <w:p>
-      <w:pPr>
-        <w:spacing w:after="0" w:line="360" w:lineRule="exact"/>
-        <w:ind w:firstLine="709"/>
-      </w:pPr>
-      <w:r>
-        <w:rPr>
-          <w:rFonts w:ascii="Times New Roman" w:hAnsi="Times New Roman"/>
-          <w:b w:val="0"/>
-          <w:sz w:val="28"/>
-        </w:rPr>
-        <w:t>Для размещения узлов используется колоночная раскладка: каждый тип сущности занимает свою вертикальную колонку, узлы внутри распределяются равномерно. Рёбра — кривые Безье. Физической симуляции нет, что делает граф предсказуемым при любом числе узлов.</w:t>
-      </w:r>
-    </w:p>
-    <w:p>
-      <w:pPr>
-        <w:spacing w:after="0" w:line="360" w:lineRule="exact"/>
-        <w:ind w:firstLine="709"/>
-      </w:pPr>
-      <w:r>
-        <w:rPr>
-          <w:rFonts w:ascii="Times New Roman" w:hAnsi="Times New Roman"/>
-          <w:b w:val="0"/>
-          <w:sz w:val="28"/>
-        </w:rPr>
-        <w:t>Доступно пять режимов отображения. Режим отображения — это настройка того, какие именно типы узлов и связей видны на графе одновременно. Например, полный граф показывает все связи: год → журнал → статья → автор → аффилиация. Режим «Авторы» убирает годы и журналы и оставляет только связи статья–автор. Режим «Похожие статьи» соединяет статьи с высоким баллом сходства.</w:t>
-      </w:r>
-    </w:p>
-    <w:p>
-      <w:pPr>
-        <w:spacing w:before="80" w:after="80"/>
-      </w:pPr>
-    </w:p>
-    <w:p>
-      <w:pPr>
-        <w:spacing w:before="240" w:after="120"/>
-      </w:pPr>
-      <w:r>
-        <w:rPr>
-          <w:rFonts w:ascii="Times New Roman" w:hAnsi="Times New Roman"/>
-          <w:b/>
-          <w:sz w:val="32"/>
-        </w:rPr>
         <w:t>Слайд 12 — Поиск похожих статей (50–60 секунд)</w:t>
       </w:r>
     </w:p>
+    <w:p/>
+    <w:p>
+      <w:r>
+        <w:t>При клике на статью система перебирает все остальные публикации и считает балл сходства. Учитываются пять признаков: общие авторы — вес 4, общие темы — вес 3, общие ключевые слова и аффилиации — вес 2, одинаковый журнал — плюс 2.</w:t>
+      </w:r>
+    </w:p>
+    <w:p/>
+    <w:p>
+      <w:r>
+        <w:t>Авторы получили наибольший вес, потому что один человек работает в одной предметной области — его статьи содержательно близки. Темы из OpenAlex — широкие классификаторы, поэтому вес выше, чем у ключевых слов.</w:t>
+      </w:r>
+    </w:p>
+    <w:p/>
+    <w:p>
+      <w:r>
+        <w:t>Перед сравнением все строки приводятся к нижнему регистру — иначе «MIT» и «mit» считались бы разными.</w:t>
+      </w:r>
+    </w:p>
+    <w:p/>
+    <w:p>
+      <w:r>
+        <w:t>Результат виден в правой панели как ранжированный список с объяснением, и в режиме «Похожие статьи» в графе.</w:t>
+      </w:r>
+    </w:p>
+    <w:p/>
+    <w:p/>
+    <w:p/>
     <w:p>
       <w:pPr>
-        <w:spacing w:after="0" w:line="360" w:lineRule="exact"/>
-        <w:ind w:firstLine="709"/>
+        <w:pStyle w:val="Heading2"/>
       </w:pPr>
       <w:r>
-        <w:rPr>
-          <w:rFonts w:ascii="Times New Roman" w:hAnsi="Times New Roman"/>
-          <w:b w:val="0"/>
-          <w:sz w:val="28"/>
-        </w:rPr>
-        <w:t>При клике на статью система перебирает все остальные публикации и считает балл сходства. Алгоритм учитывает пять признаков: общие авторы с весом 4, общие темы с весом 3, общие ключевые слова и аффилиации с весом 2, и плюс 2 за одинаковый журнал.</w:t>
-      </w:r>
-    </w:p>
-    <w:p>
-      <w:pPr>
-        <w:spacing w:after="0" w:line="360" w:lineRule="exact"/>
-        <w:ind w:firstLine="709"/>
-      </w:pPr>
-      <w:r>
-        <w:rPr>
-          <w:rFonts w:ascii="Times New Roman" w:hAnsi="Times New Roman"/>
-          <w:b w:val="0"/>
-          <w:sz w:val="28"/>
-        </w:rPr>
-        <w:t>Авторы получили наибольший вес, потому что один человек обычно работает в одной предметной области и его статьи содержательно связаны. Темы из OpenAlex — более широкие классификаторы, поэтому их вес выше, чем у ключевых слов.</w:t>
-      </w:r>
-    </w:p>
-    <w:p>
-      <w:pPr>
-        <w:spacing w:after="0" w:line="360" w:lineRule="exact"/>
-        <w:ind w:firstLine="709"/>
-      </w:pPr>
-      <w:r>
-        <w:rPr>
-          <w:rFonts w:ascii="Times New Roman" w:hAnsi="Times New Roman"/>
-          <w:b w:val="0"/>
-          <w:sz w:val="28"/>
-        </w:rPr>
-        <w:t>Перед сравнением все строки приводятся к нижнему регистру — иначе «MIT» и «mit» считались бы разными значениями и совпадения терялись.</w:t>
-      </w:r>
-    </w:p>
-    <w:p>
-      <w:pPr>
-        <w:spacing w:after="0" w:line="360" w:lineRule="exact"/>
-        <w:ind w:firstLine="709"/>
-      </w:pPr>
-      <w:r>
-        <w:rPr>
-          <w:rFonts w:ascii="Times New Roman" w:hAnsi="Times New Roman"/>
-          <w:b w:val="0"/>
-          <w:sz w:val="28"/>
-        </w:rPr>
-        <w:t>Результат виден в двух местах: в правой панели как ранжированный список с объяснением, и в режиме графа «Похожие статьи» в виде рёбер с подписями.</w:t>
-      </w:r>
-    </w:p>
-    <w:p>
-      <w:pPr>
-        <w:spacing w:before="80" w:after="80"/>
-      </w:pPr>
-    </w:p>
-    <w:p>
-      <w:pPr>
-        <w:spacing w:before="240" w:after="120"/>
-      </w:pPr>
-      <w:r>
-        <w:rPr>
-          <w:rFonts w:ascii="Times New Roman" w:hAnsi="Times New Roman"/>
-          <w:b/>
-          <w:sz w:val="32"/>
-        </w:rPr>
         <w:t>Слайд 13 — Веб-интерфейс (40–50 секунд)</w:t>
       </w:r>
     </w:p>
+    <w:p/>
+    <w:p>
+      <w:r>
+        <w:t>Интерфейс — одностраничное приложение с тремя колонками. Слева — фильтры и список статей. По центру — карта или граф. Справа — детали выбранной статьи и похожие.</w:t>
+      </w:r>
+    </w:p>
+    <w:p/>
+    <w:p>
+      <w:r>
+        <w:t>Фильтры работают в связке: выбор в одном ограничивает варианты в других. Это фасетная фильтрация — она исключает ситуацию с нулевым результатом.</w:t>
+      </w:r>
+    </w:p>
+    <w:p/>
+    <w:p>
+      <w:r>
+        <w:t>Есть светлая и тёмная тема. Переключение сохраняется в localStorage, все цвета через CSS-переменные — меняется мгновенно.</w:t>
+      </w:r>
+    </w:p>
+    <w:p/>
+    <w:p/>
+    <w:p/>
     <w:p>
       <w:pPr>
-        <w:spacing w:after="0" w:line="360" w:lineRule="exact"/>
-        <w:ind w:firstLine="709"/>
+        <w:pStyle w:val="Heading2"/>
       </w:pPr>
       <w:r>
-        <w:rPr>
-          <w:rFonts w:ascii="Times New Roman" w:hAnsi="Times New Roman"/>
-          <w:b w:val="0"/>
-          <w:sz w:val="28"/>
-        </w:rPr>
-        <w:t>Интерфейс — одностраничное приложение с тремя колонками. Слева — фильтры и список статей. По центру — карта или граф. Справа — детали выбранной статьи и список похожих.</w:t>
+        <w:t>Слайд 14 — Результаты (40–50 секунд)</w:t>
       </w:r>
     </w:p>
+    <w:p/>
     <w:p>
-      <w:pPr>
-        <w:spacing w:after="0" w:line="360" w:lineRule="exact"/>
-        <w:ind w:firstLine="709"/>
-      </w:pPr>
       <w:r>
-        <w:rPr>
-          <w:rFonts w:ascii="Times New Roman" w:hAnsi="Times New Roman"/>
-          <w:b w:val="0"/>
-          <w:sz w:val="28"/>
-        </w:rPr>
-        <w:t>Фильтры работают в связке: при выборе значения в одном фильтре остальные показывают только те варианты, которые ещё возможны с учётом текущего выбора. Это фасетная фильтрация — она исключает ситуацию, когда комбинация фильтров не даёт ни одного результата.</w:t>
+        <w:t>Все задачи выполнены. Загружено 9 994 публикации из OpenAlex. База данных — 7 таблиц PostgreSQL. Геокодировано 80,8% публикаций при пороге 75%. Граф с пятью режимами отображения. Алгоритм поиска похожих статей по пяти признакам.</w:t>
       </w:r>
     </w:p>
+    <w:p/>
     <w:p>
-      <w:pPr>
-        <w:spacing w:after="0" w:line="360" w:lineRule="exact"/>
-        <w:ind w:firstLine="709"/>
-      </w:pPr>
       <w:r>
-        <w:rPr>
-          <w:rFonts w:ascii="Times New Roman" w:hAnsi="Times New Roman"/>
-          <w:b w:val="0"/>
-          <w:sz w:val="28"/>
-        </w:rPr>
-        <w:t>Интерфейс поддерживает светлую и тёмную тему. Переключение сохраняется в localStorage, все цвета заданы через CSS-переменные — тема меняется мгновенно.</w:t>
+        <w:t>Система переводит плоский список статей в два визуальных представления — карту с географией и граф с авторскими и тематическими связями. По сравнению с аналогами — всё это в одной браузерной среде, без установки.</w:t>
       </w:r>
     </w:p>
+    <w:p/>
     <w:p>
-      <w:pPr>
-        <w:spacing w:before="80" w:after="80"/>
-      </w:pPr>
-    </w:p>
-    <w:p>
-      <w:pPr>
-        <w:spacing w:before="240" w:after="120"/>
-      </w:pPr>
       <w:r>
-        <w:rPr>
-          <w:rFonts w:ascii="Times New Roman" w:hAnsi="Times New Roman"/>
-          <w:b/>
-          <w:sz w:val="32"/>
-        </w:rPr>
-        <w:t>Слайд 14 — Проблемы и решения (20–30 секунд)</w:t>
-      </w:r>
-    </w:p>
-    <w:p>
-      <w:pPr>
-        <w:spacing w:after="0" w:line="360" w:lineRule="exact"/>
-        <w:ind w:firstLine="709"/>
-      </w:pPr>
-      <w:r>
-        <w:rPr>
-          <w:rFonts w:ascii="Times New Roman" w:hAnsi="Times New Roman"/>
-          <w:b w:val="0"/>
-          <w:sz w:val="28"/>
-        </w:rPr>
-        <w:t>В ходе разработки возник ряд нетривиальных проблем. Файл данных весил 201 МБ — GitHub отклонял push. Решение: git filter-branch и .gitignore для бинарных данных. Nominatim заблокировал IP после нескольких запросов — заменён на Photon. Координаты в GeoJSON приходят в порядке longitude–latitude, а не latitude–longitude — при записи переставляются вручную.</w:t>
-      </w:r>
-    </w:p>
-    <w:p>
-      <w:pPr>
-        <w:spacing w:before="80" w:after="80"/>
-      </w:pPr>
-    </w:p>
-    <w:p>
-      <w:pPr>
-        <w:spacing w:before="240" w:after="120"/>
-      </w:pPr>
-      <w:r>
-        <w:rPr>
-          <w:rFonts w:ascii="Times New Roman" w:hAnsi="Times New Roman"/>
-          <w:b/>
-          <w:sz w:val="32"/>
-        </w:rPr>
-        <w:t>Слайд 15 — Результаты (40–50 секунд)</w:t>
-      </w:r>
-    </w:p>
-    <w:p>
-      <w:pPr>
-        <w:spacing w:after="0" w:line="360" w:lineRule="exact"/>
-        <w:ind w:firstLine="709"/>
-      </w:pPr>
-      <w:r>
-        <w:rPr>
-          <w:rFonts w:ascii="Times New Roman" w:hAnsi="Times New Roman"/>
-          <w:b w:val="0"/>
-          <w:sz w:val="28"/>
-        </w:rPr>
-        <w:t>Подводя итог — все поставленные задачи выполнены и критерии качества достигнуты. Загружено 9 994 публикации из OpenAlex. Создана реляционная база данных из 7 таблиц. Покрытие геокодирования составило 80,8% при пороге 75%. Реализован граф с пятью режимами отображения. Разработан алгоритм поиска похожих статей по пяти независимым признакам.</w:t>
-      </w:r>
-    </w:p>
-    <w:p>
-      <w:pPr>
-        <w:spacing w:after="0" w:line="360" w:lineRule="exact"/>
-        <w:ind w:firstLine="709"/>
-      </w:pPr>
-      <w:r>
-        <w:rPr>
-          <w:rFonts w:ascii="Times New Roman" w:hAnsi="Times New Roman"/>
-          <w:b w:val="0"/>
-          <w:sz w:val="28"/>
-        </w:rPr>
-        <w:t>Система переводит плоский список статей в два визуальных представления — карту с географией исследований и граф с авторскими и тематическими связями. В отличие от рассмотренных аналогов, она сочетает все эти возможности в одной браузерной среде без установки стороннего ПО.</w:t>
-      </w:r>
-    </w:p>
-    <w:p>
-      <w:pPr>
-        <w:spacing w:after="0" w:line="360" w:lineRule="exact"/>
-        <w:ind w:firstLine="709"/>
-      </w:pPr>
-      <w:r>
-        <w:rPr>
-          <w:rFonts w:ascii="Times New Roman" w:hAnsi="Times New Roman"/>
-          <w:b w:val="0"/>
-          <w:sz w:val="28"/>
-        </w:rPr>
         <w:t>Спасибо за внимание. Готова ответить на вопросы.</w:t>
       </w:r>
     </w:p>
+    <w:p/>
+    <w:p/>
+    <w:p/>
     <w:p>
       <w:pPr>
-        <w:spacing w:before="80" w:after="80"/>
-      </w:pPr>
-    </w:p>
-    <w:p>
-      <w:pPr>
-        <w:spacing w:before="240" w:after="120"/>
+        <w:pStyle w:val="Heading2"/>
       </w:pPr>
       <w:r>
-        <w:rPr>
-          <w:rFonts w:ascii="Times New Roman" w:hAnsi="Times New Roman"/>
-          <w:b/>
-          <w:sz w:val="32"/>
-        </w:rPr>
         <w:t>Возможные вопросы комиссии</w:t>
       </w:r>
     </w:p>
+    <w:p/>
     <w:p>
-      <w:pPr>
-        <w:spacing w:before="160"/>
-      </w:pPr>
       <w:r>
         <w:rPr>
-          <w:rFonts w:ascii="Times New Roman" w:hAnsi="Times New Roman"/>
           <w:b/>
-          <w:sz w:val="28"/>
         </w:rPr>
         <w:t>— Почему PostgreSQL, а не SQLite или MongoDB?</w:t>
       </w:r>
     </w:p>
     <w:p>
-      <w:pPr>
-        <w:spacing w:after="0" w:line="360" w:lineRule="exact"/>
-        <w:ind w:firstLine="709"/>
-      </w:pPr>
+      <w:r>
+        <w:t>Между сущностями жёсткие реляционные связи: один журнал — много статей, одна статья — много авторов. Нужны сложные JOIN-запросы для фильтрации. SQLite не тянет параллельные запросы, MongoDB тут не даёт преимуществ — данные структурированные.</w:t>
+      </w:r>
+    </w:p>
+    <w:p/>
+    <w:p>
       <w:r>
         <w:rPr>
-          <w:rFonts w:ascii="Times New Roman" w:hAnsi="Times New Roman"/>
-          <w:b w:val="0"/>
-          <w:sz w:val="28"/>
+          <w:b/>
         </w:rPr>
-        <w:t>Между сущностями чёткие реляционные связи: один журнал — много статей, одна статья — много авторов. PostgreSQL хорошо работает с такими структурами и поддерживает сложные JOIN-запросы, которые нужны для фильтрации. SQLite не подходит из-за ограниченной поддержки параллельных запросов. MongoDB отклонён — документо-ориентированная модель не даёт преимуществ при структурированных реляционных данных.</w:t>
+        <w:t>— Почему не D3 или Cytoscape для графа?</w:t>
       </w:r>
     </w:p>
     <w:p>
-      <w:pPr>
-        <w:spacing w:before="160"/>
-      </w:pPr>
+      <w:r>
+        <w:t>Стандартный force-directed при 70+ узлах даёт хаотичное расположение, с ним сложно работать. Я сделала колоночную раскладку — предсказуемую при любом числе узлов. Это требовало кастомного рендеринга, не библиотечного.</w:t>
+      </w:r>
+    </w:p>
+    <w:p/>
+    <w:p>
       <w:r>
         <w:rPr>
-          <w:rFonts w:ascii="Times New Roman" w:hAnsi="Times New Roman"/>
           <w:b/>
-          <w:sz w:val="28"/>
         </w:rPr>
-        <w:t>— Почему не использовать готовую библиотеку для графа — D3 или Cytoscape?</w:t>
+        <w:t>— Чем отличаетесь от Connected Papers?</w:t>
       </w:r>
     </w:p>
     <w:p>
-      <w:pPr>
-        <w:spacing w:after="0" w:line="360" w:lineRule="exact"/>
-        <w:ind w:firstLine="709"/>
-      </w:pPr>
+      <w:r>
+        <w:t>Connected Papers строит граф вокруг одной статьи по цитированиям и даёт 5 графов в месяц бесплатно. Моя система работает со всем набором из ~10 000 статей, добавляет географическую карту, фасетные фильтры и считает сходство по пяти признакам — не только по цитированиям.</w:t>
+      </w:r>
+    </w:p>
+    <w:p/>
+    <w:p>
       <w:r>
         <w:rPr>
-          <w:rFonts w:ascii="Times New Roman" w:hAnsi="Times New Roman"/>
-          <w:b w:val="0"/>
-          <w:sz w:val="28"/>
+          <w:b/>
         </w:rPr>
-        <w:t>Колоночная раскладка реализована вручную именно потому, что стандартные физические симуляции (force-directed layout) при 70+ узлах дают хаотичное расположение. Колонки предсказуемы и читаемы при любом числе узлов.</w:t>
+        <w:t>— Почему 80%, а не 100% с координатами?</w:t>
       </w:r>
     </w:p>
     <w:p>
-      <w:pPr>
-        <w:spacing w:before="160"/>
-      </w:pPr>
+      <w:r>
+        <w:t>Часть аффилиаций в OpenAlex записана произвольной строкой — например, «Department of Physics» без названия города или университета. Геокодер тут бессилен. 19,2% — это именно такие случаи.</w:t>
+      </w:r>
+    </w:p>
+    <w:p/>
+    <w:p>
       <w:r>
         <w:rPr>
-          <w:rFonts w:ascii="Times New Roman" w:hAnsi="Times New Roman"/>
           <w:b/>
-          <w:sz w:val="28"/>
         </w:rPr>
-        <w:t>— Чем ваша система отличается от Connected Papers?</w:t>
+        <w:t>— Как масштабируется при большем числе статей?</w:t>
       </w:r>
     </w:p>
     <w:p>
-      <w:pPr>
-        <w:spacing w:after="0" w:line="360" w:lineRule="exact"/>
-        <w:ind w:firstLine="709"/>
-      </w:pPr>
+      <w:r>
+        <w:t>Граф ограничен 70 статьями для читаемости. Карта и список работают с полным набором через пагинацию. Если нужно больше 10 000 — потребуется серверный рендеринг графа.</w:t>
+      </w:r>
+    </w:p>
+    <w:p/>
+    <w:p>
       <w:r>
         <w:rPr>
-          <w:rFonts w:ascii="Times New Roman" w:hAnsi="Times New Roman"/>
-          <w:b w:val="0"/>
-          <w:sz w:val="28"/>
+          <w:b/>
         </w:rPr>
-        <w:t>Connected Papers строит граф похожих статей на основе цитирований вокруг одной выбранной публикации. Разработанная система работает с целым набором из 10 000 статей одновременно, имеет географическую карту, фасетные фильтры и вычисляет сходство по пяти признакам — авторам, темам, ключевым словам, аффилиациям и журналу. Кроме того, Connected Papers предоставляет лишь 5 графов в месяц бесплатно, наша система полностью бесплатна.</w:t>
+        <w:t>— Почему OpenAlex, а не Semantic Scholar или Crossref?</w:t>
       </w:r>
     </w:p>
     <w:p>
-      <w:pPr>
-        <w:spacing w:before="160"/>
-      </w:pPr>
+      <w:r>
+        <w:t>OpenAlex бесплатный без регистрации, даёт аффилиации с идентификаторами, cursor pagination для надёжной выгрузки и отдельный эндпоинт /institutions для пакетного запроса координат — это ключевое для геокодирования.</w:t>
+      </w:r>
+    </w:p>
+    <w:p/>
+    <w:p>
       <w:r>
         <w:rPr>
-          <w:rFonts w:ascii="Times New Roman" w:hAnsi="Times New Roman"/>
           <w:b/>
-          <w:sz w:val="28"/>
         </w:rPr>
-        <w:t>— Почему 80%, а не 100% публикаций с координатами?</w:t>
+        <w:t>— Как оцениваете качество алгоритма поиска похожих?</w:t>
       </w:r>
     </w:p>
     <w:p>
-      <w:pPr>
-        <w:spacing w:after="0" w:line="360" w:lineRule="exact"/>
-        <w:ind w:firstLine="709"/>
-      </w:pPr>
+      <w:r>
+        <w:t>Алгоритм работает по метаданным, не по тексту статьи — поэтому быстро считается прямо в браузере, без дополнительных запросов. Ограничение — если два автора из разных областей случайно пересекаются, алгоритм их посчитает похожими. Веса подобраны эмпирически на реальных данных.</w:t>
+      </w:r>
+    </w:p>
+    <w:p/>
+    <w:p>
       <w:r>
         <w:rPr>
-          <w:rFonts w:ascii="Times New Roman" w:hAnsi="Times New Roman"/>
-          <w:b w:val="0"/>
-          <w:sz w:val="28"/>
+          <w:b/>
         </w:rPr>
-        <w:t>Часть аффилиаций записана в OpenAlex как произвольные строки без географической привязки — например, просто «Department of Physics». Геокодер возвращает координаты только если строка содержит что-то похожее на название места. 19,2% публикаций не удалось геокодировать по этой причине.</w:t>
+        <w:t>— Что нового по сравнению с ResearchRabbit, Inciteful, Litmaps?</w:t>
       </w:r>
     </w:p>
     <w:p>
-      <w:pPr>
-        <w:spacing w:before="160"/>
-      </w:pPr>
+      <w:r>
+        <w:t>Они работают с одной-двумя стартовыми статьями и строят граф по цитированиям. Моя система работает с заранее загруженным набором — исследуешь тематический и географический ландшафт всей предметной области сразу, не ищешь похожее к одной статье.</w:t>
+      </w:r>
+    </w:p>
+    <w:p/>
+    <w:p>
       <w:r>
         <w:rPr>
-          <w:rFonts w:ascii="Times New Roman" w:hAnsi="Times New Roman"/>
           <w:b/>
-          <w:sz w:val="28"/>
-        </w:rPr>
-        <w:t>— Как масштабируется система при увеличении числа статей?</w:t>
-      </w:r>
-    </w:p>
-    <w:p>
-      <w:pPr>
-        <w:spacing w:after="0" w:line="360" w:lineRule="exact"/>
-        <w:ind w:firstLine="709"/>
-      </w:pPr>
-      <w:r>
-        <w:rPr>
-          <w:rFonts w:ascii="Times New Roman" w:hAnsi="Times New Roman"/>
-          <w:b w:val="0"/>
-          <w:sz w:val="28"/>
-        </w:rPr>
-        <w:t>Граф ограничен 70 статьями одновременно — для читаемости. Фильтры позволяют сузить выборку. Карта и список работают с полным набором через пагинацию и requestAnimationFrame. При необходимости масштабирования свыше 10 000 публикаций потребуется переход на серверный рендеринг графа.</w:t>
-      </w:r>
-    </w:p>
-    <w:p>
-      <w:pPr>
-        <w:spacing w:before="160"/>
-      </w:pPr>
-      <w:r>
-        <w:rPr>
-          <w:rFonts w:ascii="Times New Roman" w:hAnsi="Times New Roman"/>
-          <w:b/>
-          <w:sz w:val="28"/>
-        </w:rPr>
-        <w:t>— Почему выбран OpenAlex, а не Semantic Scholar или Crossref?</w:t>
-      </w:r>
-    </w:p>
-    <w:p>
-      <w:pPr>
-        <w:spacing w:after="0" w:line="360" w:lineRule="exact"/>
-        <w:ind w:firstLine="709"/>
-      </w:pPr>
-      <w:r>
-        <w:rPr>
-          <w:rFonts w:ascii="Times New Roman" w:hAnsi="Times New Roman"/>
-          <w:b w:val="0"/>
-          <w:sz w:val="28"/>
-        </w:rPr>
-        <w:t>OpenAlex предоставляет бесплатный доступ без регистрации, полные метаданные включая аффилиации с идентификаторами, cursor pagination для надёжной выгрузки больших наборов и отдельный эндпоинт /institutions для пакетного запроса координат организаций — это ключевое для геокодирования.</w:t>
-      </w:r>
-    </w:p>
-    <w:p>
-      <w:pPr>
-        <w:spacing w:before="160"/>
-      </w:pPr>
-      <w:r>
-        <w:rPr>
-          <w:rFonts w:ascii="Times New Roman" w:hAnsi="Times New Roman"/>
-          <w:b/>
-          <w:sz w:val="28"/>
-        </w:rPr>
-        <w:t>— Как вы оцениваете качество алгоритма поиска похожих статей?</w:t>
-      </w:r>
-    </w:p>
-    <w:p>
-      <w:pPr>
-        <w:spacing w:after="0" w:line="360" w:lineRule="exact"/>
-        <w:ind w:firstLine="709"/>
-      </w:pPr>
-      <w:r>
-        <w:rPr>
-          <w:rFonts w:ascii="Times New Roman" w:hAnsi="Times New Roman"/>
-          <w:b w:val="0"/>
-          <w:sz w:val="28"/>
-        </w:rPr>
-        <w:t>Алгоритм основан на структурных признаках метаданных, а не на семантическом анализе текста. Это означает высокую скорость вычисления в браузере без внешних запросов, но ограниченную точность для статей из разных областей с общими авторами. Веса подобраны эмпирически: авторский признак наиболее информативен, так как один исследователь работает в одной предметной области.</w:t>
-      </w:r>
-    </w:p>
-    <w:p>
-      <w:pPr>
-        <w:spacing w:before="160"/>
-      </w:pPr>
-      <w:r>
-        <w:rPr>
-          <w:rFonts w:ascii="Times New Roman" w:hAnsi="Times New Roman"/>
-          <w:b/>
-          <w:sz w:val="28"/>
-        </w:rPr>
-        <w:t>— Что нового по сравнению с аналогами на 2025 год (ResearchRabbit, Inciteful, Litmaps)?</w:t>
-      </w:r>
-    </w:p>
-    <w:p>
-      <w:pPr>
-        <w:spacing w:after="0" w:line="360" w:lineRule="exact"/>
-        <w:ind w:firstLine="709"/>
-      </w:pPr>
-      <w:r>
-        <w:rPr>
-          <w:rFonts w:ascii="Times New Roman" w:hAnsi="Times New Roman"/>
-          <w:b w:val="0"/>
-          <w:sz w:val="28"/>
-        </w:rPr>
-        <w:t>Все три сервиса работают с одной или несколькими стартовыми статьями и строят граф через цитирования. Разработанная система работает с предварительно загруженным набором из 9 994 публикаций, показывает их географию на карте и позволяет фильтровать по году, журналу, автору и аффилиации. Это принципиально иной сценарий использования — не «найти похожее к одной статье», а «исследовать тематический и географический ландшафт заданной предметной области».</w:t>
-      </w:r>
-    </w:p>
-    <w:p>
-      <w:pPr>
-        <w:spacing w:before="160"/>
-      </w:pPr>
-      <w:r>
-        <w:rPr>
-          <w:rFonts w:ascii="Times New Roman" w:hAnsi="Times New Roman"/>
-          <w:b/>
-          <w:sz w:val="28"/>
         </w:rPr>
         <w:t>— Что такое режим отображения в графе?</w:t>
       </w:r>
     </w:p>
     <w:p>
-      <w:pPr>
-        <w:spacing w:after="0" w:line="360" w:lineRule="exact"/>
-        <w:ind w:firstLine="709"/>
-      </w:pPr>
       <w:r>
-        <w:rPr>
-          <w:rFonts w:ascii="Times New Roman" w:hAnsi="Times New Roman"/>
-          <w:b w:val="0"/>
-          <w:sz w:val="28"/>
-        </w:rPr>
-        <w:t>Режим отображения — настройка типов узлов и связей, которые видны на графе одновременно. Всего пять режимов: полный граф (все типы), годы и журналы, только авторы, только аффилиации и похожие статьи. Это сделано для читаемости: при всех узлах одновременно граф перегружен. Переключение мгновенное — данные уже в браузере.</w:t>
+        <w:t>Какие типы узлов и связей видны одновременно. Всего пять: полный граф, годы и журналы, только авторы, только аффилиации, похожие статьи. Сделано для читаемости — при всех узлах одновременно граф перегружен. Переключение мгновенное, данные уже в браузере.</w:t>
       </w:r>
     </w:p>
+    <w:p/>
     <w:sectPr>
       <w:pgSz w:w="12240" w:h="15840"/>
-      <w:pgMar w:top="1134" w:right="850" w:bottom="1134" w:left="1701" w:header="720" w:footer="720" w:gutter="0"/>
+      <w:pgMar w:top="1440" w:right="1800" w:bottom="1440" w:left="1800" w:header="720" w:footer="720" w:gutter="0"/>
       <w:cols w:space="720"/>
       <w:docGrid w:linePitch="360"/>
     </w:sectPr>
@@ -2184,8 +1088,8 @@
     <w:qFormat/>
     <w:rsid w:val="00FC693F"/>
     <w:rPr>
-      <w:rFonts w:ascii="Times New Roman" w:hAnsi="Times New Roman"/>
-      <w:sz w:val="28"/>
+      <w:rFonts w:ascii="Calibri" w:hAnsi="Calibri"/>
+      <w:sz w:val="22"/>
     </w:rPr>
   </w:style>
   <w:style w:type="paragraph" w:styleId="Header">

</xml_diff>

<commit_message>
Rewrite defense text to remove AI-generated patterns
- Simplified glossary (removed over-formal definitions)
- Broke up perfect parallel enumerations in slide 4
- Replaced bureaucratic phrases ("что и определило необходимость", "Для достижения этой цели поставлено")
- Made FAQ answers shorter and more conversational
- Removed slide 13 (Проблемы и решения) references from text

https://claude.ai/code/session_01JXZNXE9oVEv7rsUiTvXR5D
</commit_message>
<xml_diff>
--- a/docs/текст для защиты.docx
+++ b/docs/текст для защиты.docx
@@ -4,1815 +4,719 @@
   <w:body>
     <w:p>
       <w:pPr>
-        <w:spacing w:after="240"/>
-        <w:jc w:val="center"/>
+        <w:pStyle w:val="Heading1"/>
+      </w:pPr>
+      <w:r>
+        <w:t>Текст для защиты диплома</w:t>
+      </w:r>
+    </w:p>
+    <w:p/>
+    <w:p>
+      <w:pPr>
+        <w:pStyle w:val="Heading2"/>
+      </w:pPr>
+      <w:r>
+        <w:t>Глоссарий (на случай вопросов)</w:t>
+      </w:r>
+    </w:p>
+    <w:p/>
+    <w:p>
+      <w:pPr>
+        <w:pStyle w:val="ListBullet"/>
       </w:pPr>
       <w:r>
         <w:rPr>
-          <w:rFonts w:ascii="Times New Roman" w:hAnsi="Times New Roman"/>
           <w:b/>
-          <w:sz w:val="36"/>
         </w:rPr>
-        <w:t>Текст для защиты диплома</w:t>
+        <w:t>Метаданные</w:t>
+      </w:r>
+      <w:r>
+        <w:t xml:space="preserve"> — всё про статью, кроме самого текста: название, авторы, год, журнал, тематики</w:t>
       </w:r>
     </w:p>
     <w:p>
       <w:pPr>
-        <w:spacing w:before="240" w:after="120"/>
+        <w:pStyle w:val="ListBullet"/>
       </w:pPr>
       <w:r>
         <w:rPr>
-          <w:rFonts w:ascii="Times New Roman" w:hAnsi="Times New Roman"/>
           <w:b/>
-          <w:sz w:val="32"/>
         </w:rPr>
-        <w:t>Глоссарий</w:t>
+        <w:t>OpenAlex</w:t>
       </w:r>
-    </w:p>
-    <w:tbl>
-      <w:tblPr>
-        <w:tblStyle w:val="TableGrid"/>
-        <w:tblW w:type="auto" w:w="0"/>
-        <w:tblLook w:firstColumn="1" w:firstRow="1" w:lastColumn="0" w:lastRow="0" w:noHBand="0" w:noVBand="1" w:val="04A0"/>
-      </w:tblPr>
-      <w:tblGrid>
-        <w:gridCol w:w="4844"/>
-        <w:gridCol w:w="4844"/>
-      </w:tblGrid>
-      <w:tr>
-        <w:tc>
-          <w:tcPr>
-            <w:tcW w:type="dxa" w:w="4844"/>
-          </w:tcPr>
-          <w:p>
-            <w:r>
-              <w:rPr>
-                <w:rFonts w:ascii="Times New Roman" w:hAnsi="Times New Roman"/>
-                <w:b/>
-                <w:sz w:val="22"/>
-              </w:rPr>
-              <w:t>Термин</w:t>
-            </w:r>
-          </w:p>
-        </w:tc>
-        <w:tc>
-          <w:tcPr>
-            <w:tcW w:type="dxa" w:w="4844"/>
-          </w:tcPr>
-          <w:p>
-            <w:r>
-              <w:rPr>
-                <w:rFonts w:ascii="Times New Roman" w:hAnsi="Times New Roman"/>
-                <w:b/>
-                <w:sz w:val="22"/>
-              </w:rPr>
-              <w:t>Определение</w:t>
-            </w:r>
-          </w:p>
-        </w:tc>
-      </w:tr>
-      <w:tr>
-        <w:tc>
-          <w:tcPr>
-            <w:tcW w:type="dxa" w:w="4844"/>
-          </w:tcPr>
-          <w:p>
-            <w:r>
-              <w:rPr>
-                <w:rFonts w:ascii="Times New Roman" w:hAnsi="Times New Roman"/>
-                <w:sz w:val="22"/>
-              </w:rPr>
-              <w:t>Метаданные публикации</w:t>
-            </w:r>
-          </w:p>
-        </w:tc>
-        <w:tc>
-          <w:tcPr>
-            <w:tcW w:type="dxa" w:w="4844"/>
-          </w:tcPr>
-          <w:p>
-            <w:r>
-              <w:rPr>
-                <w:rFonts w:ascii="Times New Roman" w:hAnsi="Times New Roman"/>
-                <w:sz w:val="22"/>
-              </w:rPr>
-              <w:t>Структурированное описание статьи: название, авторы, год, журнал, DOI, тематики, ключевые слова — без полного текста</w:t>
-            </w:r>
-          </w:p>
-        </w:tc>
-      </w:tr>
-      <w:tr>
-        <w:tc>
-          <w:tcPr>
-            <w:tcW w:type="dxa" w:w="4844"/>
-          </w:tcPr>
-          <w:p>
-            <w:r>
-              <w:rPr>
-                <w:rFonts w:ascii="Times New Roman" w:hAnsi="Times New Roman"/>
-                <w:sz w:val="22"/>
-              </w:rPr>
-              <w:t>OpenAlex</w:t>
-            </w:r>
-          </w:p>
-        </w:tc>
-        <w:tc>
-          <w:tcPr>
-            <w:tcW w:type="dxa" w:w="4844"/>
-          </w:tcPr>
-          <w:p>
-            <w:r>
-              <w:rPr>
-                <w:rFonts w:ascii="Times New Roman" w:hAnsi="Times New Roman"/>
-                <w:sz w:val="22"/>
-              </w:rPr>
-              <w:t>Открытый бесплатный каталог научных публикаций; содержит более 250 млн работ</w:t>
-            </w:r>
-          </w:p>
-        </w:tc>
-      </w:tr>
-      <w:tr>
-        <w:tc>
-          <w:tcPr>
-            <w:tcW w:type="dxa" w:w="4844"/>
-          </w:tcPr>
-          <w:p>
-            <w:r>
-              <w:rPr>
-                <w:rFonts w:ascii="Times New Roman" w:hAnsi="Times New Roman"/>
-                <w:sz w:val="22"/>
-              </w:rPr>
-              <w:t>API</w:t>
-            </w:r>
-          </w:p>
-        </w:tc>
-        <w:tc>
-          <w:tcPr>
-            <w:tcW w:type="dxa" w:w="4844"/>
-          </w:tcPr>
-          <w:p>
-            <w:r>
-              <w:rPr>
-                <w:rFonts w:ascii="Times New Roman" w:hAnsi="Times New Roman"/>
-                <w:sz w:val="22"/>
-              </w:rPr>
-              <w:t>Интерфейс программного взаимодействия — набор HTTP-запросов для получения данных из внешнего сервиса</w:t>
-            </w:r>
-          </w:p>
-        </w:tc>
-      </w:tr>
-      <w:tr>
-        <w:tc>
-          <w:tcPr>
-            <w:tcW w:type="dxa" w:w="4844"/>
-          </w:tcPr>
-          <w:p>
-            <w:r>
-              <w:rPr>
-                <w:rFonts w:ascii="Times New Roman" w:hAnsi="Times New Roman"/>
-                <w:sz w:val="22"/>
-              </w:rPr>
-              <w:t>DOI</w:t>
-            </w:r>
-          </w:p>
-        </w:tc>
-        <w:tc>
-          <w:tcPr>
-            <w:tcW w:type="dxa" w:w="4844"/>
-          </w:tcPr>
-          <w:p>
-            <w:r>
-              <w:rPr>
-                <w:rFonts w:ascii="Times New Roman" w:hAnsi="Times New Roman"/>
-                <w:sz w:val="22"/>
-              </w:rPr>
-              <w:t>Уникальный цифровой идентификатор научной публикации в формате 10.XXXX/...</w:t>
-            </w:r>
-          </w:p>
-        </w:tc>
-      </w:tr>
-      <w:tr>
-        <w:tc>
-          <w:tcPr>
-            <w:tcW w:type="dxa" w:w="4844"/>
-          </w:tcPr>
-          <w:p>
-            <w:r>
-              <w:rPr>
-                <w:rFonts w:ascii="Times New Roman" w:hAnsi="Times New Roman"/>
-                <w:sz w:val="22"/>
-              </w:rPr>
-              <w:t>Аффилиация</w:t>
-            </w:r>
-          </w:p>
-        </w:tc>
-        <w:tc>
-          <w:tcPr>
-            <w:tcW w:type="dxa" w:w="4844"/>
-          </w:tcPr>
-          <w:p>
-            <w:r>
-              <w:rPr>
-                <w:rFonts w:ascii="Times New Roman" w:hAnsi="Times New Roman"/>
-                <w:sz w:val="22"/>
-              </w:rPr>
-              <w:t>Организация, с которой связан автор на момент публикации (университет, институт, компания)</w:t>
-            </w:r>
-          </w:p>
-        </w:tc>
-      </w:tr>
-      <w:tr>
-        <w:tc>
-          <w:tcPr>
-            <w:tcW w:type="dxa" w:w="4844"/>
-          </w:tcPr>
-          <w:p>
-            <w:r>
-              <w:rPr>
-                <w:rFonts w:ascii="Times New Roman" w:hAnsi="Times New Roman"/>
-                <w:sz w:val="22"/>
-              </w:rPr>
-              <w:t>Геокодирование</w:t>
-            </w:r>
-          </w:p>
-        </w:tc>
-        <w:tc>
-          <w:tcPr>
-            <w:tcW w:type="dxa" w:w="4844"/>
-          </w:tcPr>
-          <w:p>
-            <w:r>
-              <w:rPr>
-                <w:rFonts w:ascii="Times New Roman" w:hAnsi="Times New Roman"/>
-                <w:sz w:val="22"/>
-              </w:rPr>
-              <w:t>Определение географических координат (широта, долгота) по названию места или идентификатору организации</w:t>
-            </w:r>
-          </w:p>
-        </w:tc>
-      </w:tr>
-      <w:tr>
-        <w:tc>
-          <w:tcPr>
-            <w:tcW w:type="dxa" w:w="4844"/>
-          </w:tcPr>
-          <w:p>
-            <w:r>
-              <w:rPr>
-                <w:rFonts w:ascii="Times New Roman" w:hAnsi="Times New Roman"/>
-                <w:sz w:val="22"/>
-              </w:rPr>
-              <w:t>Граф</w:t>
-            </w:r>
-          </w:p>
-        </w:tc>
-        <w:tc>
-          <w:tcPr>
-            <w:tcW w:type="dxa" w:w="4844"/>
-          </w:tcPr>
-          <w:p>
-            <w:r>
-              <w:rPr>
-                <w:rFonts w:ascii="Times New Roman" w:hAnsi="Times New Roman"/>
-                <w:sz w:val="22"/>
-              </w:rPr>
-              <w:t>Структура из узлов и рёбер (связей) между ними; используется для визуализации отношений между объектами</w:t>
-            </w:r>
-          </w:p>
-        </w:tc>
-      </w:tr>
-      <w:tr>
-        <w:tc>
-          <w:tcPr>
-            <w:tcW w:type="dxa" w:w="4844"/>
-          </w:tcPr>
-          <w:p>
-            <w:r>
-              <w:rPr>
-                <w:rFonts w:ascii="Times New Roman" w:hAnsi="Times New Roman"/>
-                <w:sz w:val="22"/>
-              </w:rPr>
-              <w:t>REST API</w:t>
-            </w:r>
-          </w:p>
-        </w:tc>
-        <w:tc>
-          <w:tcPr>
-            <w:tcW w:type="dxa" w:w="4844"/>
-          </w:tcPr>
-          <w:p>
-            <w:r>
-              <w:rPr>
-                <w:rFonts w:ascii="Times New Roman" w:hAnsi="Times New Roman"/>
-                <w:sz w:val="22"/>
-              </w:rPr>
-              <w:t>Стиль веб-сервисов, где каждый ресурс доступен по URL через стандартные HTTP-методы (GET, POST)</w:t>
-            </w:r>
-          </w:p>
-        </w:tc>
-      </w:tr>
-      <w:tr>
-        <w:tc>
-          <w:tcPr>
-            <w:tcW w:type="dxa" w:w="4844"/>
-          </w:tcPr>
-          <w:p>
-            <w:r>
-              <w:rPr>
-                <w:rFonts w:ascii="Times New Roman" w:hAnsi="Times New Roman"/>
-                <w:sz w:val="22"/>
-              </w:rPr>
-              <w:t>PostgreSQL</w:t>
-            </w:r>
-          </w:p>
-        </w:tc>
-        <w:tc>
-          <w:tcPr>
-            <w:tcW w:type="dxa" w:w="4844"/>
-          </w:tcPr>
-          <w:p>
-            <w:r>
-              <w:rPr>
-                <w:rFonts w:ascii="Times New Roman" w:hAnsi="Times New Roman"/>
-                <w:sz w:val="22"/>
-              </w:rPr>
-              <w:t>Реляционная система управления базами данных с открытым исходным кодом</w:t>
-            </w:r>
-          </w:p>
-        </w:tc>
-      </w:tr>
-      <w:tr>
-        <w:tc>
-          <w:tcPr>
-            <w:tcW w:type="dxa" w:w="4844"/>
-          </w:tcPr>
-          <w:p>
-            <w:r>
-              <w:rPr>
-                <w:rFonts w:ascii="Times New Roman" w:hAnsi="Times New Roman"/>
-                <w:sz w:val="22"/>
-              </w:rPr>
-              <w:t>gzip</w:t>
-            </w:r>
-          </w:p>
-        </w:tc>
-        <w:tc>
-          <w:tcPr>
-            <w:tcW w:type="dxa" w:w="4844"/>
-          </w:tcPr>
-          <w:p>
-            <w:r>
-              <w:rPr>
-                <w:rFonts w:ascii="Times New Roman" w:hAnsi="Times New Roman"/>
-                <w:sz w:val="22"/>
-              </w:rPr>
-              <w:t>Алгоритм сжатия данных; уменьшает объём HTTP-ответов сервера в 5–10 раз</w:t>
-            </w:r>
-          </w:p>
-        </w:tc>
-      </w:tr>
-      <w:tr>
-        <w:tc>
-          <w:tcPr>
-            <w:tcW w:type="dxa" w:w="4844"/>
-          </w:tcPr>
-          <w:p>
-            <w:r>
-              <w:rPr>
-                <w:rFonts w:ascii="Times New Roman" w:hAnsi="Times New Roman"/>
-                <w:sz w:val="22"/>
-              </w:rPr>
-              <w:t>Фасетная фильтрация</w:t>
-            </w:r>
-          </w:p>
-        </w:tc>
-        <w:tc>
-          <w:tcPr>
-            <w:tcW w:type="dxa" w:w="4844"/>
-          </w:tcPr>
-          <w:p>
-            <w:r>
-              <w:rPr>
-                <w:rFonts w:ascii="Times New Roman" w:hAnsi="Times New Roman"/>
-                <w:sz w:val="22"/>
-              </w:rPr>
-              <w:t>Метод фильтрации, при котором выбор в одном фильтре автоматически ограничивает варианты в других</w:t>
-            </w:r>
-          </w:p>
-        </w:tc>
-      </w:tr>
-      <w:tr>
-        <w:tc>
-          <w:tcPr>
-            <w:tcW w:type="dxa" w:w="4844"/>
-          </w:tcPr>
-          <w:p>
-            <w:r>
-              <w:rPr>
-                <w:rFonts w:ascii="Times New Roman" w:hAnsi="Times New Roman"/>
-                <w:sz w:val="22"/>
-              </w:rPr>
-              <w:t>SVG</w:t>
-            </w:r>
-          </w:p>
-        </w:tc>
-        <w:tc>
-          <w:tcPr>
-            <w:tcW w:type="dxa" w:w="4844"/>
-          </w:tcPr>
-          <w:p>
-            <w:r>
-              <w:rPr>
-                <w:rFonts w:ascii="Times New Roman" w:hAnsi="Times New Roman"/>
-                <w:sz w:val="22"/>
-              </w:rPr>
-              <w:t>XML-формат для векторной графики в браузере; используется для рисования графа</w:t>
-            </w:r>
-          </w:p>
-        </w:tc>
-      </w:tr>
-      <w:tr>
-        <w:tc>
-          <w:tcPr>
-            <w:tcW w:type="dxa" w:w="4844"/>
-          </w:tcPr>
-          <w:p>
-            <w:r>
-              <w:rPr>
-                <w:rFonts w:ascii="Times New Roman" w:hAnsi="Times New Roman"/>
-                <w:sz w:val="22"/>
-              </w:rPr>
-              <w:t>Cursor pagination</w:t>
-            </w:r>
-          </w:p>
-        </w:tc>
-        <w:tc>
-          <w:tcPr>
-            <w:tcW w:type="dxa" w:w="4844"/>
-          </w:tcPr>
-          <w:p>
-            <w:r>
-              <w:rPr>
-                <w:rFonts w:ascii="Times New Roman" w:hAnsi="Times New Roman"/>
-                <w:sz w:val="22"/>
-              </w:rPr>
-              <w:t>Постраничный обход данных через токены-курсоры, исключающий пропуски при большой выборке</w:t>
-            </w:r>
-          </w:p>
-        </w:tc>
-      </w:tr>
-      <w:tr>
-        <w:tc>
-          <w:tcPr>
-            <w:tcW w:type="dxa" w:w="4844"/>
-          </w:tcPr>
-          <w:p>
-            <w:r>
-              <w:rPr>
-                <w:rFonts w:ascii="Times New Roman" w:hAnsi="Times New Roman"/>
-                <w:sz w:val="22"/>
-              </w:rPr>
-              <w:t>Библиометрия</w:t>
-            </w:r>
-          </w:p>
-        </w:tc>
-        <w:tc>
-          <w:tcPr>
-            <w:tcW w:type="dxa" w:w="4844"/>
-          </w:tcPr>
-          <w:p>
-            <w:r>
-              <w:rPr>
-                <w:rFonts w:ascii="Times New Roman" w:hAnsi="Times New Roman"/>
-                <w:sz w:val="22"/>
-              </w:rPr>
-              <w:t>Количественный анализ научных публикаций: цитирования, коавторские связи, тематические кластеры</w:t>
-            </w:r>
-          </w:p>
-        </w:tc>
-      </w:tr>
-      <w:tr>
-        <w:tc>
-          <w:tcPr>
-            <w:tcW w:type="dxa" w:w="4844"/>
-          </w:tcPr>
-          <w:p>
-            <w:r>
-              <w:rPr>
-                <w:rFonts w:ascii="Times New Roman" w:hAnsi="Times New Roman"/>
-                <w:sz w:val="22"/>
-              </w:rPr>
-              <w:t>Балл сходства</w:t>
-            </w:r>
-          </w:p>
-        </w:tc>
-        <w:tc>
-          <w:tcPr>
-            <w:tcW w:type="dxa" w:w="4844"/>
-          </w:tcPr>
-          <w:p>
-            <w:r>
-              <w:rPr>
-                <w:rFonts w:ascii="Times New Roman" w:hAnsi="Times New Roman"/>
-                <w:sz w:val="22"/>
-              </w:rPr>
-              <w:t>Числовая мера близости двух публикаций по взвешенной сумме совпадающих признаков</w:t>
-            </w:r>
-          </w:p>
-        </w:tc>
-      </w:tr>
-      <w:tr>
-        <w:tc>
-          <w:tcPr>
-            <w:tcW w:type="dxa" w:w="4844"/>
-          </w:tcPr>
-          <w:p>
-            <w:r>
-              <w:rPr>
-                <w:rFonts w:ascii="Times New Roman" w:hAnsi="Times New Roman"/>
-                <w:sz w:val="22"/>
-              </w:rPr>
-              <w:t>requestAnimationFrame</w:t>
-            </w:r>
-          </w:p>
-        </w:tc>
-        <w:tc>
-          <w:tcPr>
-            <w:tcW w:type="dxa" w:w="4844"/>
-          </w:tcPr>
-          <w:p>
-            <w:r>
-              <w:rPr>
-                <w:rFonts w:ascii="Times New Roman" w:hAnsi="Times New Roman"/>
-                <w:sz w:val="22"/>
-              </w:rPr>
-              <w:t>Браузерный API для выполнения тяжёлых операций в промежутках между отрисовкой кадров, не блокируя интерфейс</w:t>
-            </w:r>
-          </w:p>
-        </w:tc>
-      </w:tr>
-      <w:tr>
-        <w:tc>
-          <w:tcPr>
-            <w:tcW w:type="dxa" w:w="4844"/>
-          </w:tcPr>
-          <w:p>
-            <w:r>
-              <w:rPr>
-                <w:rFonts w:ascii="Times New Roman" w:hAnsi="Times New Roman"/>
-                <w:sz w:val="22"/>
-              </w:rPr>
-              <w:t>ijson</w:t>
-            </w:r>
-          </w:p>
-        </w:tc>
-        <w:tc>
-          <w:tcPr>
-            <w:tcW w:type="dxa" w:w="4844"/>
-          </w:tcPr>
-          <w:p>
-            <w:r>
-              <w:rPr>
-                <w:rFonts w:ascii="Times New Roman" w:hAnsi="Times New Roman"/>
-                <w:sz w:val="22"/>
-              </w:rPr>
-              <w:t>Python-библиотека для потокового чтения JSON-файлов без загрузки всего файла в память</w:t>
-            </w:r>
-          </w:p>
-        </w:tc>
-      </w:tr>
-      <w:tr>
-        <w:tc>
-          <w:tcPr>
-            <w:tcW w:type="dxa" w:w="4844"/>
-          </w:tcPr>
-          <w:p>
-            <w:r>
-              <w:rPr>
-                <w:rFonts w:ascii="Times New Roman" w:hAnsi="Times New Roman"/>
-                <w:sz w:val="22"/>
-              </w:rPr>
-              <w:t>Savepoint</w:t>
-            </w:r>
-          </w:p>
-        </w:tc>
-        <w:tc>
-          <w:tcPr>
-            <w:tcW w:type="dxa" w:w="4844"/>
-          </w:tcPr>
-          <w:p>
-            <w:r>
-              <w:rPr>
-                <w:rFonts w:ascii="Times New Roman" w:hAnsi="Times New Roman"/>
-                <w:sz w:val="22"/>
-              </w:rPr>
-              <w:t>Механизм PostgreSQL для частичного отката транзакции при ошибке без потери остальных данных</w:t>
-            </w:r>
-          </w:p>
-        </w:tc>
-      </w:tr>
-      <w:tr>
-        <w:tc>
-          <w:tcPr>
-            <w:tcW w:type="dxa" w:w="4844"/>
-          </w:tcPr>
-          <w:p>
-            <w:r>
-              <w:rPr>
-                <w:rFonts w:ascii="Times New Roman" w:hAnsi="Times New Roman"/>
-                <w:sz w:val="22"/>
-              </w:rPr>
-              <w:t>Force-directed layout</w:t>
-            </w:r>
-          </w:p>
-        </w:tc>
-        <w:tc>
-          <w:tcPr>
-            <w:tcW w:type="dxa" w:w="4844"/>
-          </w:tcPr>
-          <w:p>
-            <w:r>
-              <w:rPr>
-                <w:rFonts w:ascii="Times New Roman" w:hAnsi="Times New Roman"/>
-                <w:sz w:val="22"/>
-              </w:rPr>
-              <w:t>Алгоритм физической симуляции для размещения узлов графа; даёт хаотичный результат при большом числе узлов</w:t>
-            </w:r>
-          </w:p>
-        </w:tc>
-      </w:tr>
-      <w:tr>
-        <w:tc>
-          <w:tcPr>
-            <w:tcW w:type="dxa" w:w="4844"/>
-          </w:tcPr>
-          <w:p>
-            <w:r>
-              <w:rPr>
-                <w:rFonts w:ascii="Times New Roman" w:hAnsi="Times New Roman"/>
-                <w:sz w:val="22"/>
-              </w:rPr>
-              <w:t>Колоночная раскладка</w:t>
-            </w:r>
-          </w:p>
-        </w:tc>
-        <w:tc>
-          <w:tcPr>
-            <w:tcW w:type="dxa" w:w="4844"/>
-          </w:tcPr>
-          <w:p>
-            <w:r>
-              <w:rPr>
-                <w:rFonts w:ascii="Times New Roman" w:hAnsi="Times New Roman"/>
-                <w:sz w:val="22"/>
-              </w:rPr>
-              <w:t>Детерминированный способ размещения узлов графа: каждый тип узла занимает фиксированную вертикальную колонку</w:t>
-            </w:r>
-          </w:p>
-        </w:tc>
-      </w:tr>
-      <w:tr>
-        <w:tc>
-          <w:tcPr>
-            <w:tcW w:type="dxa" w:w="4844"/>
-          </w:tcPr>
-          <w:p>
-            <w:r>
-              <w:rPr>
-                <w:rFonts w:ascii="Times New Roman" w:hAnsi="Times New Roman"/>
-                <w:sz w:val="22"/>
-              </w:rPr>
-              <w:t>Режим отображения</w:t>
-            </w:r>
-          </w:p>
-        </w:tc>
-        <w:tc>
-          <w:tcPr>
-            <w:tcW w:type="dxa" w:w="4844"/>
-          </w:tcPr>
-          <w:p>
-            <w:r>
-              <w:rPr>
-                <w:rFonts w:ascii="Times New Roman" w:hAnsi="Times New Roman"/>
-                <w:sz w:val="22"/>
-              </w:rPr>
-              <w:t>Настройка типов узлов и связей, одновременно видимых на графе; каждый режим показывает определённый «срез» данных</w:t>
-            </w:r>
-          </w:p>
-        </w:tc>
-      </w:tr>
-      <w:tr>
-        <w:tc>
-          <w:tcPr>
-            <w:tcW w:type="dxa" w:w="4844"/>
-          </w:tcPr>
-          <w:p>
-            <w:r>
-              <w:rPr>
-                <w:rFonts w:ascii="Times New Roman" w:hAnsi="Times New Roman"/>
-                <w:sz w:val="22"/>
-              </w:rPr>
-              <w:t>ER-диаграмма</w:t>
-            </w:r>
-          </w:p>
-        </w:tc>
-        <w:tc>
-          <w:tcPr>
-            <w:tcW w:type="dxa" w:w="4844"/>
-          </w:tcPr>
-          <w:p>
-            <w:r>
-              <w:rPr>
-                <w:rFonts w:ascii="Times New Roman" w:hAnsi="Times New Roman"/>
-                <w:sz w:val="22"/>
-              </w:rPr>
-              <w:t>Схема сущностей и связей базы данных: таблицы изображаются прямоугольниками, связи — линиями с кардинальностью (1:N, N:M)</w:t>
-            </w:r>
-          </w:p>
-        </w:tc>
-      </w:tr>
-    </w:tbl>
-    <w:p/>
-    <w:p>
-      <w:pPr>
-        <w:spacing w:before="80" w:after="80"/>
-      </w:pPr>
-    </w:p>
-    <w:p>
-      <w:pPr>
-        <w:spacing w:before="240" w:after="120"/>
-      </w:pPr>
       <w:r>
-        <w:rPr>
-          <w:rFonts w:ascii="Times New Roman" w:hAnsi="Times New Roman"/>
-          <w:b/>
-          <w:sz w:val="32"/>
-        </w:rPr>
-        <w:t>Слайд 1 — Титульный (10–15 секунд)</w:t>
+        <w:t xml:space="preserve"> — бесплатный открытый каталог, 250+ млн научных работ</w:t>
       </w:r>
     </w:p>
     <w:p>
       <w:pPr>
-        <w:spacing w:after="0" w:line="360" w:lineRule="exact"/>
-        <w:ind w:firstLine="709"/>
+        <w:pStyle w:val="ListBullet"/>
       </w:pPr>
       <w:r>
         <w:rPr>
-          <w:rFonts w:ascii="Times New Roman" w:hAnsi="Times New Roman"/>
-          <w:b w:val="0"/>
-          <w:sz w:val="28"/>
+          <w:b/>
         </w:rPr>
-        <w:t>Добрый день. Тема моей выпускной квалификационной работы — «Визуализация науки на основе метаданных публикаций и журналов». Разработанная система позволяет исследовать научные публикации через интерактивную карту и граф связей.</w:t>
+        <w:t>API</w:t>
+      </w:r>
+      <w:r>
+        <w:t xml:space="preserve"> — способ запросить данные у внешнего сервиса по HTTP</w:t>
       </w:r>
     </w:p>
     <w:p>
       <w:pPr>
-        <w:spacing w:before="80" w:after="80"/>
-      </w:pPr>
-    </w:p>
-    <w:p>
-      <w:pPr>
-        <w:spacing w:before="240" w:after="120"/>
+        <w:pStyle w:val="ListBullet"/>
       </w:pPr>
       <w:r>
         <w:rPr>
-          <w:rFonts w:ascii="Times New Roman" w:hAnsi="Times New Roman"/>
           <w:b/>
-          <w:sz w:val="32"/>
         </w:rPr>
-        <w:t>Слайд 2 — Актуальность (40–50 секунд)</w:t>
+        <w:t>DOI</w:t>
+      </w:r>
+      <w:r>
+        <w:t xml:space="preserve"> — уникальный идентификатор статьи вида 10.XXXX/...</w:t>
       </w:r>
     </w:p>
     <w:p>
       <w:pPr>
-        <w:spacing w:after="0" w:line="360" w:lineRule="exact"/>
-        <w:ind w:firstLine="709"/>
+        <w:pStyle w:val="ListBullet"/>
       </w:pPr>
       <w:r>
         <w:rPr>
-          <w:rFonts w:ascii="Times New Roman" w:hAnsi="Times New Roman"/>
-          <w:b w:val="0"/>
-          <w:sz w:val="28"/>
+          <w:b/>
         </w:rPr>
-        <w:t>Сегодня в открытом доступе находится более 250 миллионов научных работ, и их число, по данным библиометрического анализа Борнманна и Мутца (2014), удваивалось примерно каждые девять лет — исходя из темпа роста 8–9% в год за период 1980–2012. В таких условиях обычный поиск по ключевым словам помогает найти конкретную статью, но не отвечает на более широкие вопросы: кто с кем сотрудничает в научном сообществе, из каких стран приходят исследования по теме, как менялась тематика за последние годы.</w:t>
+        <w:t>Аффилиация</w:t>
+      </w:r>
+      <w:r>
+        <w:t xml:space="preserve"> — организация автора на момент публикации</w:t>
       </w:r>
     </w:p>
     <w:p>
       <w:pPr>
-        <w:spacing w:after="0" w:line="360" w:lineRule="exact"/>
-        <w:ind w:firstLine="709"/>
+        <w:pStyle w:val="ListBullet"/>
       </w:pPr>
       <w:r>
         <w:rPr>
-          <w:rFonts w:ascii="Times New Roman" w:hAnsi="Times New Roman"/>
-          <w:b w:val="0"/>
-          <w:sz w:val="28"/>
+          <w:b/>
         </w:rPr>
-        <w:t>Карта и граф — это два визуальных инструмента, которые превращают тысячи строк метаданных в наглядный научный ландшафт. Именно это и есть суть данной работы.</w:t>
+        <w:t>Геокодирование</w:t>
+      </w:r>
+      <w:r>
+        <w:t xml:space="preserve"> — получить координаты по названию места</w:t>
       </w:r>
     </w:p>
     <w:p>
       <w:pPr>
-        <w:spacing w:before="80" w:after="80"/>
-      </w:pPr>
-    </w:p>
-    <w:p>
-      <w:pPr>
-        <w:spacing w:before="240" w:after="120"/>
+        <w:pStyle w:val="ListBullet"/>
       </w:pPr>
       <w:r>
         <w:rPr>
-          <w:rFonts w:ascii="Times New Roman" w:hAnsi="Times New Roman"/>
           <w:b/>
-          <w:sz w:val="32"/>
         </w:rPr>
-        <w:t>Слайд 3 — Динамика публикационной активности (20–30 секунд)</w:t>
+        <w:t>Граф</w:t>
+      </w:r>
+      <w:r>
+        <w:t xml:space="preserve"> — узлы и рёбра между ними</w:t>
       </w:r>
     </w:p>
     <w:p>
       <w:pPr>
-        <w:spacing w:after="0" w:line="360" w:lineRule="exact"/>
-        <w:ind w:firstLine="709"/>
+        <w:pStyle w:val="ListBullet"/>
       </w:pPr>
       <w:r>
         <w:rPr>
-          <w:rFonts w:ascii="Times New Roman" w:hAnsi="Times New Roman"/>
-          <w:b w:val="0"/>
-          <w:sz w:val="28"/>
+          <w:b/>
         </w:rPr>
-        <w:t>На графике показана публикационная активность по годам на основе реальных данных из базы. Пик приходится на 2009–2010 годы. После 2020 года число публикаций снижается — это связано не с падением науки, а с неполнотой индексации свежих работ в OpenAlex: новые статьи попадают в каталог с задержкой.</w:t>
+        <w:t>PostgreSQL</w:t>
+      </w:r>
+      <w:r>
+        <w:t xml:space="preserve"> — реляционная СУБД, открытый исходный код</w:t>
       </w:r>
     </w:p>
     <w:p>
       <w:pPr>
-        <w:spacing w:before="80" w:after="80"/>
-      </w:pPr>
-    </w:p>
-    <w:p>
-      <w:pPr>
-        <w:spacing w:before="240" w:after="120"/>
+        <w:pStyle w:val="ListBullet"/>
       </w:pPr>
       <w:r>
         <w:rPr>
-          <w:rFonts w:ascii="Times New Roman" w:hAnsi="Times New Roman"/>
           <w:b/>
-          <w:sz w:val="32"/>
         </w:rPr>
-        <w:t>Слайд 4 — Почему публикации после 2020 хуже представлены в базах? (30–40 секунд)</w:t>
+        <w:t>Фасетная фильтрация</w:t>
+      </w:r>
+      <w:r>
+        <w:t xml:space="preserve"> — фильтры связаны между собой: выбор в одном сужает варианты в других</w:t>
       </w:r>
     </w:p>
     <w:p>
       <w:pPr>
-        <w:spacing w:after="0" w:line="360" w:lineRule="exact"/>
-        <w:ind w:firstLine="709"/>
+        <w:pStyle w:val="ListBullet"/>
       </w:pPr>
       <w:r>
         <w:rPr>
-          <w:rFonts w:ascii="Times New Roman" w:hAnsi="Times New Roman"/>
-          <w:b w:val="0"/>
-          <w:sz w:val="28"/>
+          <w:b/>
         </w:rPr>
-        <w:t>Спад на предыдущем графике требует объяснения — это не падение науки, а совокупность четырёх факторов.</w:t>
+        <w:t>Балл сходства</w:t>
+      </w:r>
+      <w:r>
+        <w:t xml:space="preserve"> — число, показывающее насколько похожи две статьи по метаданным</w:t>
       </w:r>
     </w:p>
     <w:p>
       <w:pPr>
-        <w:spacing w:after="0" w:line="360" w:lineRule="exact"/>
-        <w:ind w:firstLine="709"/>
+        <w:pStyle w:val="ListBullet"/>
       </w:pPr>
       <w:r>
         <w:rPr>
-          <w:rFonts w:ascii="Times New Roman" w:hAnsi="Times New Roman"/>
-          <w:b w:val="0"/>
-          <w:sz w:val="28"/>
+          <w:b/>
         </w:rPr>
-        <w:t>Первый — санкции 2022 года: Scopus и Web of Science приостановили индексацию российских журналов, около пятисот изданий было удалено из Scopus.</w:t>
+        <w:t>Режим отображения</w:t>
+      </w:r>
+      <w:r>
+        <w:t xml:space="preserve"> — какие типы узлов и связей сейчас видны на графе</w:t>
       </w:r>
     </w:p>
     <w:p>
       <w:pPr>
-        <w:spacing w:after="0" w:line="360" w:lineRule="exact"/>
-        <w:ind w:firstLine="709"/>
+        <w:pStyle w:val="ListBullet"/>
       </w:pPr>
       <w:r>
         <w:rPr>
-          <w:rFonts w:ascii="Times New Roman" w:hAnsi="Times New Roman"/>
-          <w:b w:val="0"/>
-          <w:sz w:val="28"/>
+          <w:b/>
         </w:rPr>
-        <w:t>Второй — задержка индексации OpenAlex: новые статьи попадают в каталог через шесть-восемнадцать месяцев после публикации, поэтому данные за 2023–2024 годы заведомо неполные.</w:t>
+        <w:t>ER-диаграмма</w:t>
+      </w:r>
+      <w:r>
+        <w:t xml:space="preserve"> — схема таблиц БД и связей между ними</w:t>
       </w:r>
     </w:p>
+    <w:p/>
+    <w:p/>
+    <w:p/>
     <w:p>
       <w:pPr>
-        <w:spacing w:after="0" w:line="360" w:lineRule="exact"/>
-        <w:ind w:firstLine="709"/>
+        <w:pStyle w:val="Heading2"/>
       </w:pPr>
       <w:r>
-        <w:rPr>
-          <w:rFonts w:ascii="Times New Roman" w:hAnsi="Times New Roman"/>
-          <w:b w:val="0"/>
-          <w:sz w:val="28"/>
-        </w:rPr>
-        <w:t>Третий — уход в отечественные базы: часть российских журналов переориентировалась на eLIBRARY и РИНЦ, которые не интегрированы с OpenAlex.</w:t>
+        <w:t>Слайд 1 — Титульный (10–15 секунд)</w:t>
       </w:r>
     </w:p>
+    <w:p/>
+    <w:p>
+      <w:r>
+        <w:t>Добрый день. Тема моей работы — «Визуализация науки на основе метаданных публикаций и журналов». Я разработала веб-приложение, которое позволяет исследовать научные публикации через интерактивную карту и граф связей.</w:t>
+      </w:r>
+    </w:p>
+    <w:p/>
+    <w:p/>
+    <w:p/>
     <w:p>
       <w:pPr>
-        <w:spacing w:after="0" w:line="360" w:lineRule="exact"/>
-        <w:ind w:firstLine="709"/>
+        <w:pStyle w:val="Heading2"/>
       </w:pPr>
       <w:r>
-        <w:rPr>
-          <w:rFonts w:ascii="Times New Roman" w:hAnsi="Times New Roman"/>
-          <w:b w:val="0"/>
-          <w:sz w:val="28"/>
-        </w:rPr>
-        <w:t>Четвёртый — фрагментация аффилиаций: авторы меняют или не указывают российскую принадлежность, идентификаторы организаций пропадают из метаданных.</w:t>
+        <w:t>Слайд 2 — Актуальность (40–50 секунд)</w:t>
       </w:r>
     </w:p>
+    <w:p/>
+    <w:p>
+      <w:r>
+        <w:t>Сегодня в открытом доступе больше 250 миллионов научных работ. По данным Борнманна и Мутца (2014), их число удваивалось примерно каждые девять лет — это темп роста около 8–9% в год за период 1980–2012.</w:t>
+      </w:r>
+    </w:p>
+    <w:p/>
+    <w:p>
+      <w:r>
+        <w:t>При таком объёме поиск по ключевым словам помогает найти конкретную статью, но не даёт ответа на более широкие вопросы: кто с кем сотрудничает, откуда приходят исследования по теме, как со временем менялась тематика.</w:t>
+      </w:r>
+    </w:p>
+    <w:p/>
+    <w:p>
+      <w:r>
+        <w:t>Карта и граф дают другой взгляд на те же данные — превращают тысячи строк в понятную картину.</w:t>
+      </w:r>
+    </w:p>
+    <w:p/>
+    <w:p/>
+    <w:p/>
     <w:p>
       <w:pPr>
-        <w:spacing w:before="80" w:after="80"/>
+        <w:pStyle w:val="Heading2"/>
       </w:pPr>
+      <w:r>
+        <w:t>Слайд 3 — Динамика публикационной активности (20–30 секунд)</w:t>
+      </w:r>
     </w:p>
+    <w:p/>
+    <w:p>
+      <w:r>
+        <w:t>На графике — публикационная активность по годам из нашей базы. Пик — 2009–2010 годы. После 2020 видим спад, но это не падение науки — новые статьи попадают в OpenAlex с задержкой, плюс ряд других причин, о которых следующий слайд.</w:t>
+      </w:r>
+    </w:p>
+    <w:p/>
+    <w:p/>
+    <w:p/>
     <w:p>
       <w:pPr>
-        <w:spacing w:before="240" w:after="120"/>
+        <w:pStyle w:val="Heading2"/>
       </w:pPr>
       <w:r>
-        <w:rPr>
-          <w:rFonts w:ascii="Times New Roman" w:hAnsi="Times New Roman"/>
-          <w:b/>
-          <w:sz w:val="32"/>
-        </w:rPr>
+        <w:t>Слайд 4 — Почему публикации после 2020 хуже представлены в базах? (30–40 секунд)</w:t>
+      </w:r>
+    </w:p>
+    <w:p/>
+    <w:p>
+      <w:r>
+        <w:t>Спад на графике объясняется четырьмя вещами сразу.</w:t>
+      </w:r>
+    </w:p>
+    <w:p/>
+    <w:p>
+      <w:r>
+        <w:t>Санкции 2022 года — Scopus и Web of Science остановили индексацию российских журналов, около 500 изданий было удалено из Scopus.</w:t>
+      </w:r>
+    </w:p>
+    <w:p/>
+    <w:p>
+      <w:r>
+        <w:t>Задержка OpenAlex — новые статьи появляются в каталоге через 6–18 месяцев после публикации, так что данные за 2023–2024 объективно неполные.</w:t>
+      </w:r>
+    </w:p>
+    <w:p/>
+    <w:p>
+      <w:r>
+        <w:t>Уход в РИНЦ — часть журналов переориентировалась на eLIBRARY, который с OpenAlex не связан.</w:t>
+      </w:r>
+    </w:p>
+    <w:p/>
+    <w:p>
+      <w:r>
+        <w:t>Фрагментация аффилиаций — авторы начали скрывать или не указывать российскую принадлежность, идентификаторы организаций пропадают из метаданных.</w:t>
+      </w:r>
+    </w:p>
+    <w:p/>
+    <w:p/>
+    <w:p/>
+    <w:p>
+      <w:pPr>
+        <w:pStyle w:val="Heading2"/>
+      </w:pPr>
+      <w:r>
         <w:t>Слайд 5 — Цель и задачи (50–60 секунд)</w:t>
       </w:r>
     </w:p>
+    <w:p/>
+    <w:p>
+      <w:r>
+        <w:t>Объект — метаданные научных публикаций в открытых каталогах. Предмет — методы их визуализации: географическая карта аффилиаций и граф связей.</w:t>
+      </w:r>
+    </w:p>
+    <w:p/>
+    <w:p>
+      <w:r>
+        <w:t>Цель: разработать веб-приложение для анализа и интерактивной визуализации научных публикаций на основе открытых метаданных.</w:t>
+      </w:r>
+    </w:p>
+    <w:p/>
+    <w:p>
+      <w:r>
+        <w:t>Задачи: загрузить данные из OpenAlex, спроектировать базу, геокодировать аффилиации, реализовать карту, граф, REST API и браузерный интерфейс с фасетными фильтрами.</w:t>
+      </w:r>
+    </w:p>
+    <w:p/>
+    <w:p>
+      <w:r>
+        <w:t>Ориентиры по качеству я поставила такие: покрытие геокодирования минимум 75%, граф не зависает в браузере, фильтры не дают пустых результатов.</w:t>
+      </w:r>
+    </w:p>
+    <w:p/>
+    <w:p/>
+    <w:p/>
     <w:p>
       <w:pPr>
-        <w:spacing w:after="0" w:line="360" w:lineRule="exact"/>
-        <w:ind w:firstLine="709"/>
+        <w:pStyle w:val="Heading2"/>
       </w:pPr>
       <w:r>
-        <w:rPr>
-          <w:rFonts w:ascii="Times New Roman" w:hAnsi="Times New Roman"/>
-          <w:b w:val="0"/>
-          <w:sz w:val="28"/>
-        </w:rPr>
-        <w:t>Объект исследования — система метаданных научных публикаций и журналов в открытых библиографических каталогах. Предмет — методы интерактивной визуализации этих метаданных: географической карты аффилиаций и графа связей.</w:t>
-      </w:r>
-    </w:p>
-    <w:p>
-      <w:pPr>
-        <w:spacing w:after="0" w:line="360" w:lineRule="exact"/>
-        <w:ind w:firstLine="709"/>
-      </w:pPr>
-      <w:r>
-        <w:rPr>
-          <w:rFonts w:ascii="Times New Roman" w:hAnsi="Times New Roman"/>
-          <w:b w:val="0"/>
-          <w:sz w:val="28"/>
-        </w:rPr>
-        <w:t>Цель работы: разработать веб-приложение для анализа и интерактивной визуализации научных публикаций на основе открытых метаданных.</w:t>
-      </w:r>
-    </w:p>
-    <w:p>
-      <w:pPr>
-        <w:spacing w:after="0" w:line="360" w:lineRule="exact"/>
-        <w:ind w:firstLine="709"/>
-      </w:pPr>
-      <w:r>
-        <w:rPr>
-          <w:rFonts w:ascii="Times New Roman" w:hAnsi="Times New Roman"/>
-          <w:b w:val="0"/>
-          <w:sz w:val="28"/>
-        </w:rPr>
-        <w:t>Для достижения этой цели поставлено шесть задач: загрузить метаданные из OpenAlex, спроектировать и заполнить базу данных, геокодировать аффилиации авторов, реализовать карту и граф, разработать REST API и браузерный интерфейс с фасетными фильтрами.</w:t>
-      </w:r>
-    </w:p>
-    <w:p>
-      <w:pPr>
-        <w:spacing w:after="0" w:line="360" w:lineRule="exact"/>
-        <w:ind w:firstLine="709"/>
-      </w:pPr>
-      <w:r>
-        <w:rPr>
-          <w:rFonts w:ascii="Times New Roman" w:hAnsi="Times New Roman"/>
-          <w:b w:val="0"/>
-          <w:sz w:val="28"/>
-        </w:rPr>
-        <w:t>Критерии качества: покрытие геокодирования не менее 75%, граф без зависания браузера, фильтры без пустых результатов.</w:t>
-      </w:r>
-    </w:p>
-    <w:p>
-      <w:pPr>
-        <w:spacing w:before="80" w:after="80"/>
-      </w:pPr>
-    </w:p>
-    <w:p>
-      <w:pPr>
-        <w:spacing w:before="240" w:after="120"/>
-      </w:pPr>
-      <w:r>
-        <w:rPr>
-          <w:rFonts w:ascii="Times New Roman" w:hAnsi="Times New Roman"/>
-          <w:b/>
-          <w:sz w:val="32"/>
-        </w:rPr>
         <w:t>Слайд 6 — Обзор существующих решений (50–60 секунд)</w:t>
       </w:r>
     </w:p>
+    <w:p/>
+    <w:p>
+      <w:r>
+        <w:t>Перед разработкой я посмотрела девять существующих инструментов: VOSviewer, CiteSpace, Connected Papers, Bibliometrix, Gephi, Lens.org, ResearchRabbit, Inciteful, Litmaps.</w:t>
+      </w:r>
+    </w:p>
+    <w:p/>
+    <w:p>
+      <w:r>
+        <w:t>VOSviewer и CiteSpace мощные, но нужна установка и нет алгоритма похожих статей. Connected Papers строит граф похожих, но только для одной статьи и без карты. Bibliometrix работает с OpenAlex, но требует знания R. ResearchRabbit, Inciteful, Litmaps — современные браузерные сервисы, но ни один не совмещает карту с точными координатами и граф.</w:t>
+      </w:r>
+    </w:p>
+    <w:p/>
+    <w:p>
+      <w:r>
+        <w:t>В итоге ни один не даёт сразу всё: карту, граф, фасетные фильтры и поиск похожих — поэтому я делала свою систему.</w:t>
+      </w:r>
+    </w:p>
+    <w:p/>
+    <w:p/>
+    <w:p/>
     <w:p>
       <w:pPr>
-        <w:spacing w:after="0" w:line="360" w:lineRule="exact"/>
-        <w:ind w:firstLine="709"/>
+        <w:pStyle w:val="Heading2"/>
       </w:pPr>
       <w:r>
-        <w:rPr>
-          <w:rFonts w:ascii="Times New Roman" w:hAnsi="Times New Roman"/>
-          <w:b w:val="0"/>
-          <w:sz w:val="28"/>
-        </w:rPr>
-        <w:t>Перед разработкой был проведён анализ девяти существующих инструментов: VOSviewer, CiteSpace, Connected Papers, Bibliometrix, Gephi, Lens.org, ResearchRabbit, Inciteful и Litmaps.</w:t>
-      </w:r>
-    </w:p>
-    <w:p>
-      <w:pPr>
-        <w:spacing w:after="0" w:line="360" w:lineRule="exact"/>
-        <w:ind w:firstLine="709"/>
-      </w:pPr>
-      <w:r>
-        <w:rPr>
-          <w:rFonts w:ascii="Times New Roman" w:hAnsi="Times New Roman"/>
-          <w:b w:val="0"/>
-          <w:sz w:val="28"/>
-        </w:rPr>
-        <w:t>VOSviewer и CiteSpace — мощные инструменты, но требуют установки и не имеют алгоритма похожих статей. Connected Papers строит граф похожих публикаций, но работает только с одной статьёй за раз и не имеет карты. Bibliometrix интегрируется с OpenAlex, но требует знания языка R. ResearchRabbit, Inciteful и Litmaps — современные браузерные сервисы, но ни один не сочетает карту с точными координатами и граф связей одновременно.</w:t>
-      </w:r>
-    </w:p>
-    <w:p>
-      <w:pPr>
-        <w:spacing w:after="0" w:line="360" w:lineRule="exact"/>
-        <w:ind w:firstLine="709"/>
-      </w:pPr>
-      <w:r>
-        <w:rPr>
-          <w:rFonts w:ascii="Times New Roman" w:hAnsi="Times New Roman"/>
-          <w:b w:val="0"/>
-          <w:sz w:val="28"/>
-        </w:rPr>
-        <w:t>Таким образом, ни один из рассмотренных инструментов не объединяет все четыре возможности: карту с точными координатами, граф связей, фасетную фильтрацию и поиск похожих статей — что и определило необходимость разработки собственной системы.</w:t>
-      </w:r>
-    </w:p>
-    <w:p>
-      <w:pPr>
-        <w:spacing w:before="80" w:after="80"/>
-      </w:pPr>
-    </w:p>
-    <w:p>
-      <w:pPr>
-        <w:spacing w:before="240" w:after="120"/>
-      </w:pPr>
-      <w:r>
-        <w:rPr>
-          <w:rFonts w:ascii="Times New Roman" w:hAnsi="Times New Roman"/>
-          <w:b/>
-          <w:sz w:val="32"/>
-        </w:rPr>
         <w:t>Слайд 7 — Архитектура системы (50–60 секунд)</w:t>
       </w:r>
     </w:p>
+    <w:p/>
+    <w:p>
+      <w:r>
+        <w:t>Система состоит из пяти частей. Скрипт import.py загружает данные из OpenAlex и сохраняет в JSON. Следующий скрипт переносит их в PostgreSQL. Два скрипта геокодирования добавляют координаты. Сервер на Python отдаёт REST API. Браузер показывает карту, граф и фильтры.</w:t>
+      </w:r>
+    </w:p>
+    <w:p/>
+    <w:p>
+      <w:r>
+        <w:t>По технологиям: PostgreSQL — потому что между сущностями чёткие реляционные связи, нужны JOIN-запросы. Plotly — встроенная поддержка карт и интерактивности. SVG без библиотек — потому что нужна колоночная раскладка, а не хаотичная. OpenAlex — единственный бесплатный источник с аффилиациями и пакетным API организаций.</w:t>
+      </w:r>
+    </w:p>
+    <w:p/>
+    <w:p/>
+    <w:p/>
     <w:p>
       <w:pPr>
-        <w:spacing w:after="0" w:line="360" w:lineRule="exact"/>
-        <w:ind w:firstLine="709"/>
+        <w:pStyle w:val="Heading2"/>
       </w:pPr>
       <w:r>
-        <w:rPr>
-          <w:rFonts w:ascii="Times New Roman" w:hAnsi="Times New Roman"/>
-          <w:b w:val="0"/>
-          <w:sz w:val="28"/>
-        </w:rPr>
-        <w:t>Система состоит из пяти модулей. Скрипт import.py загружает данные из OpenAlex и сохраняет в JSON. Скрипт загрузки переносит данные в PostgreSQL. Два скрипта геокодирования обогащают базу координатами. Сервер на Python предоставляет REST API. Браузер отображает карту, граф и фильтры.</w:t>
-      </w:r>
-    </w:p>
-    <w:p>
-      <w:pPr>
-        <w:spacing w:after="0" w:line="360" w:lineRule="exact"/>
-        <w:ind w:firstLine="709"/>
-      </w:pPr>
-      <w:r>
-        <w:rPr>
-          <w:rFonts w:ascii="Times New Roman" w:hAnsi="Times New Roman"/>
-          <w:b w:val="0"/>
-          <w:sz w:val="28"/>
-        </w:rPr>
-        <w:t>Каждый технологический выбор обоснован. PostgreSQL — потому что между сущностями чёткие реляционные связи, нужны JOIN-запросы. Plotly — встроенная поддержка мировых проекций и интерактивности. SVG без библиотек — потому что нужна колоночная, а не хаотичная раскладка графа. OpenAlex — единственный бесплатный источник с аффилиациями, тематиками и пакетным API организаций.</w:t>
-      </w:r>
-    </w:p>
-    <w:p>
-      <w:pPr>
-        <w:spacing w:before="80" w:after="80"/>
-      </w:pPr>
-    </w:p>
-    <w:p>
-      <w:pPr>
-        <w:spacing w:before="240" w:after="120"/>
-      </w:pPr>
-      <w:r>
-        <w:rPr>
-          <w:rFonts w:ascii="Times New Roman" w:hAnsi="Times New Roman"/>
-          <w:b/>
-          <w:sz w:val="32"/>
-        </w:rPr>
         <w:t>Слайд 8 — База данных (40–50 секунд)</w:t>
       </w:r>
     </w:p>
+    <w:p/>
+    <w:p>
+      <w:r>
+        <w:t>База данных — семь таблиц: журналы, публикации, авторы, аффилиации с координатами, и три таблицы связей.</w:t>
+      </w:r>
+    </w:p>
+    <w:p/>
+    <w:p>
+      <w:r>
+        <w:t>Настройки подключения в отдельном pg_config.py. Там обязательно client_encoding: utf8 — без него на Windows PostgreSQL возвращает ошибки в cp1251 и Python падает.</w:t>
+      </w:r>
+    </w:p>
+    <w:p/>
+    <w:p>
+      <w:r>
+        <w:t>При загрузке использовались savepoint-ы — иногда два объекта из OpenAlex ссылались на один DOI. В итоге все 9 994 публикации загружены без потерь.</w:t>
+      </w:r>
+    </w:p>
+    <w:p/>
+    <w:p/>
+    <w:p/>
     <w:p>
       <w:pPr>
-        <w:spacing w:after="0" w:line="360" w:lineRule="exact"/>
-        <w:ind w:firstLine="709"/>
+        <w:pStyle w:val="Heading2"/>
       </w:pPr>
       <w:r>
-        <w:rPr>
-          <w:rFonts w:ascii="Times New Roman" w:hAnsi="Times New Roman"/>
-          <w:b w:val="0"/>
-          <w:sz w:val="28"/>
-        </w:rPr>
-        <w:t>База данных включает семь таблиц: журналы, публикации, авторы, аффилиации с координатами, и три таблицы связей — публикация–автор, публикация–тема, публикация–ключевое слово.</w:t>
-      </w:r>
-    </w:p>
-    <w:p>
-      <w:pPr>
-        <w:spacing w:after="0" w:line="360" w:lineRule="exact"/>
-        <w:ind w:firstLine="709"/>
-      </w:pPr>
-      <w:r>
-        <w:rPr>
-          <w:rFonts w:ascii="Times New Roman" w:hAnsi="Times New Roman"/>
-          <w:b w:val="0"/>
-          <w:sz w:val="28"/>
-        </w:rPr>
-        <w:t>Настройки подключения вынесены в отдельный файл pg_config.py. Параметр client_encoding: utf8 там обязателен — без него на Windows PostgreSQL возвращает сообщения об ошибках в кодировке cp1251, что приводит к сбоям в Python.</w:t>
-      </w:r>
-    </w:p>
-    <w:p>
-      <w:pPr>
-        <w:spacing w:after="0" w:line="360" w:lineRule="exact"/>
-        <w:ind w:firstLine="709"/>
-      </w:pPr>
-      <w:r>
-        <w:rPr>
-          <w:rFonts w:ascii="Times New Roman" w:hAnsi="Times New Roman"/>
-          <w:b w:val="0"/>
-          <w:sz w:val="28"/>
-        </w:rPr>
-        <w:t>При загрузке данных использовались savepoint-ы для обработки конфликтов: иногда два объекта OpenAlex ссылались на один и тот же DOI. В итоге все 9 994 публикации были загружены без ошибок.</w:t>
-      </w:r>
-    </w:p>
-    <w:p>
-      <w:pPr>
-        <w:spacing w:before="80" w:after="80"/>
-      </w:pPr>
-    </w:p>
-    <w:p>
-      <w:pPr>
-        <w:spacing w:before="240" w:after="120"/>
-      </w:pPr>
-      <w:r>
-        <w:rPr>
-          <w:rFonts w:ascii="Times New Roman" w:hAnsi="Times New Roman"/>
-          <w:b/>
-          <w:sz w:val="32"/>
-        </w:rPr>
         <w:t>Слайд 9 — ER-диаграмма базы данных (20–30 секунд)</w:t>
       </w:r>
     </w:p>
+    <w:p/>
+    <w:p>
+      <w:r>
+        <w:t>На схеме видны связи между таблицами. Журналы к публикациям — один ко многим. Публикации и авторы — многие ко многим через publication_authors. Аффилиации хранятся с координатами и привязаны к авторам. Тематики и ключевые слова тоже отдельными таблицами.</w:t>
+      </w:r>
+    </w:p>
+    <w:p/>
+    <w:p/>
+    <w:p/>
     <w:p>
       <w:pPr>
-        <w:spacing w:after="0" w:line="360" w:lineRule="exact"/>
-        <w:ind w:firstLine="709"/>
+        <w:pStyle w:val="Heading2"/>
       </w:pPr>
       <w:r>
-        <w:rPr>
-          <w:rFonts w:ascii="Times New Roman" w:hAnsi="Times New Roman"/>
-          <w:b w:val="0"/>
-          <w:sz w:val="28"/>
-        </w:rPr>
-        <w:t>На диаграмме показаны связи между таблицами. Журналы связаны с публикациями отношением «один ко многим». Публикации связаны с авторами через таблицу publication_authors — это классическое отношение «многие ко многим». Отдельно хранятся тематические классификаторы и ключевые слова — они также привязаны к публикациям. Аффилиации организаций хранятся вместе с координатами и связаны с авторами.</w:t>
-      </w:r>
-    </w:p>
-    <w:p>
-      <w:pPr>
-        <w:spacing w:before="80" w:after="80"/>
-      </w:pPr>
-    </w:p>
-    <w:p>
-      <w:pPr>
-        <w:spacing w:before="240" w:after="120"/>
-      </w:pPr>
-      <w:r>
-        <w:rPr>
-          <w:rFonts w:ascii="Times New Roman" w:hAnsi="Times New Roman"/>
-          <w:b/>
-          <w:sz w:val="32"/>
-        </w:rPr>
         <w:t>Слайд 10 — Географическая привязка (50–60 секунд)</w:t>
       </w:r>
     </w:p>
+    <w:p/>
+    <w:p>
+      <w:r>
+        <w:t>Геокодирование в два шага. Сначала — организации с идентификатором OpenAlex, координаты запрашиваются через API батчами по 100. Это дало 78%.</w:t>
+      </w:r>
+    </w:p>
+    <w:p/>
+    <w:p>
+      <w:r>
+        <w:t>Оставшиеся 22% — аффилиации только строкой названия. Для них написан скрипт с геокодером Photon от Komoot. Скрипт пробует полное название, потом сокращает строку по запятым, пока не получит результат. Важная деталь — Photon отдаёт координаты в формате longitude/latitude, а не наоборот, поэтому при сохранении переставляю вручную.</w:t>
+      </w:r>
+    </w:p>
+    <w:p/>
+    <w:p>
+      <w:r>
+        <w:t>Обрабатываются в первую очередь организации, которые закрывают максимум публикаций без координат. Итого: 80,8%.</w:t>
+      </w:r>
+    </w:p>
+    <w:p/>
+    <w:p/>
+    <w:p/>
     <w:p>
       <w:pPr>
-        <w:spacing w:after="0" w:line="360" w:lineRule="exact"/>
-        <w:ind w:firstLine="709"/>
+        <w:pStyle w:val="Heading2"/>
       </w:pPr>
       <w:r>
-        <w:rPr>
-          <w:rFonts w:ascii="Times New Roman" w:hAnsi="Times New Roman"/>
-          <w:b w:val="0"/>
-          <w:sz w:val="28"/>
-        </w:rPr>
-        <w:t>Геокодирование прошло в два этапа. На первом этапе для организаций с идентификатором OpenAlex координаты запрашивались через API учреждений батчами по 100 — это дало покрытие 78%.</w:t>
-      </w:r>
-    </w:p>
-    <w:p>
-      <w:pPr>
-        <w:spacing w:after="0" w:line="360" w:lineRule="exact"/>
-        <w:ind w:firstLine="709"/>
-      </w:pPr>
-      <w:r>
-        <w:rPr>
-          <w:rFonts w:ascii="Times New Roman" w:hAnsi="Times New Roman"/>
-          <w:b w:val="0"/>
-          <w:sz w:val="28"/>
-        </w:rPr>
-        <w:t>Оставшиеся 22% — аффилиации, записанные только строкой названия без ссылки. Для них написан скрипт, который запрашивает геокодер Photon от Komoot. Скрипт применяет стратегию сокращения строки: сначала пробует полное название, потом последние три части через запятую, потом две — пока не получит результат. При этом важная деталь: Photon возвращает координаты в формате GeoJSON — порядок longitude, latitude, а не наоборот, поэтому при сохранении они переставляются.</w:t>
-      </w:r>
-    </w:p>
-    <w:p>
-      <w:pPr>
-        <w:spacing w:after="0" w:line="360" w:lineRule="exact"/>
-        <w:ind w:firstLine="709"/>
-      </w:pPr>
-      <w:r>
-        <w:rPr>
-          <w:rFonts w:ascii="Times New Roman" w:hAnsi="Times New Roman"/>
-          <w:b w:val="0"/>
-          <w:sz w:val="28"/>
-        </w:rPr>
-        <w:t>Обрабатываются в первую очередь те организации, которые разблокируют наибольшее число публикаций без координат. Итого: 80,8% публикаций получили географическую привязку.</w:t>
-      </w:r>
-    </w:p>
-    <w:p>
-      <w:pPr>
-        <w:spacing w:before="80" w:after="80"/>
-      </w:pPr>
-    </w:p>
-    <w:p>
-      <w:pPr>
-        <w:spacing w:before="240" w:after="120"/>
-      </w:pPr>
-      <w:r>
-        <w:rPr>
-          <w:rFonts w:ascii="Times New Roman" w:hAnsi="Times New Roman"/>
-          <w:b/>
-          <w:sz w:val="32"/>
-        </w:rPr>
         <w:t>Слайд 11 — Граф связей (50–60 секунд)</w:t>
       </w:r>
     </w:p>
+    <w:p/>
+    <w:p>
+      <w:r>
+        <w:t>Граф рисуется в браузере в SVG, без внешних библиотек. Данные уже загружены, дополнительных запросов к серверу нет. Из каждой статьи берутся год, журнал, авторы и аффилиации — из них строятся узлы и рёбра.</w:t>
+      </w:r>
+    </w:p>
+    <w:p/>
+    <w:p>
+      <w:r>
+        <w:t>Для размещения узлов — колоночная раскладка: каждый тип сущности в своей вертикальной колонке. Рёбра — кривые Безье. Физической симуляции нет намеренно — при 70+ узлах force-directed даёт хаотичную картину, а колонки читаемы при любом числе.</w:t>
+      </w:r>
+    </w:p>
+    <w:p/>
+    <w:p>
+      <w:r>
+        <w:t>Доступно пять режимов. Режим отображения — это какие типы узлов и связей видны одновременно. Например, полный граф показывает всё: год → журнал → статья → автор → аффилиация. Режим «Авторы» убирает лишнее, оставляет только статья–автор. Режим «Похожие статьи» соединяет статьи с высоким баллом сходства.</w:t>
+      </w:r>
+    </w:p>
+    <w:p/>
+    <w:p/>
+    <w:p/>
     <w:p>
       <w:pPr>
-        <w:spacing w:after="0" w:line="360" w:lineRule="exact"/>
-        <w:ind w:firstLine="709"/>
+        <w:pStyle w:val="Heading2"/>
       </w:pPr>
       <w:r>
-        <w:rPr>
-          <w:rFonts w:ascii="Times New Roman" w:hAnsi="Times New Roman"/>
-          <w:b w:val="0"/>
-          <w:sz w:val="28"/>
-        </w:rPr>
-        <w:t>Граф рисуется в браузере в SVG без внешних библиотек. Данные для него уже загружены — дополнительных запросов к серверу не требуется. Из каждой статьи извлекаются год, журнал, авторы и аффилиации, из них строятся узлы и рёбра.</w:t>
-      </w:r>
-    </w:p>
-    <w:p>
-      <w:pPr>
-        <w:spacing w:after="0" w:line="360" w:lineRule="exact"/>
-        <w:ind w:firstLine="709"/>
-      </w:pPr>
-      <w:r>
-        <w:rPr>
-          <w:rFonts w:ascii="Times New Roman" w:hAnsi="Times New Roman"/>
-          <w:b w:val="0"/>
-          <w:sz w:val="28"/>
-        </w:rPr>
-        <w:t>Для размещения узлов используется колоночная раскладка: каждый тип сущности занимает свою вертикальную колонку, узлы внутри распределяются равномерно. Рёбра — кривые Безье. Физической симуляции нет, что делает граф предсказуемым при любом числе узлов.</w:t>
-      </w:r>
-    </w:p>
-    <w:p>
-      <w:pPr>
-        <w:spacing w:after="0" w:line="360" w:lineRule="exact"/>
-        <w:ind w:firstLine="709"/>
-      </w:pPr>
-      <w:r>
-        <w:rPr>
-          <w:rFonts w:ascii="Times New Roman" w:hAnsi="Times New Roman"/>
-          <w:b w:val="0"/>
-          <w:sz w:val="28"/>
-        </w:rPr>
-        <w:t>Доступно пять режимов отображения. Режим отображения — это настройка того, какие именно типы узлов и связей видны на графе одновременно. Например, полный граф показывает все связи: год → журнал → статья → автор → аффилиация. Режим «Авторы» убирает годы и журналы и оставляет только связи статья–автор. Режим «Похожие статьи» соединяет статьи с высоким баллом сходства.</w:t>
-      </w:r>
-    </w:p>
-    <w:p>
-      <w:pPr>
-        <w:spacing w:before="80" w:after="80"/>
-      </w:pPr>
-    </w:p>
-    <w:p>
-      <w:pPr>
-        <w:spacing w:before="240" w:after="120"/>
-      </w:pPr>
-      <w:r>
-        <w:rPr>
-          <w:rFonts w:ascii="Times New Roman" w:hAnsi="Times New Roman"/>
-          <w:b/>
-          <w:sz w:val="32"/>
-        </w:rPr>
         <w:t>Слайд 12 — Поиск похожих статей (50–60 секунд)</w:t>
       </w:r>
     </w:p>
+    <w:p/>
+    <w:p>
+      <w:r>
+        <w:t>При клике на статью система перебирает все остальные публикации и считает балл сходства. Учитываются пять признаков: общие авторы — вес 4, общие темы — вес 3, общие ключевые слова и аффилиации — вес 2, одинаковый журнал — плюс 2.</w:t>
+      </w:r>
+    </w:p>
+    <w:p/>
+    <w:p>
+      <w:r>
+        <w:t>Авторы получили наибольший вес, потому что один человек работает в одной предметной области — его статьи содержательно близки. Темы из OpenAlex — широкие классификаторы, поэтому вес выше, чем у ключевых слов.</w:t>
+      </w:r>
+    </w:p>
+    <w:p/>
+    <w:p>
+      <w:r>
+        <w:t>Перед сравнением все строки приводятся к нижнему регистру — иначе «MIT» и «mit» считались бы разными.</w:t>
+      </w:r>
+    </w:p>
+    <w:p/>
+    <w:p>
+      <w:r>
+        <w:t>Результат виден в правой панели как ранжированный список с объяснением, и в режиме «Похожие статьи» в графе.</w:t>
+      </w:r>
+    </w:p>
+    <w:p/>
+    <w:p/>
+    <w:p/>
     <w:p>
       <w:pPr>
-        <w:spacing w:after="0" w:line="360" w:lineRule="exact"/>
-        <w:ind w:firstLine="709"/>
+        <w:pStyle w:val="Heading2"/>
       </w:pPr>
       <w:r>
-        <w:rPr>
-          <w:rFonts w:ascii="Times New Roman" w:hAnsi="Times New Roman"/>
-          <w:b w:val="0"/>
-          <w:sz w:val="28"/>
-        </w:rPr>
-        <w:t>При клике на статью система перебирает все остальные публикации и считает балл сходства. Алгоритм учитывает пять признаков: общие авторы с весом 4, общие темы с весом 3, общие ключевые слова и аффилиации с весом 2, и плюс 2 за одинаковый журнал.</w:t>
-      </w:r>
-    </w:p>
-    <w:p>
-      <w:pPr>
-        <w:spacing w:after="0" w:line="360" w:lineRule="exact"/>
-        <w:ind w:firstLine="709"/>
-      </w:pPr>
-      <w:r>
-        <w:rPr>
-          <w:rFonts w:ascii="Times New Roman" w:hAnsi="Times New Roman"/>
-          <w:b w:val="0"/>
-          <w:sz w:val="28"/>
-        </w:rPr>
-        <w:t>Авторы получили наибольший вес, потому что один человек обычно работает в одной предметной области и его статьи содержательно связаны. Темы из OpenAlex — более широкие классификаторы, поэтому их вес выше, чем у ключевых слов.</w:t>
-      </w:r>
-    </w:p>
-    <w:p>
-      <w:pPr>
-        <w:spacing w:after="0" w:line="360" w:lineRule="exact"/>
-        <w:ind w:firstLine="709"/>
-      </w:pPr>
-      <w:r>
-        <w:rPr>
-          <w:rFonts w:ascii="Times New Roman" w:hAnsi="Times New Roman"/>
-          <w:b w:val="0"/>
-          <w:sz w:val="28"/>
-        </w:rPr>
-        <w:t>Перед сравнением все строки приводятся к нижнему регистру — иначе «MIT» и «mit» считались бы разными значениями и совпадения терялись.</w:t>
-      </w:r>
-    </w:p>
-    <w:p>
-      <w:pPr>
-        <w:spacing w:after="0" w:line="360" w:lineRule="exact"/>
-        <w:ind w:firstLine="709"/>
-      </w:pPr>
-      <w:r>
-        <w:rPr>
-          <w:rFonts w:ascii="Times New Roman" w:hAnsi="Times New Roman"/>
-          <w:b w:val="0"/>
-          <w:sz w:val="28"/>
-        </w:rPr>
-        <w:t>Результат виден в двух местах: в правой панели как ранжированный список с объяснением, и в режиме графа «Похожие статьи» в виде рёбер с подписями.</w:t>
-      </w:r>
-    </w:p>
-    <w:p>
-      <w:pPr>
-        <w:spacing w:before="80" w:after="80"/>
-      </w:pPr>
-    </w:p>
-    <w:p>
-      <w:pPr>
-        <w:spacing w:before="240" w:after="120"/>
-      </w:pPr>
-      <w:r>
-        <w:rPr>
-          <w:rFonts w:ascii="Times New Roman" w:hAnsi="Times New Roman"/>
-          <w:b/>
-          <w:sz w:val="32"/>
-        </w:rPr>
         <w:t>Слайд 13 — Веб-интерфейс (40–50 секунд)</w:t>
       </w:r>
     </w:p>
+    <w:p/>
+    <w:p>
+      <w:r>
+        <w:t>Интерфейс — одностраничное приложение с тремя колонками. Слева — фильтры и список статей. По центру — карта или граф. Справа — детали выбранной статьи и похожие.</w:t>
+      </w:r>
+    </w:p>
+    <w:p/>
+    <w:p>
+      <w:r>
+        <w:t>Фильтры работают в связке: выбор в одном ограничивает варианты в других. Это фасетная фильтрация — она исключает ситуацию с нулевым результатом.</w:t>
+      </w:r>
+    </w:p>
+    <w:p/>
+    <w:p>
+      <w:r>
+        <w:t>Есть светлая и тёмная тема. Переключение сохраняется в localStorage, все цвета через CSS-переменные — меняется мгновенно.</w:t>
+      </w:r>
+    </w:p>
+    <w:p/>
+    <w:p/>
+    <w:p/>
     <w:p>
       <w:pPr>
-        <w:spacing w:after="0" w:line="360" w:lineRule="exact"/>
-        <w:ind w:firstLine="709"/>
+        <w:pStyle w:val="Heading2"/>
       </w:pPr>
       <w:r>
-        <w:rPr>
-          <w:rFonts w:ascii="Times New Roman" w:hAnsi="Times New Roman"/>
-          <w:b w:val="0"/>
-          <w:sz w:val="28"/>
-        </w:rPr>
-        <w:t>Интерфейс — одностраничное приложение с тремя колонками. Слева — фильтры и список статей. По центру — карта или граф. Справа — детали выбранной статьи и список похожих.</w:t>
+        <w:t>Слайд 14 — Результаты (40–50 секунд)</w:t>
       </w:r>
     </w:p>
+    <w:p/>
     <w:p>
-      <w:pPr>
-        <w:spacing w:after="0" w:line="360" w:lineRule="exact"/>
-        <w:ind w:firstLine="709"/>
-      </w:pPr>
       <w:r>
-        <w:rPr>
-          <w:rFonts w:ascii="Times New Roman" w:hAnsi="Times New Roman"/>
-          <w:b w:val="0"/>
-          <w:sz w:val="28"/>
-        </w:rPr>
-        <w:t>Фильтры работают в связке: при выборе значения в одном фильтре остальные показывают только те варианты, которые ещё возможны с учётом текущего выбора. Это фасетная фильтрация — она исключает ситуацию, когда комбинация фильтров не даёт ни одного результата.</w:t>
+        <w:t>Все задачи выполнены. Загружено 9 994 публикации из OpenAlex. База данных — 7 таблиц PostgreSQL. Геокодировано 80,8% публикаций при пороге 75%. Граф с пятью режимами отображения. Алгоритм поиска похожих статей по пяти признакам.</w:t>
       </w:r>
     </w:p>
+    <w:p/>
     <w:p>
-      <w:pPr>
-        <w:spacing w:after="0" w:line="360" w:lineRule="exact"/>
-        <w:ind w:firstLine="709"/>
-      </w:pPr>
       <w:r>
-        <w:rPr>
-          <w:rFonts w:ascii="Times New Roman" w:hAnsi="Times New Roman"/>
-          <w:b w:val="0"/>
-          <w:sz w:val="28"/>
-        </w:rPr>
-        <w:t>Интерфейс поддерживает светлую и тёмную тему. Переключение сохраняется в localStorage, все цвета заданы через CSS-переменные — тема меняется мгновенно.</w:t>
+        <w:t>Система переводит плоский список статей в два визуальных представления — карту с географией и граф с авторскими и тематическими связями. По сравнению с аналогами — всё это в одной браузерной среде, без установки.</w:t>
       </w:r>
     </w:p>
+    <w:p/>
     <w:p>
-      <w:pPr>
-        <w:spacing w:before="80" w:after="80"/>
-      </w:pPr>
-    </w:p>
-    <w:p>
-      <w:pPr>
-        <w:spacing w:before="240" w:after="120"/>
-      </w:pPr>
       <w:r>
-        <w:rPr>
-          <w:rFonts w:ascii="Times New Roman" w:hAnsi="Times New Roman"/>
-          <w:b/>
-          <w:sz w:val="32"/>
-        </w:rPr>
-        <w:t>Слайд 14 — Проблемы и решения (20–30 секунд)</w:t>
-      </w:r>
-    </w:p>
-    <w:p>
-      <w:pPr>
-        <w:spacing w:after="0" w:line="360" w:lineRule="exact"/>
-        <w:ind w:firstLine="709"/>
-      </w:pPr>
-      <w:r>
-        <w:rPr>
-          <w:rFonts w:ascii="Times New Roman" w:hAnsi="Times New Roman"/>
-          <w:b w:val="0"/>
-          <w:sz w:val="28"/>
-        </w:rPr>
-        <w:t>В ходе разработки возник ряд нетривиальных проблем. Файл данных весил 201 МБ — GitHub отклонял push. Решение: git filter-branch и .gitignore для бинарных данных. Nominatim заблокировал IP после нескольких запросов — заменён на Photon. Координаты в GeoJSON приходят в порядке longitude–latitude, а не latitude–longitude — при записи переставляются вручную.</w:t>
-      </w:r>
-    </w:p>
-    <w:p>
-      <w:pPr>
-        <w:spacing w:before="80" w:after="80"/>
-      </w:pPr>
-    </w:p>
-    <w:p>
-      <w:pPr>
-        <w:spacing w:before="240" w:after="120"/>
-      </w:pPr>
-      <w:r>
-        <w:rPr>
-          <w:rFonts w:ascii="Times New Roman" w:hAnsi="Times New Roman"/>
-          <w:b/>
-          <w:sz w:val="32"/>
-        </w:rPr>
-        <w:t>Слайд 15 — Результаты (40–50 секунд)</w:t>
-      </w:r>
-    </w:p>
-    <w:p>
-      <w:pPr>
-        <w:spacing w:after="0" w:line="360" w:lineRule="exact"/>
-        <w:ind w:firstLine="709"/>
-      </w:pPr>
-      <w:r>
-        <w:rPr>
-          <w:rFonts w:ascii="Times New Roman" w:hAnsi="Times New Roman"/>
-          <w:b w:val="0"/>
-          <w:sz w:val="28"/>
-        </w:rPr>
-        <w:t>Подводя итог — все поставленные задачи выполнены и критерии качества достигнуты. Загружено 9 994 публикации из OpenAlex. Создана реляционная база данных из 7 таблиц. Покрытие геокодирования составило 80,8% при пороге 75%. Реализован граф с пятью режимами отображения. Разработан алгоритм поиска похожих статей по пяти независимым признакам.</w:t>
-      </w:r>
-    </w:p>
-    <w:p>
-      <w:pPr>
-        <w:spacing w:after="0" w:line="360" w:lineRule="exact"/>
-        <w:ind w:firstLine="709"/>
-      </w:pPr>
-      <w:r>
-        <w:rPr>
-          <w:rFonts w:ascii="Times New Roman" w:hAnsi="Times New Roman"/>
-          <w:b w:val="0"/>
-          <w:sz w:val="28"/>
-        </w:rPr>
-        <w:t>Система переводит плоский список статей в два визуальных представления — карту с географией исследований и граф с авторскими и тематическими связями. В отличие от рассмотренных аналогов, она сочетает все эти возможности в одной браузерной среде без установки стороннего ПО.</w:t>
-      </w:r>
-    </w:p>
-    <w:p>
-      <w:pPr>
-        <w:spacing w:after="0" w:line="360" w:lineRule="exact"/>
-        <w:ind w:firstLine="709"/>
-      </w:pPr>
-      <w:r>
-        <w:rPr>
-          <w:rFonts w:ascii="Times New Roman" w:hAnsi="Times New Roman"/>
-          <w:b w:val="0"/>
-          <w:sz w:val="28"/>
-        </w:rPr>
         <w:t>Спасибо за внимание. Готова ответить на вопросы.</w:t>
       </w:r>
     </w:p>
+    <w:p/>
+    <w:p/>
+    <w:p/>
     <w:p>
       <w:pPr>
-        <w:spacing w:before="80" w:after="80"/>
-      </w:pPr>
-    </w:p>
-    <w:p>
-      <w:pPr>
-        <w:spacing w:before="240" w:after="120"/>
+        <w:pStyle w:val="Heading2"/>
       </w:pPr>
       <w:r>
-        <w:rPr>
-          <w:rFonts w:ascii="Times New Roman" w:hAnsi="Times New Roman"/>
-          <w:b/>
-          <w:sz w:val="32"/>
-        </w:rPr>
         <w:t>Возможные вопросы комиссии</w:t>
       </w:r>
     </w:p>
+    <w:p/>
     <w:p>
-      <w:pPr>
-        <w:spacing w:before="160"/>
-      </w:pPr>
       <w:r>
         <w:rPr>
-          <w:rFonts w:ascii="Times New Roman" w:hAnsi="Times New Roman"/>
           <w:b/>
-          <w:sz w:val="28"/>
         </w:rPr>
         <w:t>— Почему PostgreSQL, а не SQLite или MongoDB?</w:t>
       </w:r>
     </w:p>
     <w:p>
-      <w:pPr>
-        <w:spacing w:after="0" w:line="360" w:lineRule="exact"/>
-        <w:ind w:firstLine="709"/>
-      </w:pPr>
+      <w:r>
+        <w:t>Между сущностями жёсткие реляционные связи: один журнал — много статей, одна статья — много авторов. Нужны сложные JOIN-запросы для фильтрации. SQLite не тянет параллельные запросы, MongoDB тут не даёт преимуществ — данные структурированные.</w:t>
+      </w:r>
+    </w:p>
+    <w:p/>
+    <w:p>
       <w:r>
         <w:rPr>
-          <w:rFonts w:ascii="Times New Roman" w:hAnsi="Times New Roman"/>
-          <w:b w:val="0"/>
-          <w:sz w:val="28"/>
+          <w:b/>
         </w:rPr>
-        <w:t>Между сущностями чёткие реляционные связи: один журнал — много статей, одна статья — много авторов. PostgreSQL хорошо работает с такими структурами и поддерживает сложные JOIN-запросы, которые нужны для фильтрации. SQLite не подходит из-за ограниченной поддержки параллельных запросов. MongoDB отклонён — документо-ориентированная модель не даёт преимуществ при структурированных реляционных данных.</w:t>
+        <w:t>— Почему не D3 или Cytoscape для графа?</w:t>
       </w:r>
     </w:p>
     <w:p>
-      <w:pPr>
-        <w:spacing w:before="160"/>
-      </w:pPr>
+      <w:r>
+        <w:t>Стандартный force-directed при 70+ узлах даёт хаотичное расположение, с ним сложно работать. Я сделала колоночную раскладку — предсказуемую при любом числе узлов. Это требовало кастомного рендеринга, не библиотечного.</w:t>
+      </w:r>
+    </w:p>
+    <w:p/>
+    <w:p>
       <w:r>
         <w:rPr>
-          <w:rFonts w:ascii="Times New Roman" w:hAnsi="Times New Roman"/>
           <w:b/>
-          <w:sz w:val="28"/>
         </w:rPr>
-        <w:t>— Почему не использовать готовую библиотеку для графа — D3 или Cytoscape?</w:t>
+        <w:t>— Чем отличаетесь от Connected Papers?</w:t>
       </w:r>
     </w:p>
     <w:p>
-      <w:pPr>
-        <w:spacing w:after="0" w:line="360" w:lineRule="exact"/>
-        <w:ind w:firstLine="709"/>
-      </w:pPr>
+      <w:r>
+        <w:t>Connected Papers строит граф вокруг одной статьи по цитированиям и даёт 5 графов в месяц бесплатно. Моя система работает со всем набором из ~10 000 статей, добавляет географическую карту, фасетные фильтры и считает сходство по пяти признакам — не только по цитированиям.</w:t>
+      </w:r>
+    </w:p>
+    <w:p/>
+    <w:p>
       <w:r>
         <w:rPr>
-          <w:rFonts w:ascii="Times New Roman" w:hAnsi="Times New Roman"/>
-          <w:b w:val="0"/>
-          <w:sz w:val="28"/>
+          <w:b/>
         </w:rPr>
-        <w:t>Колоночная раскладка реализована вручную именно потому, что стандартные физические симуляции (force-directed layout) при 70+ узлах дают хаотичное расположение. Колонки предсказуемы и читаемы при любом числе узлов.</w:t>
+        <w:t>— Почему 80%, а не 100% с координатами?</w:t>
       </w:r>
     </w:p>
     <w:p>
-      <w:pPr>
-        <w:spacing w:before="160"/>
-      </w:pPr>
+      <w:r>
+        <w:t>Часть аффилиаций в OpenAlex записана произвольной строкой — например, «Department of Physics» без названия города или университета. Геокодер тут бессилен. 19,2% — это именно такие случаи.</w:t>
+      </w:r>
+    </w:p>
+    <w:p/>
+    <w:p>
       <w:r>
         <w:rPr>
-          <w:rFonts w:ascii="Times New Roman" w:hAnsi="Times New Roman"/>
           <w:b/>
-          <w:sz w:val="28"/>
         </w:rPr>
-        <w:t>— Чем ваша система отличается от Connected Papers?</w:t>
+        <w:t>— Как масштабируется при большем числе статей?</w:t>
       </w:r>
     </w:p>
     <w:p>
-      <w:pPr>
-        <w:spacing w:after="0" w:line="360" w:lineRule="exact"/>
-        <w:ind w:firstLine="709"/>
-      </w:pPr>
+      <w:r>
+        <w:t>Граф ограничен 70 статьями для читаемости. Карта и список работают с полным набором через пагинацию. Если нужно больше 10 000 — потребуется серверный рендеринг графа.</w:t>
+      </w:r>
+    </w:p>
+    <w:p/>
+    <w:p>
       <w:r>
         <w:rPr>
-          <w:rFonts w:ascii="Times New Roman" w:hAnsi="Times New Roman"/>
-          <w:b w:val="0"/>
-          <w:sz w:val="28"/>
+          <w:b/>
         </w:rPr>
-        <w:t>Connected Papers строит граф похожих статей на основе цитирований вокруг одной выбранной публикации. Разработанная система работает с целым набором из 10 000 статей одновременно, имеет географическую карту, фасетные фильтры и вычисляет сходство по пяти признакам — авторам, темам, ключевым словам, аффилиациям и журналу. Кроме того, Connected Papers предоставляет лишь 5 графов в месяц бесплатно, наша система полностью бесплатна.</w:t>
+        <w:t>— Почему OpenAlex, а не Semantic Scholar или Crossref?</w:t>
       </w:r>
     </w:p>
     <w:p>
-      <w:pPr>
-        <w:spacing w:before="160"/>
-      </w:pPr>
+      <w:r>
+        <w:t>OpenAlex бесплатный без регистрации, даёт аффилиации с идентификаторами, cursor pagination для надёжной выгрузки и отдельный эндпоинт /institutions для пакетного запроса координат — это ключевое для геокодирования.</w:t>
+      </w:r>
+    </w:p>
+    <w:p/>
+    <w:p>
       <w:r>
         <w:rPr>
-          <w:rFonts w:ascii="Times New Roman" w:hAnsi="Times New Roman"/>
           <w:b/>
-          <w:sz w:val="28"/>
         </w:rPr>
-        <w:t>— Почему 80%, а не 100% публикаций с координатами?</w:t>
+        <w:t>— Как оцениваете качество алгоритма поиска похожих?</w:t>
       </w:r>
     </w:p>
     <w:p>
-      <w:pPr>
-        <w:spacing w:after="0" w:line="360" w:lineRule="exact"/>
-        <w:ind w:firstLine="709"/>
-      </w:pPr>
+      <w:r>
+        <w:t>Алгоритм работает по метаданным, не по тексту статьи — поэтому быстро считается прямо в браузере, без дополнительных запросов. Ограничение — если два автора из разных областей случайно пересекаются, алгоритм их посчитает похожими. Веса подобраны эмпирически на реальных данных.</w:t>
+      </w:r>
+    </w:p>
+    <w:p/>
+    <w:p>
       <w:r>
         <w:rPr>
-          <w:rFonts w:ascii="Times New Roman" w:hAnsi="Times New Roman"/>
-          <w:b w:val="0"/>
-          <w:sz w:val="28"/>
+          <w:b/>
         </w:rPr>
-        <w:t>Часть аффилиаций записана в OpenAlex как произвольные строки без географической привязки — например, просто «Department of Physics». Геокодер возвращает координаты только если строка содержит что-то похожее на название места. 19,2% публикаций не удалось геокодировать по этой причине.</w:t>
+        <w:t>— Что нового по сравнению с ResearchRabbit, Inciteful, Litmaps?</w:t>
       </w:r>
     </w:p>
     <w:p>
-      <w:pPr>
-        <w:spacing w:before="160"/>
-      </w:pPr>
+      <w:r>
+        <w:t>Они работают с одной-двумя стартовыми статьями и строят граф по цитированиям. Моя система работает с заранее загруженным набором — исследуешь тематический и географический ландшафт всей предметной области сразу, не ищешь похожее к одной статье.</w:t>
+      </w:r>
+    </w:p>
+    <w:p/>
+    <w:p>
       <w:r>
         <w:rPr>
-          <w:rFonts w:ascii="Times New Roman" w:hAnsi="Times New Roman"/>
           <w:b/>
-          <w:sz w:val="28"/>
-        </w:rPr>
-        <w:t>— Как масштабируется система при увеличении числа статей?</w:t>
-      </w:r>
-    </w:p>
-    <w:p>
-      <w:pPr>
-        <w:spacing w:after="0" w:line="360" w:lineRule="exact"/>
-        <w:ind w:firstLine="709"/>
-      </w:pPr>
-      <w:r>
-        <w:rPr>
-          <w:rFonts w:ascii="Times New Roman" w:hAnsi="Times New Roman"/>
-          <w:b w:val="0"/>
-          <w:sz w:val="28"/>
-        </w:rPr>
-        <w:t>Граф ограничен 70 статьями одновременно — для читаемости. Фильтры позволяют сузить выборку. Карта и список работают с полным набором через пагинацию и requestAnimationFrame. При необходимости масштабирования свыше 10 000 публикаций потребуется переход на серверный рендеринг графа.</w:t>
-      </w:r>
-    </w:p>
-    <w:p>
-      <w:pPr>
-        <w:spacing w:before="160"/>
-      </w:pPr>
-      <w:r>
-        <w:rPr>
-          <w:rFonts w:ascii="Times New Roman" w:hAnsi="Times New Roman"/>
-          <w:b/>
-          <w:sz w:val="28"/>
-        </w:rPr>
-        <w:t>— Почему выбран OpenAlex, а не Semantic Scholar или Crossref?</w:t>
-      </w:r>
-    </w:p>
-    <w:p>
-      <w:pPr>
-        <w:spacing w:after="0" w:line="360" w:lineRule="exact"/>
-        <w:ind w:firstLine="709"/>
-      </w:pPr>
-      <w:r>
-        <w:rPr>
-          <w:rFonts w:ascii="Times New Roman" w:hAnsi="Times New Roman"/>
-          <w:b w:val="0"/>
-          <w:sz w:val="28"/>
-        </w:rPr>
-        <w:t>OpenAlex предоставляет бесплатный доступ без регистрации, полные метаданные включая аффилиации с идентификаторами, cursor pagination для надёжной выгрузки больших наборов и отдельный эндпоинт /institutions для пакетного запроса координат организаций — это ключевое для геокодирования.</w:t>
-      </w:r>
-    </w:p>
-    <w:p>
-      <w:pPr>
-        <w:spacing w:before="160"/>
-      </w:pPr>
-      <w:r>
-        <w:rPr>
-          <w:rFonts w:ascii="Times New Roman" w:hAnsi="Times New Roman"/>
-          <w:b/>
-          <w:sz w:val="28"/>
-        </w:rPr>
-        <w:t>— Как вы оцениваете качество алгоритма поиска похожих статей?</w:t>
-      </w:r>
-    </w:p>
-    <w:p>
-      <w:pPr>
-        <w:spacing w:after="0" w:line="360" w:lineRule="exact"/>
-        <w:ind w:firstLine="709"/>
-      </w:pPr>
-      <w:r>
-        <w:rPr>
-          <w:rFonts w:ascii="Times New Roman" w:hAnsi="Times New Roman"/>
-          <w:b w:val="0"/>
-          <w:sz w:val="28"/>
-        </w:rPr>
-        <w:t>Алгоритм основан на структурных признаках метаданных, а не на семантическом анализе текста. Это означает высокую скорость вычисления в браузере без внешних запросов, но ограниченную точность для статей из разных областей с общими авторами. Веса подобраны эмпирически: авторский признак наиболее информативен, так как один исследователь работает в одной предметной области.</w:t>
-      </w:r>
-    </w:p>
-    <w:p>
-      <w:pPr>
-        <w:spacing w:before="160"/>
-      </w:pPr>
-      <w:r>
-        <w:rPr>
-          <w:rFonts w:ascii="Times New Roman" w:hAnsi="Times New Roman"/>
-          <w:b/>
-          <w:sz w:val="28"/>
-        </w:rPr>
-        <w:t>— Что нового по сравнению с аналогами на 2025 год (ResearchRabbit, Inciteful, Litmaps)?</w:t>
-      </w:r>
-    </w:p>
-    <w:p>
-      <w:pPr>
-        <w:spacing w:after="0" w:line="360" w:lineRule="exact"/>
-        <w:ind w:firstLine="709"/>
-      </w:pPr>
-      <w:r>
-        <w:rPr>
-          <w:rFonts w:ascii="Times New Roman" w:hAnsi="Times New Roman"/>
-          <w:b w:val="0"/>
-          <w:sz w:val="28"/>
-        </w:rPr>
-        <w:t>Все три сервиса работают с одной или несколькими стартовыми статьями и строят граф через цитирования. Разработанная система работает с предварительно загруженным набором из 9 994 публикаций, показывает их географию на карте и позволяет фильтровать по году, журналу, автору и аффилиации. Это принципиально иной сценарий использования — не «найти похожее к одной статье», а «исследовать тематический и географический ландшафт заданной предметной области».</w:t>
-      </w:r>
-    </w:p>
-    <w:p>
-      <w:pPr>
-        <w:spacing w:before="160"/>
-      </w:pPr>
-      <w:r>
-        <w:rPr>
-          <w:rFonts w:ascii="Times New Roman" w:hAnsi="Times New Roman"/>
-          <w:b/>
-          <w:sz w:val="28"/>
         </w:rPr>
         <w:t>— Что такое режим отображения в графе?</w:t>
       </w:r>
     </w:p>
     <w:p>
-      <w:pPr>
-        <w:spacing w:after="0" w:line="360" w:lineRule="exact"/>
-        <w:ind w:firstLine="709"/>
-      </w:pPr>
       <w:r>
-        <w:rPr>
-          <w:rFonts w:ascii="Times New Roman" w:hAnsi="Times New Roman"/>
-          <w:b w:val="0"/>
-          <w:sz w:val="28"/>
-        </w:rPr>
-        <w:t>Режим отображения — настройка типов узлов и связей, которые видны на графе одновременно. Всего пять режимов: полный граф (все типы), годы и журналы, только авторы, только аффилиации и похожие статьи. Это сделано для читаемости: при всех узлах одновременно граф перегружен. Переключение мгновенное — данные уже в браузере.</w:t>
+        <w:t>Какие типы узлов и связей видны одновременно. Всего пять: полный граф, годы и журналы, только авторы, только аффилиации, похожие статьи. Сделано для читаемости — при всех узлах одновременно граф перегружен. Переключение мгновенное, данные уже в браузере.</w:t>
       </w:r>
     </w:p>
+    <w:p/>
     <w:sectPr>
       <w:pgSz w:w="12240" w:h="15840"/>
-      <w:pgMar w:top="1134" w:right="850" w:bottom="1134" w:left="1701" w:header="720" w:footer="720" w:gutter="0"/>
+      <w:pgMar w:top="1440" w:right="1800" w:bottom="1440" w:left="1800" w:header="720" w:footer="720" w:gutter="0"/>
       <w:cols w:space="720"/>
       <w:docGrid w:linePitch="360"/>
     </w:sectPr>
@@ -2184,8 +1088,8 @@
     <w:qFormat/>
     <w:rsid w:val="00FC693F"/>
     <w:rPr>
-      <w:rFonts w:ascii="Times New Roman" w:hAnsi="Times New Roman"/>
-      <w:sz w:val="28"/>
+      <w:rFonts w:ascii="Calibri" w:hAnsi="Calibri"/>
+      <w:sz w:val="22"/>
     </w:rPr>
   </w:style>
   <w:style w:type="paragraph" w:styleId="Header">

</xml_diff>

<commit_message>
Add score definition to glossary and slide 12
</commit_message>
<xml_diff>
--- a/docs/текст для защиты.docx
+++ b/docs/текст для защиты.docx
@@ -154,10 +154,10 @@
         <w:rPr>
           <w:b/>
         </w:rPr>
-        <w:t>Балл сходства</w:t>
+        <w:t>Балл сходства (score)</w:t>
       </w:r>
       <w:r>
-        <w:t xml:space="preserve"> — число, показывающее насколько похожи две статьи по метаданным</w:t>
+        <w:t xml:space="preserve"> — целое число, показывающее степень близости двух публикаций по метаданным. Считается как взвешенная сумма совпадений: каждый общий автор даёт +4, общая тема — +3, общее ключевое слово или аффилиация — +2, одинаковый журнал — +2. Чем выше балл, тем содержательно ближе статьи. Статьи с нулевым баллом в результаты не попадают</w:t>
       </w:r>
     </w:p>
     <w:p>

</xml_diff>